<commit_message>
Piece 7: Changed all Trad. Chinese text to Simplified Chinese.
</commit_message>
<xml_diff>
--- a/Front Matter/Template/7_Front-Matter_Template-v4.docx
+++ b/Front Matter/Template/7_Front-Matter_Template-v4.docx
@@ -50,13 +50,13 @@
       </w:pPr>
       <w:r>
         <w:rPr>
-          <w:rFonts w:ascii="Noto Serif" w:eastAsia="Noto Serif SC" w:hAnsi="Noto Serif" w:cs="Noto Serif"/>
+          <w:rFonts w:ascii="Noto Serif" w:eastAsia="Noto Serif SC" w:hAnsi="Noto Serif" w:cs="Noto Serif" w:hint="eastAsia"/>
           <w:b/>
           <w:bCs/>
           <w:sz w:val="60"/>
           <w:szCs w:val="60"/>
         </w:rPr>
-        <w:t>獅</w:t>
+        <w:t>狮</w:t>
       </w:r>
       <w:r>
         <w:rPr>
@@ -70,7 +70,7 @@
       </w:r>
       <w:r>
         <w:rPr>
-          <w:rFonts w:ascii="Noto Serif" w:eastAsia="Noto Serif SC" w:hAnsi="Noto Serif" w:cs="Noto Serif"/>
+          <w:rFonts w:ascii="Noto Serif" w:eastAsia="Noto Serif SC" w:hAnsi="Noto Serif" w:cs="Noto Serif" w:hint="eastAsia"/>
           <w:b/>
           <w:bCs/>
           <w:sz w:val="60"/>
@@ -90,7 +90,7 @@
       </w:r>
       <w:r>
         <w:rPr>
-          <w:rFonts w:ascii="Noto Serif" w:eastAsia="Noto Serif SC" w:hAnsi="Noto Serif" w:cs="Noto Serif"/>
+          <w:rFonts w:ascii="Noto Serif" w:eastAsia="Noto Serif SC" w:hAnsi="Noto Serif" w:cs="Noto Serif" w:hint="eastAsia"/>
           <w:b/>
           <w:bCs/>
           <w:sz w:val="60"/>
@@ -110,7 +110,7 @@
       </w:r>
       <w:r>
         <w:rPr>
-          <w:rFonts w:ascii="Noto Serif" w:eastAsia="Noto Serif SC" w:hAnsi="Noto Serif" w:cs="Noto Serif"/>
+          <w:rFonts w:ascii="Noto Serif" w:eastAsia="Noto Serif SC" w:hAnsi="Noto Serif" w:cs="Noto Serif" w:hint="eastAsia"/>
           <w:b/>
           <w:bCs/>
           <w:sz w:val="60"/>
@@ -130,13 +130,13 @@
       </w:r>
       <w:r>
         <w:rPr>
-          <w:rFonts w:ascii="Noto Serif" w:eastAsia="Noto Serif SC" w:hAnsi="Noto Serif" w:cs="Noto Serif"/>
+          <w:rFonts w:ascii="Noto Serif" w:eastAsia="Noto Serif SC" w:hAnsi="Noto Serif" w:cs="Noto Serif" w:hint="eastAsia"/>
           <w:b/>
           <w:bCs/>
           <w:sz w:val="60"/>
           <w:szCs w:val="60"/>
         </w:rPr>
-        <w:t>韻</w:t>
+        <w:t>韵</w:t>
       </w:r>
     </w:p>
     <w:p>
@@ -182,11 +182,11 @@
       </w:pPr>
       <w:r>
         <w:rPr>
-          <w:rFonts w:ascii="Noto Serif" w:eastAsia="Noto Serif SC" w:hAnsi="Noto Serif" w:cs="Noto Serif"/>
+          <w:rFonts w:ascii="Noto Serif" w:eastAsia="Noto Serif SC" w:hAnsi="Noto Serif" w:cs="Noto Serif" w:hint="eastAsia"/>
           <w:sz w:val="36"/>
           <w:szCs w:val="72"/>
         </w:rPr>
-        <w:t>為琵琶及華樂團⽽作</w:t>
+        <w:t>为琵琶及华乐团⽽作</w:t>
       </w:r>
     </w:p>
     <w:p>
@@ -252,11 +252,11 @@
       </w:pPr>
       <w:r>
         <w:rPr>
-          <w:rFonts w:ascii="Noto Serif" w:eastAsia="Noto Serif SC" w:hAnsi="Noto Serif" w:cs="Noto Serif"/>
+          <w:rFonts w:ascii="Noto Serif" w:eastAsia="Noto Serif SC" w:hAnsi="Noto Serif" w:cs="Noto Serif" w:hint="eastAsia"/>
           <w:sz w:val="44"/>
           <w:szCs w:val="144"/>
         </w:rPr>
-        <w:t>馮迪倫</w:t>
+        <w:t>冯迪伦</w:t>
       </w:r>
     </w:p>
     <w:p>
@@ -292,23 +292,7 @@
           <w:sz w:val="40"/>
           <w:szCs w:val="96"/>
         </w:rPr>
-        <w:t>-</w:t>
-      </w:r>
-      <w:r>
-        <w:rPr>
-          <w:rFonts w:ascii="Noto Serif" w:eastAsia="Noto Serif SC" w:hAnsi="Noto Serif" w:cs="Noto Serif"/>
-          <w:sz w:val="40"/>
-          <w:szCs w:val="96"/>
-        </w:rPr>
-        <w:t>L</w:t>
-      </w:r>
-      <w:r>
-        <w:rPr>
-          <w:rFonts w:ascii="Noto Serif" w:eastAsia="Noto Serif SC" w:hAnsi="Noto Serif" w:cs="Noto Serif"/>
-          <w:sz w:val="40"/>
-          <w:szCs w:val="96"/>
-        </w:rPr>
-        <w:t>un</w:t>
+        <w:t>-Lun</w:t>
       </w:r>
     </w:p>
     <w:p>
@@ -812,13 +796,13 @@
       </w:pPr>
       <w:r>
         <w:rPr>
-          <w:rFonts w:ascii="Noto Serif" w:eastAsia="Noto Serif SC" w:hAnsi="Noto Serif" w:cs="Noto Serif"/>
+          <w:rFonts w:ascii="Noto Serif" w:eastAsia="Noto Serif SC" w:hAnsi="Noto Serif" w:cs="Noto Serif" w:hint="eastAsia"/>
           <w:b/>
           <w:bCs/>
           <w:sz w:val="60"/>
           <w:szCs w:val="60"/>
         </w:rPr>
-        <w:t>獅</w:t>
+        <w:t>狮</w:t>
       </w:r>
       <w:r>
         <w:rPr>
@@ -832,7 +816,7 @@
       </w:r>
       <w:r>
         <w:rPr>
-          <w:rFonts w:ascii="Noto Serif" w:eastAsia="Noto Serif SC" w:hAnsi="Noto Serif" w:cs="Noto Serif"/>
+          <w:rFonts w:ascii="Noto Serif" w:eastAsia="Noto Serif SC" w:hAnsi="Noto Serif" w:cs="Noto Serif" w:hint="eastAsia"/>
           <w:b/>
           <w:bCs/>
           <w:sz w:val="60"/>
@@ -852,7 +836,7 @@
       </w:r>
       <w:r>
         <w:rPr>
-          <w:rFonts w:ascii="Noto Serif" w:eastAsia="Noto Serif SC" w:hAnsi="Noto Serif" w:cs="Noto Serif"/>
+          <w:rFonts w:ascii="Noto Serif" w:eastAsia="Noto Serif SC" w:hAnsi="Noto Serif" w:cs="Noto Serif" w:hint="eastAsia"/>
           <w:b/>
           <w:bCs/>
           <w:sz w:val="60"/>
@@ -872,7 +856,7 @@
       </w:r>
       <w:r>
         <w:rPr>
-          <w:rFonts w:ascii="Noto Serif" w:eastAsia="Noto Serif SC" w:hAnsi="Noto Serif" w:cs="Noto Serif"/>
+          <w:rFonts w:ascii="Noto Serif" w:eastAsia="Noto Serif SC" w:hAnsi="Noto Serif" w:cs="Noto Serif" w:hint="eastAsia"/>
           <w:b/>
           <w:bCs/>
           <w:sz w:val="60"/>
@@ -892,13 +876,13 @@
       </w:r>
       <w:r>
         <w:rPr>
-          <w:rFonts w:ascii="Noto Serif" w:eastAsia="Noto Serif SC" w:hAnsi="Noto Serif" w:cs="Noto Serif"/>
+          <w:rFonts w:ascii="Noto Serif" w:eastAsia="Noto Serif SC" w:hAnsi="Noto Serif" w:cs="Noto Serif" w:hint="eastAsia"/>
           <w:b/>
           <w:bCs/>
           <w:sz w:val="60"/>
           <w:szCs w:val="60"/>
         </w:rPr>
-        <w:t>韻</w:t>
+        <w:t>韵</w:t>
       </w:r>
     </w:p>
     <w:p>
@@ -944,11 +928,11 @@
       </w:pPr>
       <w:r>
         <w:rPr>
-          <w:rFonts w:ascii="Noto Serif" w:eastAsia="Noto Serif SC" w:hAnsi="Noto Serif" w:cs="Noto Serif"/>
+          <w:rFonts w:ascii="Noto Serif" w:eastAsia="Noto Serif SC" w:hAnsi="Noto Serif" w:cs="Noto Serif" w:hint="eastAsia"/>
           <w:sz w:val="36"/>
           <w:szCs w:val="72"/>
         </w:rPr>
-        <w:t>為琵琶及華樂團⽽作</w:t>
+        <w:t>为琵琶及华乐团⽽作</w:t>
       </w:r>
     </w:p>
     <w:p>
@@ -1017,11 +1001,11 @@
       </w:pPr>
       <w:r>
         <w:rPr>
-          <w:rFonts w:ascii="Noto Serif" w:eastAsia="Noto Serif SC" w:hAnsi="Noto Serif" w:cs="Noto Serif"/>
+          <w:rFonts w:ascii="Noto Serif" w:eastAsia="Noto Serif SC" w:hAnsi="Noto Serif" w:cs="Noto Serif" w:hint="eastAsia"/>
           <w:sz w:val="44"/>
           <w:szCs w:val="144"/>
         </w:rPr>
-        <w:t>馮迪倫</w:t>
+        <w:t>冯迪伦</w:t>
       </w:r>
     </w:p>
     <w:p>
@@ -1057,23 +1041,7 @@
           <w:sz w:val="40"/>
           <w:szCs w:val="96"/>
         </w:rPr>
-        <w:t>-</w:t>
-      </w:r>
-      <w:r>
-        <w:rPr>
-          <w:rFonts w:ascii="Noto Serif" w:eastAsia="Noto Serif SC" w:hAnsi="Noto Serif" w:cs="Noto Serif"/>
-          <w:sz w:val="40"/>
-          <w:szCs w:val="96"/>
-        </w:rPr>
-        <w:t>L</w:t>
-      </w:r>
-      <w:r>
-        <w:rPr>
-          <w:rFonts w:ascii="Noto Serif" w:eastAsia="Noto Serif SC" w:hAnsi="Noto Serif" w:cs="Noto Serif"/>
-          <w:sz w:val="40"/>
-          <w:szCs w:val="96"/>
-        </w:rPr>
-        <w:t>un</w:t>
+        <w:t>-Lun</w:t>
       </w:r>
     </w:p>
     <w:p>
@@ -1102,25 +1070,7 @@
           <w:szCs w:val="32"/>
           <w:lang w:val="en-US"/>
         </w:rPr>
-        <w:t>(</w:t>
-      </w:r>
-      <w:r>
-        <w:rPr>
-          <w:rFonts w:ascii="Noto Serif" w:eastAsia="Noto Serif SC" w:hAnsi="Noto Serif" w:cs="Noto Serif"/>
-          <w:sz w:val="32"/>
-          <w:szCs w:val="32"/>
-          <w:lang w:val="en-US"/>
-        </w:rPr>
-        <w:t>2015</w:t>
-      </w:r>
-      <w:r>
-        <w:rPr>
-          <w:rFonts w:ascii="Noto Serif" w:eastAsia="Noto Serif SC" w:hAnsi="Noto Serif" w:cs="Noto Serif"/>
-          <w:sz w:val="32"/>
-          <w:szCs w:val="32"/>
-          <w:lang w:val="en-US"/>
-        </w:rPr>
-        <w:t>)</w:t>
+        <w:t>(2015)</w:t>
       </w:r>
     </w:p>
     <w:p>
@@ -1239,13 +1189,13 @@
       </w:pPr>
       <w:r>
         <w:rPr>
-          <w:rFonts w:ascii="Noto Serif" w:eastAsia="Noto Serif SC" w:hAnsi="Noto Serif" w:cs="Noto Serif"/>
+          <w:rFonts w:ascii="Noto Serif" w:eastAsia="Noto Serif SC" w:hAnsi="Noto Serif" w:cs="Noto Serif" w:hint="eastAsia"/>
           <w:b/>
           <w:color w:val="000000" w:themeColor="text1"/>
           <w:szCs w:val="32"/>
         </w:rPr>
         <w:lastRenderedPageBreak/>
-        <w:t>獅</w:t>
+        <w:t>狮</w:t>
       </w:r>
       <w:r>
         <w:rPr>
@@ -1258,7 +1208,7 @@
       </w:r>
       <w:r>
         <w:rPr>
-          <w:rFonts w:ascii="Noto Serif" w:eastAsia="Noto Serif SC" w:hAnsi="Noto Serif" w:cs="Noto Serif"/>
+          <w:rFonts w:ascii="Noto Serif" w:eastAsia="Noto Serif SC" w:hAnsi="Noto Serif" w:cs="Noto Serif" w:hint="eastAsia"/>
           <w:b/>
           <w:color w:val="000000" w:themeColor="text1"/>
           <w:szCs w:val="32"/>
@@ -1276,7 +1226,7 @@
       </w:r>
       <w:r>
         <w:rPr>
-          <w:rFonts w:ascii="Noto Serif" w:eastAsia="Noto Serif SC" w:hAnsi="Noto Serif" w:cs="Noto Serif"/>
+          <w:rFonts w:ascii="Noto Serif" w:eastAsia="Noto Serif SC" w:hAnsi="Noto Serif" w:cs="Noto Serif" w:hint="eastAsia"/>
           <w:b/>
           <w:color w:val="000000" w:themeColor="text1"/>
           <w:szCs w:val="32"/>
@@ -1294,7 +1244,7 @@
       </w:r>
       <w:r>
         <w:rPr>
-          <w:rFonts w:ascii="Noto Serif" w:eastAsia="Noto Serif SC" w:hAnsi="Noto Serif" w:cs="Noto Serif"/>
+          <w:rFonts w:ascii="Noto Serif" w:eastAsia="Noto Serif SC" w:hAnsi="Noto Serif" w:cs="Noto Serif" w:hint="eastAsia"/>
           <w:b/>
           <w:color w:val="000000" w:themeColor="text1"/>
           <w:szCs w:val="32"/>
@@ -1312,12 +1262,12 @@
       </w:r>
       <w:r>
         <w:rPr>
-          <w:rFonts w:ascii="Noto Serif" w:eastAsia="Noto Serif SC" w:hAnsi="Noto Serif" w:cs="Noto Serif"/>
+          <w:rFonts w:ascii="Noto Serif" w:eastAsia="Noto Serif SC" w:hAnsi="Noto Serif" w:cs="Noto Serif" w:hint="eastAsia"/>
           <w:b/>
           <w:color w:val="000000" w:themeColor="text1"/>
           <w:szCs w:val="32"/>
         </w:rPr>
-        <w:t>韻</w:t>
+        <w:t>韵</w:t>
       </w:r>
     </w:p>
     <w:p>
@@ -1369,17 +1319,26 @@
           <w:sz w:val="20"/>
           <w:szCs w:val="24"/>
         </w:rPr>
-        <w:t xml:space="preserve">Copyright © Singapore Chinese Orchestra Ltd. All rights reserved. </w:t>
-      </w:r>
-    </w:p>
-    <w:p>
-      <w:pPr>
+        <w:t>Copyright © Singapore Chinese Orchestra Ltd. All rights reserved.</w:t>
+      </w:r>
+      <w:r>
         <w:rPr>
           <w:rFonts w:ascii="Noto Serif" w:eastAsia="Noto Serif SC" w:hAnsi="Noto Serif" w:cs="Noto Serif"/>
           <w:color w:val="000000" w:themeColor="text1"/>
           <w:sz w:val="20"/>
           <w:szCs w:val="24"/>
         </w:rPr>
+        <w:t xml:space="preserve"> </w:t>
+      </w:r>
+    </w:p>
+    <w:p>
+      <w:pPr>
+        <w:rPr>
+          <w:rFonts w:ascii="Noto Serif" w:eastAsia="Noto Serif SC" w:hAnsi="Noto Serif" w:cs="Noto Serif"/>
+          <w:color w:val="000000" w:themeColor="text1"/>
+          <w:sz w:val="20"/>
+          <w:szCs w:val="24"/>
+        </w:rPr>
       </w:pPr>
     </w:p>
     <w:p>
@@ -1393,7 +1352,7 @@
       </w:pPr>
       <w:r>
         <w:rPr>
-          <w:rFonts w:ascii="Noto Serif" w:eastAsia="Noto Serif SC" w:hAnsi="Noto Serif" w:cs="Noto Serif"/>
+          <w:rFonts w:ascii="Noto Serif" w:eastAsia="Noto Serif SC" w:hAnsi="Noto Serif" w:cs="Noto Serif" w:hint="eastAsia"/>
           <w:color w:val="000000" w:themeColor="text1"/>
           <w:szCs w:val="32"/>
         </w:rPr>
@@ -1409,7 +1368,7 @@
       </w:r>
       <w:r>
         <w:rPr>
-          <w:rFonts w:ascii="Noto Serif" w:eastAsia="Noto Serif SC" w:hAnsi="Noto Serif" w:cs="Noto Serif"/>
+          <w:rFonts w:ascii="Noto Serif" w:eastAsia="Noto Serif SC" w:hAnsi="Noto Serif" w:cs="Noto Serif" w:hint="eastAsia"/>
           <w:color w:val="000000" w:themeColor="text1"/>
           <w:szCs w:val="32"/>
         </w:rPr>
@@ -1425,7 +1384,7 @@
       </w:r>
       <w:r>
         <w:rPr>
-          <w:rFonts w:ascii="Noto Serif" w:eastAsia="Noto Serif SC" w:hAnsi="Noto Serif" w:cs="Noto Serif"/>
+          <w:rFonts w:ascii="Noto Serif" w:eastAsia="Noto Serif SC" w:hAnsi="Noto Serif" w:cs="Noto Serif" w:hint="eastAsia"/>
           <w:color w:val="000000" w:themeColor="text1"/>
           <w:szCs w:val="32"/>
         </w:rPr>
@@ -1448,37 +1407,36 @@
           <w:sz w:val="20"/>
           <w:szCs w:val="24"/>
         </w:rPr>
-        <w:t xml:space="preserve">Unauthorised printing, reproduction, scanning or distribution is strictly prohibited </w:t>
-      </w:r>
-    </w:p>
-    <w:p>
-      <w:pPr>
+        <w:t>Unauthorised printing, reproduction, scanning or distribution is strictly prohibited</w:t>
+      </w:r>
+      <w:r>
         <w:rPr>
           <w:rFonts w:ascii="Noto Serif" w:eastAsia="Noto Serif SC" w:hAnsi="Noto Serif" w:cs="Noto Serif"/>
           <w:color w:val="000000" w:themeColor="text1"/>
           <w:sz w:val="20"/>
           <w:szCs w:val="24"/>
         </w:rPr>
-      </w:pPr>
-      <w:r>
+        <w:t xml:space="preserve"> </w:t>
+      </w:r>
+    </w:p>
+    <w:p>
+      <w:pPr>
         <w:rPr>
           <w:rFonts w:ascii="Noto Serif" w:eastAsia="Noto Serif SC" w:hAnsi="Noto Serif" w:cs="Noto Serif"/>
           <w:color w:val="000000" w:themeColor="text1"/>
           <w:sz w:val="20"/>
           <w:szCs w:val="24"/>
         </w:rPr>
-        <w:t>without the express permission of the copyright holder.</w:t>
-      </w:r>
-    </w:p>
-    <w:p>
-      <w:pPr>
+      </w:pPr>
+      <w:r>
         <w:rPr>
           <w:rFonts w:ascii="Noto Serif" w:eastAsia="Noto Serif SC" w:hAnsi="Noto Serif" w:cs="Noto Serif"/>
           <w:color w:val="000000" w:themeColor="text1"/>
           <w:sz w:val="20"/>
           <w:szCs w:val="24"/>
         </w:rPr>
-      </w:pPr>
+        <w:t>without the express permission of the copyright holder.</w:t>
+      </w:r>
     </w:p>
     <w:p>
       <w:pPr>
@@ -1489,25 +1447,25 @@
           <w:szCs w:val="24"/>
         </w:rPr>
       </w:pPr>
-      <w:r>
+    </w:p>
+    <w:p>
+      <w:pPr>
         <w:rPr>
           <w:rFonts w:ascii="Noto Serif" w:eastAsia="Noto Serif SC" w:hAnsi="Noto Serif" w:cs="Noto Serif"/>
           <w:color w:val="000000" w:themeColor="text1"/>
           <w:sz w:val="20"/>
           <w:szCs w:val="24"/>
         </w:rPr>
-        <w:t>Printed in Singapore.</w:t>
-      </w:r>
-    </w:p>
-    <w:p>
-      <w:pPr>
+      </w:pPr>
+      <w:r>
         <w:rPr>
           <w:rFonts w:ascii="Noto Serif" w:eastAsia="Noto Serif SC" w:hAnsi="Noto Serif" w:cs="Noto Serif"/>
           <w:color w:val="000000" w:themeColor="text1"/>
           <w:sz w:val="20"/>
           <w:szCs w:val="24"/>
         </w:rPr>
-      </w:pPr>
+        <w:t>Printed in Singapore.</w:t>
+      </w:r>
     </w:p>
     <w:p>
       <w:pPr>
@@ -1518,44 +1476,44 @@
           <w:szCs w:val="24"/>
         </w:rPr>
       </w:pPr>
-      <w:r>
+    </w:p>
+    <w:p>
+      <w:pPr>
         <w:rPr>
           <w:rFonts w:ascii="Noto Serif" w:eastAsia="Noto Serif SC" w:hAnsi="Noto Serif" w:cs="Noto Serif"/>
           <w:color w:val="000000" w:themeColor="text1"/>
           <w:sz w:val="20"/>
           <w:szCs w:val="24"/>
         </w:rPr>
-        <w:t>Singapore Chinese Orchestra Ltd.</w:t>
-      </w:r>
-    </w:p>
-    <w:p>
-      <w:pPr>
+      </w:pPr>
+      <w:r>
         <w:rPr>
           <w:rFonts w:ascii="Noto Serif" w:eastAsia="Noto Serif SC" w:hAnsi="Noto Serif" w:cs="Noto Serif"/>
           <w:color w:val="000000" w:themeColor="text1"/>
           <w:sz w:val="20"/>
           <w:szCs w:val="24"/>
         </w:rPr>
-      </w:pPr>
-      <w:r>
+        <w:t>Singapore Chinese Orchestra Ltd.</w:t>
+      </w:r>
+    </w:p>
+    <w:p>
+      <w:pPr>
         <w:rPr>
           <w:rFonts w:ascii="Noto Serif" w:eastAsia="Noto Serif SC" w:hAnsi="Noto Serif" w:cs="Noto Serif"/>
           <w:color w:val="000000" w:themeColor="text1"/>
           <w:sz w:val="20"/>
           <w:szCs w:val="24"/>
         </w:rPr>
-        <w:t xml:space="preserve">Singapore Conference Hall, </w:t>
-      </w:r>
-    </w:p>
-    <w:p>
-      <w:pPr>
+      </w:pPr>
+      <w:r>
         <w:rPr>
           <w:rFonts w:ascii="Noto Serif" w:eastAsia="Noto Serif SC" w:hAnsi="Noto Serif" w:cs="Noto Serif"/>
           <w:color w:val="000000" w:themeColor="text1"/>
           <w:sz w:val="20"/>
           <w:szCs w:val="24"/>
         </w:rPr>
-      </w:pPr>
+        <w:t>Singapore Conference Hall,</w:t>
+      </w:r>
       <w:r>
         <w:rPr>
           <w:rFonts w:ascii="Noto Serif" w:eastAsia="Noto Serif SC" w:hAnsi="Noto Serif" w:cs="Noto Serif"/>
@@ -1563,7 +1521,35 @@
           <w:sz w:val="20"/>
           <w:szCs w:val="24"/>
         </w:rPr>
-        <w:t xml:space="preserve">7 Shenton Way, </w:t>
+        <w:t xml:space="preserve"> </w:t>
+      </w:r>
+    </w:p>
+    <w:p>
+      <w:pPr>
+        <w:rPr>
+          <w:rFonts w:ascii="Noto Serif" w:eastAsia="Noto Serif SC" w:hAnsi="Noto Serif" w:cs="Noto Serif"/>
+          <w:color w:val="000000" w:themeColor="text1"/>
+          <w:sz w:val="20"/>
+          <w:szCs w:val="24"/>
+        </w:rPr>
+      </w:pPr>
+      <w:r>
+        <w:rPr>
+          <w:rFonts w:ascii="Noto Serif" w:eastAsia="Noto Serif SC" w:hAnsi="Noto Serif" w:cs="Noto Serif"/>
+          <w:color w:val="000000" w:themeColor="text1"/>
+          <w:sz w:val="20"/>
+          <w:szCs w:val="24"/>
+        </w:rPr>
+        <w:t>7 Shenton Way,</w:t>
+      </w:r>
+      <w:r>
+        <w:rPr>
+          <w:rFonts w:ascii="Noto Serif" w:eastAsia="Noto Serif SC" w:hAnsi="Noto Serif" w:cs="Noto Serif"/>
+          <w:color w:val="000000" w:themeColor="text1"/>
+          <w:sz w:val="20"/>
+          <w:szCs w:val="24"/>
+        </w:rPr>
+        <w:t xml:space="preserve"> </w:t>
       </w:r>
     </w:p>
     <w:p>
@@ -1648,7 +1634,7 @@
       </w:pPr>
       <w:r>
         <w:rPr>
-          <w:rFonts w:ascii="Noto Serif" w:eastAsia="Noto Serif SC" w:hAnsi="Noto Serif" w:cs="Noto Serif"/>
+          <w:rFonts w:ascii="Noto Serif" w:eastAsia="Noto Serif SC" w:hAnsi="Noto Serif" w:cs="Noto Serif" w:hint="eastAsia"/>
           <w:b/>
           <w:sz w:val="44"/>
           <w:szCs w:val="44"/>
@@ -1743,7 +1729,7 @@
       </w:r>
       <w:r>
         <w:rPr>
-          <w:rFonts w:ascii="Noto Serif" w:eastAsia="Noto Serif SC" w:hAnsi="Noto Serif" w:cs="Noto Serif"/>
+          <w:rFonts w:ascii="Noto Serif" w:eastAsia="Noto Serif SC" w:hAnsi="Noto Serif" w:cs="Noto Serif" w:hint="eastAsia"/>
           <w:sz w:val="24"/>
           <w:szCs w:val="24"/>
           <w:lang w:val="en-US"/>
@@ -1761,7 +1747,7 @@
       </w:r>
       <w:r>
         <w:rPr>
-          <w:rFonts w:ascii="Noto Serif" w:eastAsia="Noto Serif SC" w:hAnsi="Noto Serif" w:cs="Noto Serif"/>
+          <w:rFonts w:ascii="Noto Serif" w:eastAsia="Noto Serif SC" w:hAnsi="Noto Serif" w:cs="Noto Serif" w:hint="eastAsia"/>
           <w:sz w:val="24"/>
           <w:szCs w:val="24"/>
           <w:lang w:val="en-US"/>
@@ -1779,7 +1765,7 @@
       </w:r>
       <w:r>
         <w:rPr>
-          <w:rFonts w:ascii="Noto Serif" w:eastAsia="Noto Serif SC" w:hAnsi="Noto Serif" w:cs="Noto Serif"/>
+          <w:rFonts w:ascii="Noto Serif" w:eastAsia="Noto Serif SC" w:hAnsi="Noto Serif" w:cs="Noto Serif" w:hint="eastAsia"/>
           <w:sz w:val="24"/>
           <w:szCs w:val="24"/>
           <w:lang w:val="en-US"/>
@@ -1797,7 +1783,7 @@
       </w:r>
       <w:r>
         <w:rPr>
-          <w:rFonts w:ascii="Noto Serif" w:eastAsia="Noto Serif SC" w:hAnsi="Noto Serif" w:cs="Noto Serif"/>
+          <w:rFonts w:ascii="Noto Serif" w:eastAsia="Noto Serif SC" w:hAnsi="Noto Serif" w:cs="Noto Serif" w:hint="eastAsia"/>
           <w:sz w:val="24"/>
           <w:szCs w:val="24"/>
           <w:lang w:val="en-US"/>
@@ -1826,7 +1812,7 @@
       </w:pPr>
       <w:r>
         <w:rPr>
-          <w:rFonts w:ascii="Noto Serif" w:eastAsia="Noto Serif SC" w:hAnsi="Noto Serif" w:cs="Noto Serif"/>
+          <w:rFonts w:ascii="Noto Serif" w:eastAsia="Noto Serif SC" w:hAnsi="Noto Serif" w:cs="Noto Serif" w:hint="eastAsia"/>
           <w:sz w:val="24"/>
           <w:szCs w:val="24"/>
           <w:lang w:val="en-US"/>
@@ -1844,7 +1830,7 @@
       </w:r>
       <w:r>
         <w:rPr>
-          <w:rFonts w:ascii="Noto Serif" w:eastAsia="Noto Serif SC" w:hAnsi="Noto Serif" w:cs="Noto Serif"/>
+          <w:rFonts w:ascii="Noto Serif" w:eastAsia="Noto Serif SC" w:hAnsi="Noto Serif" w:cs="Noto Serif" w:hint="eastAsia"/>
           <w:sz w:val="24"/>
           <w:szCs w:val="24"/>
           <w:lang w:val="en-US"/>
@@ -1862,7 +1848,7 @@
       </w:r>
       <w:r>
         <w:rPr>
-          <w:rFonts w:ascii="Noto Serif" w:eastAsia="Noto Serif SC" w:hAnsi="Noto Serif" w:cs="Noto Serif"/>
+          <w:rFonts w:ascii="Noto Serif" w:eastAsia="Noto Serif SC" w:hAnsi="Noto Serif" w:cs="Noto Serif" w:hint="eastAsia"/>
           <w:sz w:val="24"/>
           <w:szCs w:val="24"/>
           <w:lang w:val="en-US"/>
@@ -1880,36 +1866,36 @@
       </w:r>
       <w:r>
         <w:rPr>
-          <w:rFonts w:ascii="Noto Serif" w:eastAsia="Noto Serif SC" w:hAnsi="Noto Serif" w:cs="Noto Serif"/>
-          <w:sz w:val="24"/>
-          <w:szCs w:val="24"/>
-          <w:lang w:val="en-US"/>
-        </w:rPr>
-        <w:t>等。其作品曾于国际及本土音乐会上演出，包括克罗地亚、德国、荷兰、美国，俄罗斯、南韩及印尼等。</w:t>
-      </w:r>
-    </w:p>
-    <w:p>
-      <w:pPr>
-        <w:rPr>
-          <w:rFonts w:ascii="Noto Serif" w:eastAsia="Noto Serif SC" w:hAnsi="Noto Serif" w:cs="Noto Serif"/>
-          <w:sz w:val="24"/>
-          <w:szCs w:val="24"/>
-          <w:lang w:val="en-US"/>
-        </w:rPr>
-      </w:pPr>
-    </w:p>
-    <w:p>
-      <w:pPr>
-        <w:rPr>
-          <w:rFonts w:ascii="Noto Serif" w:eastAsia="Noto Serif SC" w:hAnsi="Noto Serif" w:cs="Noto Serif"/>
-          <w:sz w:val="24"/>
-          <w:szCs w:val="24"/>
-          <w:lang w:val="en-US"/>
-        </w:rPr>
-      </w:pPr>
-      <w:r>
-        <w:rPr>
-          <w:rFonts w:ascii="Noto Serif" w:eastAsia="Noto Serif SC" w:hAnsi="Noto Serif" w:cs="Noto Serif"/>
+          <w:rFonts w:ascii="Noto Serif" w:eastAsia="Noto Serif SC" w:hAnsi="Noto Serif" w:cs="Noto Serif" w:hint="eastAsia"/>
+          <w:sz w:val="24"/>
+          <w:szCs w:val="24"/>
+          <w:lang w:val="en-US"/>
+        </w:rPr>
+        <w:t>等。其作品曾于国际及本土音乐会上演出，包括克罗地亚、德国、荷兰、美国，俄罗斯、南韩及印度尼西亚等。</w:t>
+      </w:r>
+    </w:p>
+    <w:p>
+      <w:pPr>
+        <w:rPr>
+          <w:rFonts w:ascii="Noto Serif" w:eastAsia="Noto Serif SC" w:hAnsi="Noto Serif" w:cs="Noto Serif"/>
+          <w:sz w:val="24"/>
+          <w:szCs w:val="24"/>
+          <w:lang w:val="en-US"/>
+        </w:rPr>
+      </w:pPr>
+    </w:p>
+    <w:p>
+      <w:pPr>
+        <w:rPr>
+          <w:rFonts w:ascii="Noto Serif" w:eastAsia="Noto Serif SC" w:hAnsi="Noto Serif" w:cs="Noto Serif"/>
+          <w:sz w:val="24"/>
+          <w:szCs w:val="24"/>
+          <w:lang w:val="en-US"/>
+        </w:rPr>
+      </w:pPr>
+      <w:r>
+        <w:rPr>
+          <w:rFonts w:ascii="Noto Serif" w:eastAsia="Noto Serif SC" w:hAnsi="Noto Serif" w:cs="Noto Serif" w:hint="eastAsia"/>
           <w:sz w:val="24"/>
           <w:szCs w:val="24"/>
           <w:lang w:val="en-US"/>
@@ -1938,7 +1924,7 @@
       <w:proofErr w:type="spellEnd"/>
       <w:r>
         <w:rPr>
-          <w:rFonts w:ascii="Noto Serif" w:eastAsia="Noto Serif SC" w:hAnsi="Noto Serif" w:cs="Noto Serif"/>
+          <w:rFonts w:ascii="Noto Serif" w:eastAsia="Noto Serif SC" w:hAnsi="Noto Serif" w:cs="Noto Serif" w:hint="eastAsia"/>
           <w:sz w:val="24"/>
           <w:szCs w:val="24"/>
           <w:lang w:val="en-US"/>
@@ -1956,7 +1942,7 @@
       </w:r>
       <w:r>
         <w:rPr>
-          <w:rFonts w:ascii="Noto Serif" w:eastAsia="Noto Serif SC" w:hAnsi="Noto Serif" w:cs="Noto Serif"/>
+          <w:rFonts w:ascii="Noto Serif" w:eastAsia="Noto Serif SC" w:hAnsi="Noto Serif" w:cs="Noto Serif" w:hint="eastAsia"/>
           <w:sz w:val="24"/>
           <w:szCs w:val="24"/>
           <w:lang w:val="en-US"/>
@@ -1974,7 +1960,7 @@
       </w:r>
       <w:r>
         <w:rPr>
-          <w:rFonts w:ascii="Noto Serif" w:eastAsia="Noto Serif SC" w:hAnsi="Noto Serif" w:cs="Noto Serif"/>
+          <w:rFonts w:ascii="Noto Serif" w:eastAsia="Noto Serif SC" w:hAnsi="Noto Serif" w:cs="Noto Serif" w:hint="eastAsia"/>
           <w:sz w:val="24"/>
           <w:szCs w:val="24"/>
           <w:lang w:val="en-US"/>
@@ -1992,7 +1978,7 @@
       </w:r>
       <w:r>
         <w:rPr>
-          <w:rFonts w:ascii="Noto Serif" w:eastAsia="Noto Serif SC" w:hAnsi="Noto Serif" w:cs="Noto Serif"/>
+          <w:rFonts w:ascii="Noto Serif" w:eastAsia="Noto Serif SC" w:hAnsi="Noto Serif" w:cs="Noto Serif" w:hint="eastAsia"/>
           <w:sz w:val="24"/>
           <w:szCs w:val="24"/>
           <w:lang w:val="en-US"/>
@@ -2010,7 +1996,7 @@
       </w:r>
       <w:r>
         <w:rPr>
-          <w:rFonts w:ascii="Noto Serif" w:eastAsia="Noto Serif SC" w:hAnsi="Noto Serif" w:cs="Noto Serif"/>
+          <w:rFonts w:ascii="Noto Serif" w:eastAsia="Noto Serif SC" w:hAnsi="Noto Serif" w:cs="Noto Serif" w:hint="eastAsia"/>
           <w:sz w:val="24"/>
           <w:szCs w:val="24"/>
           <w:lang w:val="en-US"/>
@@ -2028,7 +2014,7 @@
       </w:r>
       <w:r>
         <w:rPr>
-          <w:rFonts w:ascii="Noto Serif" w:eastAsia="Noto Serif SC" w:hAnsi="Noto Serif" w:cs="Noto Serif"/>
+          <w:rFonts w:ascii="Noto Serif" w:eastAsia="Noto Serif SC" w:hAnsi="Noto Serif" w:cs="Noto Serif" w:hint="eastAsia"/>
           <w:sz w:val="24"/>
           <w:szCs w:val="24"/>
           <w:lang w:val="en-US"/>
@@ -2046,7 +2032,7 @@
       </w:r>
       <w:r>
         <w:rPr>
-          <w:rFonts w:ascii="Noto Serif" w:eastAsia="Noto Serif SC" w:hAnsi="Noto Serif" w:cs="Noto Serif"/>
+          <w:rFonts w:ascii="Noto Serif" w:eastAsia="Noto Serif SC" w:hAnsi="Noto Serif" w:cs="Noto Serif" w:hint="eastAsia"/>
           <w:sz w:val="24"/>
           <w:szCs w:val="24"/>
           <w:lang w:val="en-US"/>
@@ -2143,7 +2129,16 @@
           <w:szCs w:val="24"/>
           <w:lang w:val="en-US"/>
         </w:rPr>
-        <w:t xml:space="preserve"> at the University of Hong Kong, where he received his M. Phil., and B. A. degree (Music – First Class Honors). </w:t>
+        <w:t xml:space="preserve"> at the University of Hong Kong, where he received his M. Phil., and B. A. degree (Music – First Class Honors).</w:t>
+      </w:r>
+      <w:r>
+        <w:rPr>
+          <w:rFonts w:ascii="Noto Serif" w:eastAsia="Noto Serif SC" w:hAnsi="Noto Serif" w:cs="Noto Serif"/>
+          <w:sz w:val="24"/>
+          <w:szCs w:val="24"/>
+          <w:lang w:val="en-US"/>
+        </w:rPr>
+        <w:t xml:space="preserve"> </w:t>
       </w:r>
     </w:p>
     <w:p>
@@ -2192,25 +2187,16 @@
           <w:szCs w:val="24"/>
           <w:lang w:val="en-US"/>
         </w:rPr>
-        <w:t xml:space="preserve"> mention in Atlas Ensemble Composition Competition (2014), 3rd runner-up in the 10th Luxembourg Sinfonietta International Composition Prize (2013), etc. His works are heard in both international and local concerts, including Croatia, Germany, the Netherlands, U. S. A., Russia, South Korea, and Indonesia; </w:t>
-      </w:r>
-      <w:r>
-        <w:rPr>
-          <w:rFonts w:ascii="Noto Serif" w:eastAsia="Noto Serif SC" w:hAnsi="Noto Serif" w:cs="Noto Serif"/>
-          <w:sz w:val="24"/>
-          <w:szCs w:val="24"/>
-          <w:lang w:val="en-US"/>
-        </w:rPr>
-        <w:t>also,</w:t>
-      </w:r>
-      <w:r>
-        <w:rPr>
-          <w:rFonts w:ascii="Noto Serif" w:eastAsia="Noto Serif SC" w:hAnsi="Noto Serif" w:cs="Noto Serif"/>
-          <w:sz w:val="24"/>
-          <w:szCs w:val="24"/>
-          <w:lang w:val="en-US"/>
-        </w:rPr>
-        <w:t xml:space="preserve"> in renowned festivals ISCM – WMD and International Gaudeamus Music Week. </w:t>
+        <w:t xml:space="preserve"> mention in Atlas Ensemble Composition Competition (2014), 3rd runner-up in the 10th Luxembourg Sinfonietta International Composition Prize (2013), etc. His works are heard in both international and local concerts, including Croatia, Germany, the Netherlands, U. S. A., Russia, South Korea, and Indonesia; also, in renowned festivals ISCM – WMD and International Gaudeamus Music Week.</w:t>
+      </w:r>
+      <w:r>
+        <w:rPr>
+          <w:rFonts w:ascii="Noto Serif" w:eastAsia="Noto Serif SC" w:hAnsi="Noto Serif" w:cs="Noto Serif"/>
+          <w:sz w:val="24"/>
+          <w:szCs w:val="24"/>
+          <w:lang w:val="en-US"/>
+        </w:rPr>
+        <w:t xml:space="preserve"> </w:t>
       </w:r>
     </w:p>
     <w:p>
@@ -2383,7 +2369,7 @@
       </w:pPr>
       <w:r>
         <w:rPr>
-          <w:rFonts w:ascii="Noto Serif" w:eastAsia="Noto Serif SC" w:hAnsi="Noto Serif" w:cs="Noto Serif"/>
+          <w:rFonts w:ascii="Noto Serif" w:eastAsia="Noto Serif SC" w:hAnsi="Noto Serif" w:cs="Noto Serif" w:hint="eastAsia"/>
           <w:b/>
           <w:sz w:val="44"/>
           <w:szCs w:val="44"/>
@@ -2412,7 +2398,7 @@
       </w:pPr>
       <w:r>
         <w:rPr>
-          <w:rFonts w:ascii="Noto Serif" w:eastAsia="Noto Serif SC" w:hAnsi="Noto Serif" w:cs="Noto Serif"/>
+          <w:rFonts w:ascii="Noto Serif" w:eastAsia="Noto Serif SC" w:hAnsi="Noto Serif" w:cs="Noto Serif" w:hint="eastAsia"/>
           <w:sz w:val="24"/>
           <w:szCs w:val="24"/>
           <w:lang w:val="en-US"/>
@@ -2430,7 +2416,7 @@
       </w:r>
       <w:r>
         <w:rPr>
-          <w:rFonts w:ascii="Noto Serif" w:eastAsia="Noto Serif SC" w:hAnsi="Noto Serif" w:cs="Noto Serif"/>
+          <w:rFonts w:ascii="Noto Serif" w:eastAsia="Noto Serif SC" w:hAnsi="Noto Serif" w:cs="Noto Serif" w:hint="eastAsia"/>
           <w:sz w:val="24"/>
           <w:szCs w:val="24"/>
           <w:lang w:val="en-US"/>
@@ -2448,7 +2434,7 @@
       </w:r>
       <w:r>
         <w:rPr>
-          <w:rFonts w:ascii="Noto Serif" w:eastAsia="Noto Serif SC" w:hAnsi="Noto Serif" w:cs="Noto Serif"/>
+          <w:rFonts w:ascii="Noto Serif" w:eastAsia="Noto Serif SC" w:hAnsi="Noto Serif" w:cs="Noto Serif" w:hint="eastAsia"/>
           <w:sz w:val="24"/>
           <w:szCs w:val="24"/>
           <w:lang w:val="en-US"/>
@@ -2466,7 +2452,7 @@
       </w:r>
       <w:r>
         <w:rPr>
-          <w:rFonts w:ascii="Noto Serif" w:eastAsia="Noto Serif SC" w:hAnsi="Noto Serif" w:cs="Noto Serif"/>
+          <w:rFonts w:ascii="Noto Serif" w:eastAsia="Noto Serif SC" w:hAnsi="Noto Serif" w:cs="Noto Serif" w:hint="eastAsia"/>
           <w:sz w:val="24"/>
           <w:szCs w:val="24"/>
           <w:lang w:val="en-US"/>
@@ -2484,7 +2470,7 @@
       </w:r>
       <w:r>
         <w:rPr>
-          <w:rFonts w:ascii="Noto Serif" w:eastAsia="Noto Serif SC" w:hAnsi="Noto Serif" w:cs="Noto Serif"/>
+          <w:rFonts w:ascii="Noto Serif" w:eastAsia="Noto Serif SC" w:hAnsi="Noto Serif" w:cs="Noto Serif" w:hint="eastAsia"/>
           <w:sz w:val="24"/>
           <w:szCs w:val="24"/>
           <w:lang w:val="en-US"/>
@@ -2502,7 +2488,7 @@
       </w:r>
       <w:r>
         <w:rPr>
-          <w:rFonts w:ascii="Noto Serif" w:eastAsia="Noto Serif SC" w:hAnsi="Noto Serif" w:cs="Noto Serif"/>
+          <w:rFonts w:ascii="Noto Serif" w:eastAsia="Noto Serif SC" w:hAnsi="Noto Serif" w:cs="Noto Serif" w:hint="eastAsia"/>
           <w:sz w:val="24"/>
           <w:szCs w:val="24"/>
           <w:lang w:val="en-US"/>
@@ -2520,7 +2506,7 @@
       </w:r>
       <w:r>
         <w:rPr>
-          <w:rFonts w:ascii="Noto Serif" w:eastAsia="Noto Serif SC" w:hAnsi="Noto Serif" w:cs="Noto Serif"/>
+          <w:rFonts w:ascii="Noto Serif" w:eastAsia="Noto Serif SC" w:hAnsi="Noto Serif" w:cs="Noto Serif" w:hint="eastAsia"/>
           <w:sz w:val="24"/>
           <w:szCs w:val="24"/>
           <w:lang w:val="en-US"/>
@@ -2538,7 +2524,7 @@
       </w:r>
       <w:r>
         <w:rPr>
-          <w:rFonts w:ascii="Noto Serif" w:eastAsia="Noto Serif SC" w:hAnsi="Noto Serif" w:cs="Noto Serif"/>
+          <w:rFonts w:ascii="Noto Serif" w:eastAsia="Noto Serif SC" w:hAnsi="Noto Serif" w:cs="Noto Serif" w:hint="eastAsia"/>
           <w:sz w:val="24"/>
           <w:szCs w:val="24"/>
           <w:lang w:val="en-US"/>
@@ -2731,25 +2717,7 @@
           <w:szCs w:val="24"/>
           <w:lang w:val="en-US"/>
         </w:rPr>
-        <w:t xml:space="preserve"> – he” structure, hence stylistically and </w:t>
-      </w:r>
-      <w:r>
-        <w:rPr>
-          <w:rFonts w:ascii="Noto Serif" w:eastAsia="Noto Serif SC" w:hAnsi="Noto Serif" w:cs="Noto Serif"/>
-          <w:sz w:val="24"/>
-          <w:szCs w:val="24"/>
-          <w:lang w:val="en-US"/>
-        </w:rPr>
-        <w:t>skillfully</w:t>
-      </w:r>
-      <w:r>
-        <w:rPr>
-          <w:rFonts w:ascii="Noto Serif" w:eastAsia="Noto Serif SC" w:hAnsi="Noto Serif" w:cs="Noto Serif"/>
-          <w:sz w:val="24"/>
-          <w:szCs w:val="24"/>
-          <w:lang w:val="en-US"/>
-        </w:rPr>
-        <w:t xml:space="preserve"> created an eclectic piece with various Chinese idioms. There are twelve poetically named sections that made references to the lion dance. This piece won the First Prize at the Singapore International Competition for Chinese Orchestral Composition 2015.</w:t>
+        <w:t xml:space="preserve"> – he” structure, hence stylistically and skillfully created an eclectic piece with various Chinese idioms. There are twelve poetically named sections that made references to the lion dance. This piece won the First Prize at the Singapore International Competition for Chinese Orchestral Composition 2015.</w:t>
       </w:r>
     </w:p>
     <w:p>
@@ -2782,14 +2750,13 @@
       </w:pPr>
       <w:r>
         <w:rPr>
-          <w:rFonts w:ascii="Noto Serif" w:eastAsia="Noto Serif SC" w:hAnsi="Noto Serif" w:cs="Noto Serif"/>
+          <w:rFonts w:ascii="Noto Serif" w:eastAsia="Noto Serif SC" w:hAnsi="Noto Serif" w:cs="Noto Serif" w:hint="eastAsia"/>
           <w:b/>
           <w:sz w:val="44"/>
           <w:szCs w:val="44"/>
-          <w:lang w:eastAsia="zh-TW"/>
         </w:rPr>
         <w:lastRenderedPageBreak/>
-        <w:t>編制</w:t>
+        <w:t>编制</w:t>
       </w:r>
       <w:r>
         <w:rPr>
@@ -2797,7 +2764,6 @@
           <w:b/>
           <w:sz w:val="44"/>
           <w:szCs w:val="44"/>
-          <w:lang w:eastAsia="zh-TW"/>
         </w:rPr>
         <w:t>Instrumentation</w:t>
       </w:r>
@@ -2814,7 +2780,7 @@
       </w:pPr>
       <w:r>
         <w:rPr>
-          <w:rFonts w:ascii="Noto Serif" w:eastAsia="Noto Serif SC" w:hAnsi="Noto Serif" w:cs="Noto Serif"/>
+          <w:rFonts w:ascii="Noto Serif" w:eastAsia="Noto Serif SC" w:hAnsi="Noto Serif" w:cs="Noto Serif" w:hint="eastAsia"/>
           <w:sz w:val="24"/>
           <w:szCs w:val="24"/>
           <w:lang w:val="en-US"/>
@@ -2861,12 +2827,12 @@
       </w:r>
       <w:r>
         <w:rPr>
-          <w:rFonts w:ascii="Noto Serif" w:eastAsia="Noto Serif SC" w:hAnsi="Noto Serif" w:cs="Noto Serif"/>
-          <w:sz w:val="24"/>
-          <w:szCs w:val="24"/>
-          <w:lang w:val="en-US"/>
-        </w:rPr>
-        <w:t>調小笛、</w:t>
+          <w:rFonts w:ascii="Noto Serif" w:eastAsia="Noto Serif SC" w:hAnsi="Noto Serif" w:cs="Noto Serif" w:hint="eastAsia"/>
+          <w:sz w:val="24"/>
+          <w:szCs w:val="24"/>
+          <w:lang w:val="en-US"/>
+        </w:rPr>
+        <w:t>调小笛、</w:t>
       </w:r>
       <w:r>
         <w:rPr>
@@ -2879,12 +2845,12 @@
       </w:r>
       <w:r>
         <w:rPr>
-          <w:rFonts w:ascii="Noto Serif" w:eastAsia="Noto Serif SC" w:hAnsi="Noto Serif" w:cs="Noto Serif"/>
-          <w:sz w:val="24"/>
-          <w:szCs w:val="24"/>
-          <w:lang w:val="en-US"/>
-        </w:rPr>
-        <w:t>調梆笛</w:t>
+          <w:rFonts w:ascii="Noto Serif" w:eastAsia="Noto Serif SC" w:hAnsi="Noto Serif" w:cs="Noto Serif" w:hint="eastAsia"/>
+          <w:sz w:val="24"/>
+          <w:szCs w:val="24"/>
+          <w:lang w:val="en-US"/>
+        </w:rPr>
+        <w:t>调梆笛</w:t>
       </w:r>
       <w:r>
         <w:rPr>
@@ -2908,7 +2874,7 @@
       </w:pPr>
       <w:r>
         <w:rPr>
-          <w:rFonts w:ascii="Noto Serif" w:eastAsia="Noto Serif SC" w:hAnsi="Noto Serif" w:cs="Noto Serif"/>
+          <w:rFonts w:ascii="Noto Serif" w:eastAsia="Noto Serif SC" w:hAnsi="Noto Serif" w:cs="Noto Serif" w:hint="eastAsia"/>
           <w:sz w:val="24"/>
           <w:szCs w:val="24"/>
           <w:lang w:val="en-US"/>
@@ -2946,12 +2912,12 @@
       </w:r>
       <w:r>
         <w:rPr>
-          <w:rFonts w:ascii="Noto Serif" w:eastAsia="Noto Serif SC" w:hAnsi="Noto Serif" w:cs="Noto Serif"/>
-          <w:sz w:val="24"/>
-          <w:szCs w:val="24"/>
-          <w:lang w:val="en-US"/>
-        </w:rPr>
-        <w:t>調梆笛</w:t>
+          <w:rFonts w:ascii="Noto Serif" w:eastAsia="Noto Serif SC" w:hAnsi="Noto Serif" w:cs="Noto Serif" w:hint="eastAsia"/>
+          <w:sz w:val="24"/>
+          <w:szCs w:val="24"/>
+          <w:lang w:val="en-US"/>
+        </w:rPr>
+        <w:t>调梆笛</w:t>
       </w:r>
       <w:r>
         <w:rPr>
@@ -2975,7 +2941,7 @@
       </w:pPr>
       <w:r>
         <w:rPr>
-          <w:rFonts w:ascii="Noto Serif" w:eastAsia="Noto Serif SC" w:hAnsi="Noto Serif" w:cs="Noto Serif"/>
+          <w:rFonts w:ascii="Noto Serif" w:eastAsia="Noto Serif SC" w:hAnsi="Noto Serif" w:cs="Noto Serif" w:hint="eastAsia"/>
           <w:sz w:val="24"/>
           <w:szCs w:val="24"/>
           <w:lang w:val="en-US"/>
@@ -3024,7 +2990,7 @@
       </w:pPr>
       <w:r>
         <w:rPr>
-          <w:rFonts w:ascii="Noto Serif" w:eastAsia="Noto Serif SC" w:hAnsi="Noto Serif" w:cs="Noto Serif"/>
+          <w:rFonts w:ascii="Noto Serif" w:eastAsia="Noto Serif SC" w:hAnsi="Noto Serif" w:cs="Noto Serif" w:hint="eastAsia"/>
           <w:sz w:val="24"/>
           <w:szCs w:val="24"/>
           <w:lang w:val="en-US"/>
@@ -3084,7 +3050,7 @@
       </w:pPr>
       <w:r>
         <w:rPr>
-          <w:rFonts w:ascii="Noto Serif" w:eastAsia="Noto Serif SC" w:hAnsi="Noto Serif" w:cs="Noto Serif"/>
+          <w:rFonts w:ascii="Noto Serif" w:eastAsia="Noto Serif SC" w:hAnsi="Noto Serif" w:cs="Noto Serif" w:hint="eastAsia"/>
           <w:sz w:val="24"/>
           <w:szCs w:val="24"/>
           <w:lang w:val="en-US"/>
@@ -3133,7 +3099,7 @@
       </w:pPr>
       <w:r>
         <w:rPr>
-          <w:rFonts w:ascii="Noto Serif" w:eastAsia="Noto Serif SC" w:hAnsi="Noto Serif" w:cs="Noto Serif"/>
+          <w:rFonts w:ascii="Noto Serif" w:eastAsia="Noto Serif SC" w:hAnsi="Noto Serif" w:cs="Noto Serif" w:hint="eastAsia"/>
           <w:sz w:val="24"/>
           <w:szCs w:val="24"/>
           <w:lang w:val="en-US"/>
@@ -3147,26 +3113,117 @@
           <w:szCs w:val="24"/>
           <w:lang w:val="en-US"/>
         </w:rPr>
+        <w:t xml:space="preserve"> I, II (</w:t>
+      </w:r>
+      <w:proofErr w:type="spellStart"/>
+      <w:r>
+        <w:rPr>
+          <w:rFonts w:ascii="Noto Serif" w:eastAsia="Noto Serif SC" w:hAnsi="Noto Serif" w:cs="Noto Serif"/>
+          <w:sz w:val="24"/>
+          <w:szCs w:val="24"/>
+          <w:lang w:val="en-US"/>
+        </w:rPr>
+        <w:t>Zhongyin</w:t>
+      </w:r>
+      <w:proofErr w:type="spellEnd"/>
+      <w:r>
+        <w:rPr>
+          <w:rFonts w:ascii="Noto Serif" w:eastAsia="Noto Serif SC" w:hAnsi="Noto Serif" w:cs="Noto Serif"/>
+          <w:sz w:val="24"/>
+          <w:szCs w:val="24"/>
+          <w:lang w:val="en-US"/>
+        </w:rPr>
+        <w:t xml:space="preserve"> Sheng I, II)</w:t>
+      </w:r>
+    </w:p>
+    <w:p>
+      <w:pPr>
+        <w:jc w:val="right"/>
+        <w:rPr>
+          <w:rFonts w:ascii="Noto Serif" w:eastAsia="Noto Serif SC" w:hAnsi="Noto Serif" w:cs="Noto Serif"/>
+          <w:sz w:val="24"/>
+          <w:szCs w:val="24"/>
+          <w:lang w:val="en-US"/>
+        </w:rPr>
+      </w:pPr>
+      <w:r>
+        <w:rPr>
+          <w:rFonts w:ascii="Noto Serif" w:eastAsia="Noto Serif SC" w:hAnsi="Noto Serif" w:cs="Noto Serif" w:hint="eastAsia"/>
+          <w:sz w:val="24"/>
+          <w:szCs w:val="24"/>
+          <w:lang w:val="en-US"/>
+        </w:rPr>
+        <w:t>低音笙</w:t>
+      </w:r>
+      <w:r>
+        <w:rPr>
+          <w:rFonts w:ascii="Noto Serif" w:eastAsia="Noto Serif SC" w:hAnsi="Noto Serif" w:cs="Noto Serif"/>
+          <w:sz w:val="24"/>
+          <w:szCs w:val="24"/>
+          <w:lang w:val="en-US"/>
+        </w:rPr>
+        <w:t xml:space="preserve"> (Diyin Sheng)</w:t>
+      </w:r>
+    </w:p>
+    <w:p>
+      <w:pPr>
+        <w:jc w:val="right"/>
+        <w:rPr>
+          <w:rFonts w:ascii="Noto Serif" w:eastAsia="Noto Serif SC" w:hAnsi="Noto Serif" w:cs="Noto Serif"/>
+          <w:sz w:val="24"/>
+          <w:szCs w:val="24"/>
+          <w:lang w:val="en-US"/>
+        </w:rPr>
+      </w:pPr>
+    </w:p>
+    <w:p>
+      <w:pPr>
+        <w:jc w:val="right"/>
+        <w:rPr>
+          <w:rFonts w:ascii="Noto Serif" w:eastAsia="Noto Serif SC" w:hAnsi="Noto Serif" w:cs="Noto Serif"/>
+          <w:sz w:val="24"/>
+          <w:szCs w:val="24"/>
+          <w:lang w:val="en-US"/>
+        </w:rPr>
+      </w:pPr>
+      <w:r>
+        <w:rPr>
+          <w:rFonts w:ascii="Noto Serif" w:eastAsia="Noto Serif SC" w:hAnsi="Noto Serif" w:cs="Noto Serif" w:hint="eastAsia"/>
+          <w:sz w:val="24"/>
+          <w:szCs w:val="24"/>
+          <w:lang w:val="en-US"/>
+        </w:rPr>
+        <w:t>高音加键唢吶</w:t>
+      </w:r>
+      <w:r>
+        <w:rPr>
+          <w:rFonts w:ascii="Noto Serif" w:eastAsia="Noto Serif SC" w:hAnsi="Noto Serif" w:cs="Noto Serif"/>
+          <w:sz w:val="24"/>
+          <w:szCs w:val="24"/>
+          <w:lang w:val="en-US"/>
+        </w:rPr>
+        <w:t xml:space="preserve"> I, II (</w:t>
+      </w:r>
+      <w:proofErr w:type="spellStart"/>
+      <w:r>
+        <w:rPr>
+          <w:rFonts w:ascii="Noto Serif" w:eastAsia="Noto Serif SC" w:hAnsi="Noto Serif" w:cs="Noto Serif"/>
+          <w:sz w:val="24"/>
+          <w:szCs w:val="24"/>
+          <w:lang w:val="en-US"/>
+        </w:rPr>
+        <w:t>Gaoyin</w:t>
+      </w:r>
+      <w:proofErr w:type="spellEnd"/>
+      <w:r>
+        <w:rPr>
+          <w:rFonts w:ascii="Noto Serif" w:eastAsia="Noto Serif SC" w:hAnsi="Noto Serif" w:cs="Noto Serif"/>
+          <w:sz w:val="24"/>
+          <w:szCs w:val="24"/>
+          <w:lang w:val="en-US"/>
+        </w:rPr>
         <w:t xml:space="preserve"> </w:t>
       </w:r>
-      <w:r>
-        <w:rPr>
-          <w:rFonts w:ascii="Noto Serif" w:eastAsia="Noto Serif SC" w:hAnsi="Noto Serif" w:cs="Noto Serif"/>
-          <w:sz w:val="24"/>
-          <w:szCs w:val="24"/>
-          <w:lang w:val="en-US"/>
-        </w:rPr>
-        <w:t xml:space="preserve">I, II </w:t>
-      </w:r>
-      <w:r>
-        <w:rPr>
-          <w:rFonts w:ascii="Noto Serif" w:eastAsia="Noto Serif SC" w:hAnsi="Noto Serif" w:cs="Noto Serif"/>
-          <w:sz w:val="24"/>
-          <w:szCs w:val="24"/>
-          <w:lang w:val="en-US"/>
-        </w:rPr>
-        <w:t>(</w:t>
-      </w:r>
       <w:proofErr w:type="spellStart"/>
       <w:r>
         <w:rPr>
@@ -3175,6 +3232,55 @@
           <w:szCs w:val="24"/>
           <w:lang w:val="en-US"/>
         </w:rPr>
+        <w:t>Suona</w:t>
+      </w:r>
+      <w:proofErr w:type="spellEnd"/>
+      <w:r>
+        <w:rPr>
+          <w:rFonts w:ascii="Noto Serif" w:eastAsia="Noto Serif SC" w:hAnsi="Noto Serif" w:cs="Noto Serif"/>
+          <w:sz w:val="24"/>
+          <w:szCs w:val="24"/>
+          <w:lang w:val="en-US"/>
+        </w:rPr>
+        <w:t xml:space="preserve"> I, II)</w:t>
+      </w:r>
+    </w:p>
+    <w:p>
+      <w:pPr>
+        <w:jc w:val="right"/>
+        <w:rPr>
+          <w:rFonts w:ascii="Noto Serif" w:eastAsia="Noto Serif SC" w:hAnsi="Noto Serif" w:cs="Noto Serif"/>
+          <w:sz w:val="24"/>
+          <w:szCs w:val="24"/>
+          <w:lang w:val="en-US"/>
+        </w:rPr>
+      </w:pPr>
+      <w:r>
+        <w:rPr>
+          <w:rFonts w:ascii="Noto Serif" w:eastAsia="Noto Serif SC" w:hAnsi="Noto Serif" w:cs="Noto Serif" w:hint="eastAsia"/>
+          <w:sz w:val="24"/>
+          <w:szCs w:val="24"/>
+          <w:lang w:val="en-US"/>
+        </w:rPr>
+        <w:t>中音加键唢吶</w:t>
+      </w:r>
+      <w:r>
+        <w:rPr>
+          <w:rFonts w:ascii="Noto Serif" w:eastAsia="Noto Serif SC" w:hAnsi="Noto Serif" w:cs="Noto Serif"/>
+          <w:sz w:val="24"/>
+          <w:szCs w:val="24"/>
+          <w:lang w:val="en-US"/>
+        </w:rPr>
+        <w:t xml:space="preserve"> I, II (</w:t>
+      </w:r>
+      <w:proofErr w:type="spellStart"/>
+      <w:r>
+        <w:rPr>
+          <w:rFonts w:ascii="Noto Serif" w:eastAsia="Noto Serif SC" w:hAnsi="Noto Serif" w:cs="Noto Serif"/>
+          <w:sz w:val="24"/>
+          <w:szCs w:val="24"/>
+          <w:lang w:val="en-US"/>
+        </w:rPr>
         <w:t>Zhongyin</w:t>
       </w:r>
       <w:proofErr w:type="spellEnd"/>
@@ -3185,17 +3291,68 @@
           <w:szCs w:val="24"/>
           <w:lang w:val="en-US"/>
         </w:rPr>
-        <w:t xml:space="preserve"> Sheng</w:t>
-      </w:r>
-      <w:r>
-        <w:rPr>
-          <w:rFonts w:ascii="Noto Serif" w:eastAsia="Noto Serif SC" w:hAnsi="Noto Serif" w:cs="Noto Serif"/>
-          <w:sz w:val="24"/>
-          <w:szCs w:val="24"/>
-          <w:lang w:val="en-US"/>
-        </w:rPr>
-        <w:t xml:space="preserve"> I, II</w:t>
-      </w:r>
+        <w:t xml:space="preserve"> </w:t>
+      </w:r>
+      <w:proofErr w:type="spellStart"/>
+      <w:r>
+        <w:rPr>
+          <w:rFonts w:ascii="Noto Serif" w:eastAsia="Noto Serif SC" w:hAnsi="Noto Serif" w:cs="Noto Serif"/>
+          <w:sz w:val="24"/>
+          <w:szCs w:val="24"/>
+          <w:lang w:val="en-US"/>
+        </w:rPr>
+        <w:t>Suona</w:t>
+      </w:r>
+      <w:proofErr w:type="spellEnd"/>
+      <w:r>
+        <w:rPr>
+          <w:rFonts w:ascii="Noto Serif" w:eastAsia="Noto Serif SC" w:hAnsi="Noto Serif" w:cs="Noto Serif"/>
+          <w:sz w:val="24"/>
+          <w:szCs w:val="24"/>
+          <w:lang w:val="en-US"/>
+        </w:rPr>
+        <w:t xml:space="preserve"> I, II)</w:t>
+      </w:r>
+    </w:p>
+    <w:p>
+      <w:pPr>
+        <w:jc w:val="right"/>
+        <w:rPr>
+          <w:rFonts w:ascii="Noto Serif" w:eastAsia="Noto Serif SC" w:hAnsi="Noto Serif" w:cs="Noto Serif"/>
+          <w:sz w:val="24"/>
+          <w:szCs w:val="24"/>
+          <w:lang w:val="en-US"/>
+        </w:rPr>
+      </w:pPr>
+      <w:r>
+        <w:rPr>
+          <w:rFonts w:ascii="Noto Serif" w:eastAsia="Noto Serif SC" w:hAnsi="Noto Serif" w:cs="Noto Serif" w:hint="eastAsia"/>
+          <w:sz w:val="24"/>
+          <w:szCs w:val="24"/>
+          <w:lang w:val="en-US"/>
+        </w:rPr>
+        <w:t>低音加键唢吶</w:t>
+      </w:r>
+      <w:r>
+        <w:rPr>
+          <w:rFonts w:ascii="Noto Serif" w:eastAsia="Noto Serif SC" w:hAnsi="Noto Serif" w:cs="Noto Serif"/>
+          <w:sz w:val="24"/>
+          <w:szCs w:val="24"/>
+          <w:lang w:val="en-US"/>
+        </w:rPr>
+        <w:t xml:space="preserve"> (Diyin </w:t>
+      </w:r>
+      <w:proofErr w:type="spellStart"/>
+      <w:r>
+        <w:rPr>
+          <w:rFonts w:ascii="Noto Serif" w:eastAsia="Noto Serif SC" w:hAnsi="Noto Serif" w:cs="Noto Serif"/>
+          <w:sz w:val="24"/>
+          <w:szCs w:val="24"/>
+          <w:lang w:val="en-US"/>
+        </w:rPr>
+        <w:t>Suona</w:t>
+      </w:r>
+      <w:proofErr w:type="spellEnd"/>
       <w:r>
         <w:rPr>
           <w:rFonts w:ascii="Noto Serif" w:eastAsia="Noto Serif SC" w:hAnsi="Noto Serif" w:cs="Noto Serif"/>
@@ -3216,70 +3373,268 @@
           <w:lang w:val="en-US"/>
         </w:rPr>
       </w:pPr>
-      <w:r>
-        <w:rPr>
-          <w:rFonts w:ascii="Noto Serif" w:eastAsia="Noto Serif SC" w:hAnsi="Noto Serif" w:cs="Noto Serif"/>
-          <w:sz w:val="24"/>
-          <w:szCs w:val="24"/>
-          <w:lang w:val="en-US"/>
-        </w:rPr>
-        <w:t>低音笙</w:t>
-      </w:r>
-      <w:r>
-        <w:rPr>
-          <w:rFonts w:ascii="Noto Serif" w:eastAsia="Noto Serif SC" w:hAnsi="Noto Serif" w:cs="Noto Serif"/>
-          <w:sz w:val="24"/>
-          <w:szCs w:val="24"/>
-          <w:lang w:val="en-US"/>
-        </w:rPr>
-        <w:t xml:space="preserve"> (Diyin Sheng)</w:t>
-      </w:r>
-    </w:p>
-    <w:p>
-      <w:pPr>
-        <w:jc w:val="right"/>
-        <w:rPr>
-          <w:rFonts w:ascii="Noto Serif" w:eastAsia="Noto Serif SC" w:hAnsi="Noto Serif" w:cs="Noto Serif"/>
-          <w:sz w:val="24"/>
-          <w:szCs w:val="24"/>
-          <w:lang w:val="en-US"/>
-        </w:rPr>
-      </w:pPr>
-    </w:p>
-    <w:p>
-      <w:pPr>
-        <w:jc w:val="right"/>
-        <w:rPr>
-          <w:rFonts w:ascii="Noto Serif" w:eastAsia="Noto Serif SC" w:hAnsi="Noto Serif" w:cs="Noto Serif"/>
-          <w:sz w:val="24"/>
-          <w:szCs w:val="24"/>
-          <w:lang w:val="en-US"/>
-        </w:rPr>
-      </w:pPr>
-      <w:r>
-        <w:rPr>
-          <w:rFonts w:ascii="Noto Serif" w:eastAsia="Noto Serif SC" w:hAnsi="Noto Serif" w:cs="Noto Serif"/>
-          <w:sz w:val="24"/>
-          <w:szCs w:val="24"/>
-          <w:lang w:val="en-US"/>
-        </w:rPr>
-        <w:t>高音加鍵嗩</w:t>
-      </w:r>
-      <w:r>
-        <w:rPr>
-          <w:rFonts w:ascii="Noto Serif" w:eastAsia="Noto Serif SC" w:hAnsi="Noto Serif" w:cs="Noto Serif"/>
-          <w:sz w:val="24"/>
-          <w:szCs w:val="24"/>
-          <w:lang w:val="en-US"/>
-        </w:rPr>
-        <w:t>吶</w:t>
-      </w:r>
-      <w:r>
-        <w:rPr>
-          <w:rFonts w:ascii="Noto Serif" w:eastAsia="Noto Serif SC" w:hAnsi="Noto Serif" w:cs="Noto Serif"/>
-          <w:sz w:val="24"/>
-          <w:szCs w:val="24"/>
-          <w:lang w:val="en-US"/>
+    </w:p>
+    <w:p>
+      <w:pPr>
+        <w:jc w:val="right"/>
+        <w:rPr>
+          <w:rFonts w:ascii="Noto Serif" w:eastAsia="Noto Serif SC" w:hAnsi="Noto Serif" w:cs="Noto Serif"/>
+          <w:sz w:val="24"/>
+          <w:szCs w:val="24"/>
+          <w:lang w:val="en-GB"/>
+        </w:rPr>
+      </w:pPr>
+      <w:r>
+        <w:rPr>
+          <w:rFonts w:ascii="Noto Serif" w:eastAsia="Noto Serif SC" w:hAnsi="Noto Serif" w:cs="Noto Serif" w:hint="eastAsia"/>
+          <w:sz w:val="24"/>
+          <w:szCs w:val="24"/>
+          <w:lang w:val="en-GB"/>
+        </w:rPr>
+        <w:t>中音加键管</w:t>
+      </w:r>
+      <w:r>
+        <w:rPr>
+          <w:rFonts w:ascii="Noto Serif" w:eastAsia="Noto Serif SC" w:hAnsi="Noto Serif" w:cs="Noto Serif"/>
+          <w:sz w:val="24"/>
+          <w:szCs w:val="24"/>
+          <w:lang w:val="en-GB"/>
+        </w:rPr>
+        <w:t xml:space="preserve"> (</w:t>
+      </w:r>
+      <w:proofErr w:type="spellStart"/>
+      <w:r>
+        <w:rPr>
+          <w:rFonts w:ascii="Noto Serif" w:eastAsia="Noto Serif SC" w:hAnsi="Noto Serif" w:cs="Noto Serif"/>
+          <w:sz w:val="24"/>
+          <w:szCs w:val="24"/>
+          <w:lang w:val="en-GB"/>
+        </w:rPr>
+        <w:t>Zhongyin</w:t>
+      </w:r>
+      <w:proofErr w:type="spellEnd"/>
+      <w:r>
+        <w:rPr>
+          <w:rFonts w:ascii="Noto Serif" w:eastAsia="Noto Serif SC" w:hAnsi="Noto Serif" w:cs="Noto Serif"/>
+          <w:sz w:val="24"/>
+          <w:szCs w:val="24"/>
+          <w:lang w:val="en-GB"/>
+        </w:rPr>
+        <w:t xml:space="preserve"> </w:t>
+      </w:r>
+      <w:proofErr w:type="spellStart"/>
+      <w:r>
+        <w:rPr>
+          <w:rFonts w:ascii="Noto Serif" w:eastAsia="Noto Serif SC" w:hAnsi="Noto Serif" w:cs="Noto Serif"/>
+          <w:sz w:val="24"/>
+          <w:szCs w:val="24"/>
+          <w:lang w:val="en-GB"/>
+        </w:rPr>
+        <w:t>Jiajian</w:t>
+      </w:r>
+      <w:proofErr w:type="spellEnd"/>
+      <w:r>
+        <w:rPr>
+          <w:rFonts w:ascii="Noto Serif" w:eastAsia="Noto Serif SC" w:hAnsi="Noto Serif" w:cs="Noto Serif"/>
+          <w:sz w:val="24"/>
+          <w:szCs w:val="24"/>
+          <w:lang w:val="en-GB"/>
+        </w:rPr>
+        <w:t xml:space="preserve"> Guan)</w:t>
+      </w:r>
+    </w:p>
+    <w:p>
+      <w:pPr>
+        <w:jc w:val="right"/>
+        <w:rPr>
+          <w:rFonts w:ascii="Noto Serif" w:eastAsia="Noto Serif SC" w:hAnsi="Noto Serif" w:cs="Noto Serif"/>
+          <w:sz w:val="24"/>
+          <w:szCs w:val="24"/>
+          <w:lang w:val="en-GB"/>
+        </w:rPr>
+      </w:pPr>
+      <w:r>
+        <w:rPr>
+          <w:rFonts w:ascii="Noto Serif" w:eastAsia="Noto Serif SC" w:hAnsi="Noto Serif" w:cs="Noto Serif" w:hint="eastAsia"/>
+          <w:sz w:val="24"/>
+          <w:szCs w:val="24"/>
+          <w:lang w:val="en-GB"/>
+        </w:rPr>
+        <w:t>低音加键管</w:t>
+      </w:r>
+      <w:r>
+        <w:rPr>
+          <w:rFonts w:ascii="Noto Serif" w:eastAsia="Noto Serif SC" w:hAnsi="Noto Serif" w:cs="Noto Serif"/>
+          <w:sz w:val="24"/>
+          <w:szCs w:val="24"/>
+          <w:lang w:val="en-GB"/>
+        </w:rPr>
+        <w:t xml:space="preserve"> (Diyin </w:t>
+      </w:r>
+      <w:proofErr w:type="spellStart"/>
+      <w:r>
+        <w:rPr>
+          <w:rFonts w:ascii="Noto Serif" w:eastAsia="Noto Serif SC" w:hAnsi="Noto Serif" w:cs="Noto Serif"/>
+          <w:sz w:val="24"/>
+          <w:szCs w:val="24"/>
+          <w:lang w:val="en-GB"/>
+        </w:rPr>
+        <w:t>Jiajian</w:t>
+      </w:r>
+      <w:proofErr w:type="spellEnd"/>
+      <w:r>
+        <w:rPr>
+          <w:rFonts w:ascii="Noto Serif" w:eastAsia="Noto Serif SC" w:hAnsi="Noto Serif" w:cs="Noto Serif"/>
+          <w:sz w:val="24"/>
+          <w:szCs w:val="24"/>
+          <w:lang w:val="en-GB"/>
+        </w:rPr>
+        <w:t xml:space="preserve"> Guan)</w:t>
+      </w:r>
+    </w:p>
+    <w:p>
+      <w:pPr>
+        <w:jc w:val="right"/>
+        <w:rPr>
+          <w:rFonts w:ascii="Noto Serif" w:eastAsia="Noto Serif SC" w:hAnsi="Noto Serif" w:cs="Noto Serif"/>
+          <w:sz w:val="24"/>
+          <w:szCs w:val="24"/>
+          <w:lang w:val="en-US"/>
+        </w:rPr>
+      </w:pPr>
+      <w:r>
+        <w:rPr>
+          <w:rFonts w:ascii="Noto Serif" w:eastAsia="Noto Serif SC" w:hAnsi="Noto Serif" w:cs="Noto Serif" w:hint="eastAsia"/>
+          <w:sz w:val="24"/>
+          <w:szCs w:val="24"/>
+          <w:lang w:val="en-GB"/>
+        </w:rPr>
+        <w:t>倍低音加键管</w:t>
+      </w:r>
+      <w:r>
+        <w:rPr>
+          <w:rFonts w:ascii="Noto Serif" w:eastAsia="Noto Serif SC" w:hAnsi="Noto Serif" w:cs="Noto Serif"/>
+          <w:sz w:val="24"/>
+          <w:szCs w:val="24"/>
+          <w:lang w:val="en-GB"/>
+        </w:rPr>
+        <w:t xml:space="preserve"> (Bei Diyin </w:t>
+      </w:r>
+      <w:proofErr w:type="spellStart"/>
+      <w:r>
+        <w:rPr>
+          <w:rFonts w:ascii="Noto Serif" w:eastAsia="Noto Serif SC" w:hAnsi="Noto Serif" w:cs="Noto Serif"/>
+          <w:sz w:val="24"/>
+          <w:szCs w:val="24"/>
+          <w:lang w:val="en-GB"/>
+        </w:rPr>
+        <w:t>Jiajian</w:t>
+      </w:r>
+      <w:proofErr w:type="spellEnd"/>
+      <w:r>
+        <w:rPr>
+          <w:rFonts w:ascii="Noto Serif" w:eastAsia="Noto Serif SC" w:hAnsi="Noto Serif" w:cs="Noto Serif"/>
+          <w:sz w:val="24"/>
+          <w:szCs w:val="24"/>
+          <w:lang w:val="en-GB"/>
+        </w:rPr>
+        <w:t xml:space="preserve"> Guan)</w:t>
+      </w:r>
+    </w:p>
+    <w:p>
+      <w:pPr>
+        <w:jc w:val="right"/>
+        <w:rPr>
+          <w:rFonts w:ascii="Noto Serif" w:eastAsia="Noto Serif SC" w:hAnsi="Noto Serif" w:cs="Noto Serif"/>
+          <w:sz w:val="24"/>
+          <w:szCs w:val="24"/>
+          <w:lang w:val="en-US"/>
+        </w:rPr>
+      </w:pPr>
+    </w:p>
+    <w:p>
+      <w:pPr>
+        <w:jc w:val="right"/>
+        <w:rPr>
+          <w:rFonts w:ascii="Noto Serif" w:eastAsia="Noto Serif SC" w:hAnsi="Noto Serif" w:cs="Noto Serif"/>
+          <w:sz w:val="24"/>
+          <w:szCs w:val="24"/>
+          <w:lang w:val="en-US"/>
+        </w:rPr>
+      </w:pPr>
+      <w:r>
+        <w:rPr>
+          <w:rFonts w:ascii="Noto Serif" w:eastAsia="Noto Serif SC" w:hAnsi="Noto Serif" w:cs="Noto Serif" w:hint="eastAsia"/>
+          <w:sz w:val="24"/>
+          <w:szCs w:val="24"/>
+          <w:lang w:val="en-US"/>
+        </w:rPr>
+        <w:t>扬琴</w:t>
+      </w:r>
+      <w:r>
+        <w:rPr>
+          <w:rFonts w:ascii="Noto Serif" w:eastAsia="Noto Serif SC" w:hAnsi="Noto Serif" w:cs="Noto Serif"/>
+          <w:sz w:val="24"/>
+          <w:szCs w:val="24"/>
+          <w:lang w:val="en-US"/>
+        </w:rPr>
+        <w:t xml:space="preserve"> I, II (Yangqin I, II)</w:t>
+      </w:r>
+    </w:p>
+    <w:p>
+      <w:pPr>
+        <w:jc w:val="right"/>
+        <w:rPr>
+          <w:rFonts w:ascii="Noto Serif" w:eastAsia="Noto Serif SC" w:hAnsi="Noto Serif" w:cs="Noto Serif"/>
+          <w:sz w:val="24"/>
+          <w:szCs w:val="24"/>
+          <w:lang w:val="en-US"/>
+        </w:rPr>
+      </w:pPr>
+      <w:r>
+        <w:rPr>
+          <w:rFonts w:ascii="Noto Serif" w:eastAsia="Noto Serif SC" w:hAnsi="Noto Serif" w:cs="Noto Serif" w:hint="eastAsia"/>
+          <w:sz w:val="24"/>
+          <w:szCs w:val="24"/>
+          <w:lang w:val="en-US"/>
+        </w:rPr>
+        <w:t>琵琶</w:t>
+      </w:r>
+      <w:r>
+        <w:rPr>
+          <w:rFonts w:ascii="Noto Serif" w:eastAsia="Noto Serif SC" w:hAnsi="Noto Serif" w:cs="Noto Serif"/>
+          <w:sz w:val="24"/>
+          <w:szCs w:val="24"/>
+          <w:lang w:val="en-US"/>
+        </w:rPr>
+        <w:t xml:space="preserve"> I-IV (Pipa I-IV)</w:t>
+      </w:r>
+    </w:p>
+    <w:p>
+      <w:pPr>
+        <w:jc w:val="right"/>
+        <w:rPr>
+          <w:rFonts w:ascii="Noto Serif" w:eastAsia="Noto Serif SC" w:hAnsi="Noto Serif" w:cs="Noto Serif"/>
+          <w:sz w:val="24"/>
+          <w:szCs w:val="24"/>
+          <w:lang w:val="en-US"/>
+        </w:rPr>
+      </w:pPr>
+      <w:r>
+        <w:rPr>
+          <w:rFonts w:ascii="Noto Serif" w:eastAsia="Noto Serif SC" w:hAnsi="Noto Serif" w:cs="Noto Serif" w:hint="eastAsia"/>
+          <w:sz w:val="24"/>
+          <w:szCs w:val="24"/>
+          <w:lang w:val="en-GB"/>
+        </w:rPr>
+        <w:t>高音阮</w:t>
+      </w:r>
+      <w:r>
+        <w:rPr>
+          <w:rFonts w:ascii="Noto Serif" w:eastAsia="Noto Serif SC" w:hAnsi="Noto Serif" w:cs="Noto Serif"/>
+          <w:sz w:val="24"/>
+          <w:szCs w:val="24"/>
+          <w:lang w:val="en-GB"/>
         </w:rPr>
         <w:t xml:space="preserve"> I, II (</w:t>
       </w:r>
@@ -3289,7 +3644,7 @@
           <w:rFonts w:ascii="Noto Serif" w:eastAsia="Noto Serif SC" w:hAnsi="Noto Serif" w:cs="Noto Serif"/>
           <w:sz w:val="24"/>
           <w:szCs w:val="24"/>
-          <w:lang w:val="en-US"/>
+          <w:lang w:val="en-GB"/>
         </w:rPr>
         <w:t>Gaoyin</w:t>
       </w:r>
@@ -3299,7 +3654,195 @@
           <w:rFonts w:ascii="Noto Serif" w:eastAsia="Noto Serif SC" w:hAnsi="Noto Serif" w:cs="Noto Serif"/>
           <w:sz w:val="24"/>
           <w:szCs w:val="24"/>
-          <w:lang w:val="en-US"/>
+          <w:lang w:val="en-GB"/>
+        </w:rPr>
+        <w:t xml:space="preserve"> Ruan I, II)</w:t>
+      </w:r>
+    </w:p>
+    <w:p>
+      <w:pPr>
+        <w:jc w:val="right"/>
+        <w:rPr>
+          <w:rFonts w:ascii="Noto Serif" w:eastAsia="Noto Serif SC" w:hAnsi="Noto Serif" w:cs="Noto Serif"/>
+          <w:sz w:val="24"/>
+          <w:szCs w:val="24"/>
+          <w:lang w:val="en-US"/>
+        </w:rPr>
+      </w:pPr>
+      <w:r>
+        <w:rPr>
+          <w:rFonts w:ascii="Noto Serif" w:eastAsia="Noto Serif SC" w:hAnsi="Noto Serif" w:cs="Noto Serif" w:hint="eastAsia"/>
+          <w:sz w:val="24"/>
+          <w:szCs w:val="24"/>
+          <w:lang w:val="en-US"/>
+        </w:rPr>
+        <w:t>中阮</w:t>
+      </w:r>
+      <w:r>
+        <w:rPr>
+          <w:rFonts w:ascii="Noto Serif" w:eastAsia="Noto Serif SC" w:hAnsi="Noto Serif" w:cs="Noto Serif"/>
+          <w:sz w:val="24"/>
+          <w:szCs w:val="24"/>
+          <w:lang w:val="en-US"/>
+        </w:rPr>
+        <w:t xml:space="preserve"> I-VI (Zhongruan I-VI)</w:t>
+      </w:r>
+    </w:p>
+    <w:p>
+      <w:pPr>
+        <w:jc w:val="right"/>
+        <w:rPr>
+          <w:rFonts w:ascii="Noto Serif" w:eastAsia="Noto Serif SC" w:hAnsi="Noto Serif" w:cs="Noto Serif"/>
+          <w:sz w:val="24"/>
+          <w:szCs w:val="24"/>
+          <w:lang w:val="en-US"/>
+        </w:rPr>
+      </w:pPr>
+      <w:r>
+        <w:rPr>
+          <w:rFonts w:ascii="Noto Serif" w:eastAsia="Noto Serif SC" w:hAnsi="Noto Serif" w:cs="Noto Serif" w:hint="eastAsia"/>
+          <w:sz w:val="24"/>
+          <w:szCs w:val="24"/>
+          <w:lang w:val="en-US"/>
+        </w:rPr>
+        <w:t>大阮</w:t>
+      </w:r>
+      <w:r>
+        <w:rPr>
+          <w:rFonts w:ascii="Noto Serif" w:eastAsia="Noto Serif SC" w:hAnsi="Noto Serif" w:cs="Noto Serif"/>
+          <w:sz w:val="24"/>
+          <w:szCs w:val="24"/>
+          <w:lang w:val="en-US"/>
+        </w:rPr>
+        <w:t xml:space="preserve"> I, II (Daruan I, II)</w:t>
+      </w:r>
+    </w:p>
+    <w:p>
+      <w:pPr>
+        <w:jc w:val="right"/>
+        <w:rPr>
+          <w:rFonts w:ascii="Noto Serif" w:eastAsia="Noto Serif SC" w:hAnsi="Noto Serif" w:cs="Noto Serif"/>
+          <w:sz w:val="24"/>
+          <w:szCs w:val="24"/>
+          <w:lang w:val="en-US"/>
+        </w:rPr>
+      </w:pPr>
+      <w:r>
+        <w:rPr>
+          <w:rFonts w:ascii="Noto Serif" w:eastAsia="Noto Serif SC" w:hAnsi="Noto Serif" w:cs="Noto Serif" w:hint="eastAsia"/>
+          <w:sz w:val="24"/>
+          <w:szCs w:val="24"/>
+          <w:lang w:val="en-US"/>
+        </w:rPr>
+        <w:t>古筝</w:t>
+      </w:r>
+      <w:r>
+        <w:rPr>
+          <w:rFonts w:ascii="Noto Serif" w:eastAsia="Noto Serif SC" w:hAnsi="Noto Serif" w:cs="Noto Serif"/>
+          <w:sz w:val="24"/>
+          <w:szCs w:val="24"/>
+          <w:lang w:val="en-US"/>
+        </w:rPr>
+        <w:t xml:space="preserve"> (Guzheng)</w:t>
+      </w:r>
+    </w:p>
+    <w:p>
+      <w:pPr>
+        <w:jc w:val="right"/>
+        <w:rPr>
+          <w:rFonts w:ascii="Noto Serif" w:eastAsia="Noto Serif SC" w:hAnsi="Noto Serif" w:cs="Noto Serif"/>
+          <w:sz w:val="24"/>
+          <w:szCs w:val="24"/>
+          <w:lang w:val="en-US"/>
+        </w:rPr>
+      </w:pPr>
+    </w:p>
+    <w:p>
+      <w:pPr>
+        <w:jc w:val="right"/>
+        <w:rPr>
+          <w:rFonts w:ascii="Noto Serif" w:eastAsia="Noto Serif SC" w:hAnsi="Noto Serif" w:cs="Noto Serif"/>
+          <w:sz w:val="24"/>
+          <w:szCs w:val="24"/>
+          <w:lang w:val="en-US"/>
+        </w:rPr>
+      </w:pPr>
+      <w:r>
+        <w:rPr>
+          <w:rFonts w:ascii="Noto Serif" w:eastAsia="Noto Serif SC" w:hAnsi="Noto Serif" w:cs="Noto Serif" w:hint="eastAsia"/>
+          <w:sz w:val="24"/>
+          <w:szCs w:val="24"/>
+          <w:lang w:val="en-US"/>
+        </w:rPr>
+        <w:t>定音鼓</w:t>
+      </w:r>
+      <w:r>
+        <w:rPr>
+          <w:rFonts w:ascii="Noto Serif" w:eastAsia="Noto Serif SC" w:hAnsi="Noto Serif" w:cs="Noto Serif"/>
+          <w:sz w:val="24"/>
+          <w:szCs w:val="24"/>
+          <w:lang w:val="en-US"/>
+        </w:rPr>
+        <w:t xml:space="preserve"> (Timpani)</w:t>
+      </w:r>
+    </w:p>
+    <w:p>
+      <w:pPr>
+        <w:jc w:val="right"/>
+        <w:rPr>
+          <w:rFonts w:ascii="Noto Serif" w:eastAsia="Noto Serif SC" w:hAnsi="Noto Serif" w:cs="Noto Serif"/>
+          <w:sz w:val="21"/>
+          <w:szCs w:val="21"/>
+          <w:lang w:val="en-US"/>
+        </w:rPr>
+      </w:pPr>
+      <w:r>
+        <w:rPr>
+          <w:rFonts w:ascii="Noto Serif" w:eastAsia="Noto Serif SC" w:hAnsi="Noto Serif" w:cs="Noto Serif" w:hint="eastAsia"/>
+          <w:sz w:val="21"/>
+          <w:szCs w:val="21"/>
+          <w:lang w:val="en-US"/>
+        </w:rPr>
+        <w:t>打击乐</w:t>
+      </w:r>
+      <w:r>
+        <w:rPr>
+          <w:rFonts w:ascii="Noto Serif" w:eastAsia="Noto Serif SC" w:hAnsi="Noto Serif" w:cs="Noto Serif"/>
+          <w:sz w:val="21"/>
+          <w:szCs w:val="21"/>
+          <w:lang w:val="en-US"/>
+        </w:rPr>
+        <w:t xml:space="preserve"> I (Percussion I): </w:t>
+      </w:r>
+      <w:r>
+        <w:rPr>
+          <w:rFonts w:ascii="Noto Serif" w:eastAsia="Noto Serif SC" w:hAnsi="Noto Serif" w:cs="Noto Serif" w:hint="eastAsia"/>
+          <w:sz w:val="21"/>
+          <w:szCs w:val="21"/>
+        </w:rPr>
+        <w:t>管钟</w:t>
+      </w:r>
+      <w:r>
+        <w:rPr>
+          <w:rFonts w:ascii="Noto Serif" w:eastAsia="Noto Serif SC" w:hAnsi="Noto Serif" w:cs="Noto Serif"/>
+          <w:sz w:val="21"/>
+          <w:szCs w:val="21"/>
+        </w:rPr>
+        <w:t xml:space="preserve"> Tubular bells, </w:t>
+      </w:r>
+      <w:r>
+        <w:rPr>
+          <w:rFonts w:ascii="Noto Serif" w:eastAsia="Noto Serif SC" w:hAnsi="Noto Serif" w:cs="Noto Serif" w:hint="eastAsia"/>
+          <w:sz w:val="21"/>
+          <w:szCs w:val="21"/>
+        </w:rPr>
+        <w:t>风锣</w:t>
+      </w:r>
+      <w:r>
+        <w:rPr>
+          <w:rFonts w:ascii="Noto Serif" w:eastAsia="Noto Serif SC" w:hAnsi="Noto Serif" w:cs="Noto Serif"/>
+          <w:sz w:val="21"/>
+          <w:szCs w:val="21"/>
         </w:rPr>
         <w:t xml:space="preserve"> </w:t>
       </w:r>
@@ -3307,1701 +3850,855 @@
       <w:r>
         <w:rPr>
           <w:rFonts w:ascii="Noto Serif" w:eastAsia="Noto Serif SC" w:hAnsi="Noto Serif" w:cs="Noto Serif"/>
-          <w:sz w:val="24"/>
-          <w:szCs w:val="24"/>
-          <w:lang w:val="en-US"/>
-        </w:rPr>
-        <w:t>Suona</w:t>
+          <w:sz w:val="21"/>
+          <w:szCs w:val="21"/>
+        </w:rPr>
+        <w:t>Fengluo</w:t>
       </w:r>
       <w:proofErr w:type="spellEnd"/>
       <w:r>
         <w:rPr>
           <w:rFonts w:ascii="Noto Serif" w:eastAsia="Noto Serif SC" w:hAnsi="Noto Serif" w:cs="Noto Serif"/>
-          <w:sz w:val="24"/>
-          <w:szCs w:val="24"/>
-          <w:lang w:val="en-US"/>
-        </w:rPr>
-        <w:t xml:space="preserve"> I, II)</w:t>
-      </w:r>
-    </w:p>
-    <w:p>
-      <w:pPr>
-        <w:jc w:val="right"/>
-        <w:rPr>
-          <w:rFonts w:ascii="Noto Serif" w:eastAsia="Noto Serif SC" w:hAnsi="Noto Serif" w:cs="Noto Serif"/>
-          <w:sz w:val="24"/>
-          <w:szCs w:val="24"/>
-          <w:lang w:val="en-US"/>
-        </w:rPr>
-      </w:pPr>
-      <w:r>
-        <w:rPr>
-          <w:rFonts w:ascii="Noto Serif" w:eastAsia="Noto Serif SC" w:hAnsi="Noto Serif" w:cs="Noto Serif"/>
-          <w:sz w:val="24"/>
-          <w:szCs w:val="24"/>
-          <w:lang w:val="en-US"/>
-        </w:rPr>
-        <w:t>中音加鍵</w:t>
-      </w:r>
-      <w:r>
-        <w:rPr>
-          <w:rFonts w:ascii="Noto Serif" w:eastAsia="Noto Serif SC" w:hAnsi="Noto Serif" w:cs="Noto Serif"/>
-          <w:sz w:val="24"/>
-          <w:szCs w:val="24"/>
-          <w:lang w:val="en-US"/>
-        </w:rPr>
-        <w:t>嗩吶</w:t>
-      </w:r>
-      <w:r>
-        <w:rPr>
-          <w:rFonts w:ascii="Noto Serif" w:eastAsia="Noto Serif SC" w:hAnsi="Noto Serif" w:cs="Noto Serif"/>
-          <w:sz w:val="24"/>
-          <w:szCs w:val="24"/>
-          <w:lang w:val="en-US"/>
-        </w:rPr>
-        <w:t xml:space="preserve"> I, II</w:t>
-      </w:r>
-      <w:r>
-        <w:rPr>
-          <w:rFonts w:ascii="Noto Serif" w:eastAsia="Noto Serif SC" w:hAnsi="Noto Serif" w:cs="Noto Serif"/>
-          <w:sz w:val="24"/>
-          <w:szCs w:val="24"/>
-          <w:lang w:val="en-US"/>
-        </w:rPr>
-        <w:t xml:space="preserve"> (</w:t>
+          <w:sz w:val="21"/>
+          <w:szCs w:val="21"/>
+        </w:rPr>
+        <w:t xml:space="preserve">, </w:t>
+      </w:r>
+      <w:r>
+        <w:rPr>
+          <w:rFonts w:ascii="Noto Serif" w:eastAsia="Noto Serif SC" w:hAnsi="Noto Serif" w:cs="Noto Serif" w:hint="eastAsia"/>
+          <w:sz w:val="21"/>
+          <w:szCs w:val="21"/>
+        </w:rPr>
+        <w:t>木琴</w:t>
+      </w:r>
+      <w:r>
+        <w:rPr>
+          <w:rFonts w:ascii="Noto Serif" w:eastAsia="Noto Serif SC" w:hAnsi="Noto Serif" w:cs="Noto Serif"/>
+          <w:sz w:val="21"/>
+          <w:szCs w:val="21"/>
+        </w:rPr>
+        <w:t xml:space="preserve"> Xylophone, </w:t>
+      </w:r>
+      <w:r>
+        <w:rPr>
+          <w:rFonts w:ascii="Noto Serif" w:eastAsia="Noto Serif SC" w:hAnsi="Noto Serif" w:cs="Noto Serif" w:hint="eastAsia"/>
+          <w:sz w:val="21"/>
+          <w:szCs w:val="21"/>
+        </w:rPr>
+        <w:t>颤音琴</w:t>
+      </w:r>
+      <w:r>
+        <w:rPr>
+          <w:rFonts w:ascii="Noto Serif" w:eastAsia="Noto Serif SC" w:hAnsi="Noto Serif" w:cs="Noto Serif"/>
+          <w:sz w:val="21"/>
+          <w:szCs w:val="21"/>
+        </w:rPr>
+        <w:t xml:space="preserve"> Vibraphone</w:t>
+      </w:r>
+    </w:p>
+    <w:p>
+      <w:pPr>
+        <w:jc w:val="right"/>
+        <w:rPr>
+          <w:rFonts w:ascii="Noto Serif" w:eastAsia="Noto Serif SC" w:hAnsi="Noto Serif" w:cs="Noto Serif"/>
+          <w:sz w:val="21"/>
+          <w:szCs w:val="21"/>
+          <w:lang w:val="en-US"/>
+        </w:rPr>
+      </w:pPr>
+      <w:r>
+        <w:rPr>
+          <w:rFonts w:ascii="Noto Serif" w:eastAsia="Noto Serif SC" w:hAnsi="Noto Serif" w:cs="Noto Serif" w:hint="eastAsia"/>
+          <w:sz w:val="21"/>
+          <w:szCs w:val="21"/>
+          <w:lang w:val="en-US"/>
+        </w:rPr>
+        <w:t>打击乐</w:t>
+      </w:r>
+      <w:r>
+        <w:rPr>
+          <w:rFonts w:ascii="Noto Serif" w:eastAsia="Noto Serif SC" w:hAnsi="Noto Serif" w:cs="Noto Serif"/>
+          <w:sz w:val="21"/>
+          <w:szCs w:val="21"/>
+          <w:lang w:val="en-US"/>
+        </w:rPr>
+        <w:t xml:space="preserve"> II (Percussion II): </w:t>
+      </w:r>
+      <w:r>
+        <w:rPr>
+          <w:rFonts w:ascii="Noto Serif" w:eastAsia="Noto Serif SC" w:hAnsi="Noto Serif" w:cs="Noto Serif" w:hint="eastAsia"/>
+          <w:sz w:val="21"/>
+          <w:szCs w:val="21"/>
+        </w:rPr>
+        <w:t>云锣</w:t>
+      </w:r>
+      <w:r>
+        <w:rPr>
+          <w:rFonts w:ascii="Noto Serif" w:eastAsia="Noto Serif SC" w:hAnsi="Noto Serif" w:cs="Noto Serif"/>
+          <w:sz w:val="21"/>
+          <w:szCs w:val="21"/>
+        </w:rPr>
+        <w:t xml:space="preserve"> Yunluo, </w:t>
+      </w:r>
+      <w:r>
+        <w:rPr>
+          <w:rFonts w:ascii="Noto Serif" w:eastAsia="Noto Serif SC" w:hAnsi="Noto Serif" w:cs="Noto Serif" w:hint="eastAsia"/>
+          <w:sz w:val="21"/>
+          <w:szCs w:val="21"/>
+        </w:rPr>
+        <w:t>颤音琴</w:t>
+      </w:r>
+      <w:r>
+        <w:rPr>
+          <w:rFonts w:ascii="Noto Serif" w:eastAsia="Noto Serif SC" w:hAnsi="Noto Serif" w:cs="Noto Serif"/>
+          <w:sz w:val="21"/>
+          <w:szCs w:val="21"/>
+        </w:rPr>
+        <w:t xml:space="preserve"> Vibraphone</w:t>
+      </w:r>
+    </w:p>
+    <w:p>
+      <w:pPr>
+        <w:jc w:val="right"/>
+        <w:rPr>
+          <w:rFonts w:ascii="Noto Serif" w:eastAsia="Noto Serif SC" w:hAnsi="Noto Serif" w:cs="Noto Serif"/>
+          <w:sz w:val="21"/>
+          <w:szCs w:val="21"/>
+        </w:rPr>
+      </w:pPr>
+      <w:r>
+        <w:rPr>
+          <w:rFonts w:ascii="Noto Serif" w:eastAsia="Noto Serif SC" w:hAnsi="Noto Serif" w:cs="Noto Serif" w:hint="eastAsia"/>
+          <w:sz w:val="21"/>
+          <w:szCs w:val="21"/>
+          <w:lang w:val="en-US"/>
+        </w:rPr>
+        <w:t>打击乐</w:t>
+      </w:r>
+      <w:r>
+        <w:rPr>
+          <w:rFonts w:ascii="Noto Serif" w:eastAsia="Noto Serif SC" w:hAnsi="Noto Serif" w:cs="Noto Serif"/>
+          <w:sz w:val="21"/>
+          <w:szCs w:val="21"/>
+          <w:lang w:val="en-US"/>
+        </w:rPr>
+        <w:t xml:space="preserve"> III (Percussion III): </w:t>
+      </w:r>
+      <w:r>
+        <w:rPr>
+          <w:rFonts w:ascii="Noto Serif" w:eastAsia="Noto Serif SC" w:hAnsi="Noto Serif" w:cs="Noto Serif" w:hint="eastAsia"/>
+          <w:sz w:val="21"/>
+          <w:szCs w:val="21"/>
+        </w:rPr>
+        <w:t>大堂鼓</w:t>
+      </w:r>
+      <w:r>
+        <w:rPr>
+          <w:rFonts w:ascii="Noto Serif" w:eastAsia="Noto Serif SC" w:hAnsi="Noto Serif" w:cs="Noto Serif"/>
+          <w:sz w:val="21"/>
+          <w:szCs w:val="21"/>
+        </w:rPr>
+        <w:t xml:space="preserve"> Da </w:t>
       </w:r>
       <w:proofErr w:type="spellStart"/>
       <w:r>
         <w:rPr>
           <w:rFonts w:ascii="Noto Serif" w:eastAsia="Noto Serif SC" w:hAnsi="Noto Serif" w:cs="Noto Serif"/>
-          <w:sz w:val="24"/>
-          <w:szCs w:val="24"/>
-          <w:lang w:val="en-US"/>
-        </w:rPr>
-        <w:t>Zhongyin</w:t>
+          <w:sz w:val="21"/>
+          <w:szCs w:val="21"/>
+        </w:rPr>
+        <w:t>Tanggu</w:t>
       </w:r>
       <w:proofErr w:type="spellEnd"/>
       <w:r>
         <w:rPr>
           <w:rFonts w:ascii="Noto Serif" w:eastAsia="Noto Serif SC" w:hAnsi="Noto Serif" w:cs="Noto Serif"/>
-          <w:sz w:val="24"/>
-          <w:szCs w:val="24"/>
-          <w:lang w:val="en-US"/>
+          <w:sz w:val="21"/>
+          <w:szCs w:val="21"/>
+        </w:rPr>
+        <w:t xml:space="preserve">, </w:t>
+      </w:r>
+      <w:r>
+        <w:rPr>
+          <w:rFonts w:ascii="Noto Serif" w:eastAsia="Noto Serif SC" w:hAnsi="Noto Serif" w:cs="Noto Serif" w:hint="eastAsia"/>
+          <w:sz w:val="21"/>
+          <w:szCs w:val="21"/>
+        </w:rPr>
+        <w:t>大小</w:t>
+      </w:r>
+      <w:r>
+        <w:rPr>
+          <w:rFonts w:ascii="Noto Serif" w:eastAsia="Noto Serif SC" w:hAnsi="Noto Serif" w:cs="Noto Serif"/>
+          <w:sz w:val="21"/>
+          <w:szCs w:val="21"/>
+        </w:rPr>
+        <w:t xml:space="preserve"> Flexatone, </w:t>
+      </w:r>
+      <w:r>
+        <w:rPr>
+          <w:rFonts w:ascii="Noto Serif" w:eastAsia="Noto Serif SC" w:hAnsi="Noto Serif" w:cs="Noto Serif" w:hint="eastAsia"/>
+          <w:sz w:val="21"/>
+          <w:szCs w:val="21"/>
+        </w:rPr>
+        <w:t>小风铃</w:t>
+      </w:r>
+      <w:r>
+        <w:rPr>
+          <w:rFonts w:ascii="Noto Serif" w:eastAsia="Noto Serif SC" w:hAnsi="Noto Serif" w:cs="Noto Serif"/>
+          <w:sz w:val="21"/>
+          <w:szCs w:val="21"/>
+        </w:rPr>
+        <w:t xml:space="preserve"> Small Windchimes</w:t>
+      </w:r>
+    </w:p>
+    <w:p>
+      <w:pPr>
+        <w:jc w:val="right"/>
+        <w:rPr>
+          <w:rFonts w:ascii="Noto Serif" w:eastAsia="Noto Serif SC" w:hAnsi="Noto Serif" w:cs="Noto Serif"/>
+          <w:sz w:val="21"/>
+          <w:szCs w:val="21"/>
+          <w:lang w:val="en-US"/>
+        </w:rPr>
+      </w:pPr>
+      <w:r>
+        <w:rPr>
+          <w:rFonts w:ascii="Noto Serif" w:eastAsia="Noto Serif SC" w:hAnsi="Noto Serif" w:cs="Noto Serif" w:hint="eastAsia"/>
+          <w:sz w:val="21"/>
+          <w:szCs w:val="21"/>
+          <w:lang w:val="en-US"/>
+        </w:rPr>
+        <w:t>打击乐</w:t>
+      </w:r>
+      <w:r>
+        <w:rPr>
+          <w:rFonts w:ascii="Noto Serif" w:eastAsia="Noto Serif SC" w:hAnsi="Noto Serif" w:cs="Noto Serif"/>
+          <w:sz w:val="21"/>
+          <w:szCs w:val="21"/>
+          <w:lang w:val="en-US"/>
+        </w:rPr>
+        <w:t xml:space="preserve"> IV (Percussion IV): </w:t>
+      </w:r>
+      <w:r>
+        <w:rPr>
+          <w:rFonts w:ascii="Noto Serif" w:eastAsia="Noto Serif SC" w:hAnsi="Noto Serif" w:cs="Noto Serif" w:hint="eastAsia"/>
+          <w:sz w:val="21"/>
+          <w:szCs w:val="21"/>
+        </w:rPr>
+        <w:t>吊钹</w:t>
+      </w:r>
+      <w:r>
+        <w:rPr>
+          <w:rFonts w:ascii="Noto Serif" w:eastAsia="Noto Serif SC" w:hAnsi="Noto Serif" w:cs="Noto Serif"/>
+          <w:sz w:val="21"/>
+          <w:szCs w:val="21"/>
+        </w:rPr>
+        <w:t xml:space="preserve"> Suspended Cymbals, </w:t>
+      </w:r>
+      <w:r>
+        <w:rPr>
+          <w:rFonts w:ascii="Noto Serif" w:eastAsia="Noto Serif SC" w:hAnsi="Noto Serif" w:cs="Noto Serif" w:hint="eastAsia"/>
+          <w:sz w:val="21"/>
+          <w:szCs w:val="21"/>
+        </w:rPr>
+        <w:t>大小拍颤器</w:t>
+      </w:r>
+      <w:r>
+        <w:rPr>
+          <w:rFonts w:ascii="Noto Serif" w:eastAsia="Noto Serif SC" w:hAnsi="Noto Serif" w:cs="Noto Serif"/>
+          <w:sz w:val="21"/>
+          <w:szCs w:val="21"/>
+        </w:rPr>
+        <w:t xml:space="preserve"> (Large &amp; Small Vibraslap), </w:t>
+      </w:r>
+      <w:r>
+        <w:rPr>
+          <w:rFonts w:ascii="Noto Serif" w:eastAsia="Noto Serif SC" w:hAnsi="Noto Serif" w:cs="Noto Serif" w:hint="eastAsia"/>
+          <w:sz w:val="21"/>
+          <w:szCs w:val="21"/>
+        </w:rPr>
+        <w:t>大堂鼓</w:t>
+      </w:r>
+      <w:r>
+        <w:rPr>
+          <w:rFonts w:ascii="Noto Serif" w:eastAsia="Noto Serif SC" w:hAnsi="Noto Serif" w:cs="Noto Serif"/>
+          <w:sz w:val="21"/>
+          <w:szCs w:val="21"/>
+        </w:rPr>
+        <w:t xml:space="preserve"> Da </w:t>
+      </w:r>
+      <w:proofErr w:type="spellStart"/>
+      <w:r>
+        <w:rPr>
+          <w:rFonts w:ascii="Noto Serif" w:eastAsia="Noto Serif SC" w:hAnsi="Noto Serif" w:cs="Noto Serif"/>
+          <w:sz w:val="21"/>
+          <w:szCs w:val="21"/>
+        </w:rPr>
+        <w:t>Tanggu</w:t>
+      </w:r>
+      <w:proofErr w:type="spellEnd"/>
+      <w:r>
+        <w:rPr>
+          <w:rFonts w:ascii="Noto Serif" w:eastAsia="Noto Serif SC" w:hAnsi="Noto Serif" w:cs="Noto Serif"/>
+          <w:sz w:val="21"/>
+          <w:szCs w:val="21"/>
+        </w:rPr>
+        <w:t xml:space="preserve">, </w:t>
+      </w:r>
+      <w:r>
+        <w:rPr>
+          <w:rFonts w:ascii="Noto Serif" w:eastAsia="Noto Serif SC" w:hAnsi="Noto Serif" w:cs="Noto Serif" w:hint="eastAsia"/>
+          <w:sz w:val="21"/>
+          <w:szCs w:val="21"/>
+        </w:rPr>
+        <w:t>小堂鼓</w:t>
+      </w:r>
+      <w:r>
+        <w:rPr>
+          <w:rFonts w:ascii="Noto Serif" w:eastAsia="Noto Serif SC" w:hAnsi="Noto Serif" w:cs="Noto Serif"/>
+          <w:sz w:val="21"/>
+          <w:szCs w:val="21"/>
+        </w:rPr>
+        <w:t xml:space="preserve"> Xiao </w:t>
+      </w:r>
+      <w:proofErr w:type="spellStart"/>
+      <w:r>
+        <w:rPr>
+          <w:rFonts w:ascii="Noto Serif" w:eastAsia="Noto Serif SC" w:hAnsi="Noto Serif" w:cs="Noto Serif"/>
+          <w:sz w:val="21"/>
+          <w:szCs w:val="21"/>
+        </w:rPr>
+        <w:t>Tanggu</w:t>
+      </w:r>
+      <w:proofErr w:type="spellEnd"/>
+    </w:p>
+    <w:p>
+      <w:pPr>
+        <w:jc w:val="right"/>
+        <w:rPr>
+          <w:rFonts w:ascii="Noto Serif" w:eastAsia="Noto Serif SC" w:hAnsi="Noto Serif" w:cs="Noto Serif"/>
+          <w:sz w:val="21"/>
+          <w:szCs w:val="21"/>
+          <w:lang w:val="en-GB"/>
+        </w:rPr>
+      </w:pPr>
+      <w:r>
+        <w:rPr>
+          <w:rFonts w:ascii="Noto Serif" w:eastAsia="Noto Serif SC" w:hAnsi="Noto Serif" w:cs="Noto Serif" w:hint="eastAsia"/>
+          <w:sz w:val="21"/>
+          <w:szCs w:val="21"/>
+          <w:lang w:val="en-US"/>
+        </w:rPr>
+        <w:t>打击乐</w:t>
+      </w:r>
+      <w:r>
+        <w:rPr>
+          <w:rFonts w:ascii="Noto Serif" w:eastAsia="Noto Serif SC" w:hAnsi="Noto Serif" w:cs="Noto Serif"/>
+          <w:sz w:val="21"/>
+          <w:szCs w:val="21"/>
+          <w:lang w:val="en-US"/>
+        </w:rPr>
+        <w:t xml:space="preserve"> V (Percussion V): </w:t>
+      </w:r>
+      <w:r>
+        <w:rPr>
+          <w:rFonts w:ascii="Noto Serif" w:eastAsia="Noto Serif SC" w:hAnsi="Noto Serif" w:cs="Noto Serif" w:hint="eastAsia"/>
+          <w:sz w:val="21"/>
+          <w:szCs w:val="21"/>
+        </w:rPr>
+        <w:t>板鼓</w:t>
+      </w:r>
+      <w:r>
+        <w:rPr>
+          <w:rFonts w:ascii="Noto Serif" w:eastAsia="Noto Serif SC" w:hAnsi="Noto Serif" w:cs="Noto Serif"/>
+          <w:sz w:val="21"/>
+          <w:szCs w:val="21"/>
+        </w:rPr>
+        <w:t xml:space="preserve"> Bangu, </w:t>
+      </w:r>
+      <w:r>
+        <w:rPr>
+          <w:rFonts w:ascii="Noto Serif" w:eastAsia="Noto Serif SC" w:hAnsi="Noto Serif" w:cs="Noto Serif" w:hint="eastAsia"/>
+          <w:sz w:val="21"/>
+          <w:szCs w:val="21"/>
+        </w:rPr>
+        <w:t>弹簧鼓</w:t>
+      </w:r>
+      <w:r>
+        <w:rPr>
+          <w:rFonts w:ascii="Noto Serif" w:eastAsia="Noto Serif SC" w:hAnsi="Noto Serif" w:cs="Noto Serif"/>
+          <w:sz w:val="21"/>
+          <w:szCs w:val="21"/>
+          <w:lang w:val="en-GB"/>
         </w:rPr>
         <w:t xml:space="preserve"> </w:t>
       </w:r>
+      <w:r>
+        <w:rPr>
+          <w:rFonts w:ascii="Noto Serif" w:eastAsia="Noto Serif SC" w:hAnsi="Noto Serif" w:cs="Noto Serif"/>
+          <w:sz w:val="21"/>
+          <w:szCs w:val="21"/>
+        </w:rPr>
+        <w:t xml:space="preserve">Thunder tube, </w:t>
+      </w:r>
+      <w:r>
+        <w:rPr>
+          <w:rFonts w:ascii="Noto Serif" w:eastAsia="Noto Serif SC" w:hAnsi="Noto Serif" w:cs="Noto Serif" w:hint="eastAsia"/>
+          <w:sz w:val="21"/>
+          <w:szCs w:val="21"/>
+        </w:rPr>
+        <w:t>拍板</w:t>
+      </w:r>
+      <w:r>
+        <w:rPr>
+          <w:rFonts w:ascii="Noto Serif" w:eastAsia="Noto Serif SC" w:hAnsi="Noto Serif" w:cs="Noto Serif"/>
+          <w:sz w:val="21"/>
+          <w:szCs w:val="21"/>
+        </w:rPr>
+        <w:t xml:space="preserve"> Paiban, </w:t>
+      </w:r>
+      <w:r>
+        <w:rPr>
+          <w:rFonts w:ascii="Noto Serif" w:eastAsia="Noto Serif SC" w:hAnsi="Noto Serif" w:cs="Noto Serif" w:hint="eastAsia"/>
+          <w:sz w:val="21"/>
+          <w:szCs w:val="21"/>
+        </w:rPr>
+        <w:t>狮钹</w:t>
+      </w:r>
+      <w:r>
+        <w:rPr>
+          <w:rFonts w:ascii="Noto Serif" w:eastAsia="Noto Serif SC" w:hAnsi="Noto Serif" w:cs="Noto Serif"/>
+          <w:sz w:val="21"/>
+          <w:szCs w:val="21"/>
+        </w:rPr>
+        <w:t xml:space="preserve"> </w:t>
+      </w:r>
       <w:proofErr w:type="spellStart"/>
       <w:r>
         <w:rPr>
           <w:rFonts w:ascii="Noto Serif" w:eastAsia="Noto Serif SC" w:hAnsi="Noto Serif" w:cs="Noto Serif"/>
-          <w:sz w:val="24"/>
-          <w:szCs w:val="24"/>
-          <w:lang w:val="en-US"/>
-        </w:rPr>
-        <w:t>Suona</w:t>
+          <w:sz w:val="21"/>
+          <w:szCs w:val="21"/>
+        </w:rPr>
+        <w:t>Shibo</w:t>
       </w:r>
       <w:proofErr w:type="spellEnd"/>
       <w:r>
         <w:rPr>
           <w:rFonts w:ascii="Noto Serif" w:eastAsia="Noto Serif SC" w:hAnsi="Noto Serif" w:cs="Noto Serif"/>
-          <w:sz w:val="24"/>
-          <w:szCs w:val="24"/>
-          <w:lang w:val="en-US"/>
-        </w:rPr>
-        <w:t xml:space="preserve"> I, II</w:t>
-      </w:r>
-      <w:r>
-        <w:rPr>
-          <w:rFonts w:ascii="Noto Serif" w:eastAsia="Noto Serif SC" w:hAnsi="Noto Serif" w:cs="Noto Serif"/>
-          <w:sz w:val="24"/>
-          <w:szCs w:val="24"/>
-          <w:lang w:val="en-US"/>
-        </w:rPr>
-        <w:t>)</w:t>
-      </w:r>
-    </w:p>
-    <w:p>
-      <w:pPr>
-        <w:jc w:val="right"/>
-        <w:rPr>
-          <w:rFonts w:ascii="Noto Serif" w:eastAsia="Noto Serif SC" w:hAnsi="Noto Serif" w:cs="Noto Serif"/>
-          <w:sz w:val="24"/>
-          <w:szCs w:val="24"/>
-          <w:lang w:val="en-US"/>
-        </w:rPr>
-      </w:pPr>
-      <w:r>
-        <w:rPr>
-          <w:rFonts w:ascii="Noto Serif" w:eastAsia="Noto Serif SC" w:hAnsi="Noto Serif" w:cs="Noto Serif"/>
-          <w:sz w:val="24"/>
-          <w:szCs w:val="24"/>
-          <w:lang w:val="en-US"/>
-        </w:rPr>
-        <w:t>低音加鍵</w:t>
-      </w:r>
-      <w:r>
-        <w:rPr>
-          <w:rFonts w:ascii="Noto Serif" w:eastAsia="Noto Serif SC" w:hAnsi="Noto Serif" w:cs="Noto Serif"/>
-          <w:sz w:val="24"/>
-          <w:szCs w:val="24"/>
-          <w:lang w:val="en-US"/>
-        </w:rPr>
-        <w:t>嗩吶</w:t>
-      </w:r>
-      <w:r>
-        <w:rPr>
-          <w:rFonts w:ascii="Noto Serif" w:eastAsia="Noto Serif SC" w:hAnsi="Noto Serif" w:cs="Noto Serif"/>
-          <w:sz w:val="24"/>
-          <w:szCs w:val="24"/>
-          <w:lang w:val="en-US"/>
-        </w:rPr>
-        <w:t xml:space="preserve"> (Diyin </w:t>
+          <w:sz w:val="21"/>
+          <w:szCs w:val="21"/>
+        </w:rPr>
+        <w:t xml:space="preserve">, </w:t>
+      </w:r>
+      <w:r>
+        <w:rPr>
+          <w:rFonts w:ascii="Noto Serif" w:eastAsia="Noto Serif SC" w:hAnsi="Noto Serif" w:cs="Noto Serif" w:hint="eastAsia"/>
+          <w:sz w:val="21"/>
+          <w:szCs w:val="21"/>
+        </w:rPr>
+        <w:t>低音木鱼</w:t>
+      </w:r>
+      <w:r>
+        <w:rPr>
+          <w:rFonts w:ascii="Noto Serif" w:eastAsia="Noto Serif SC" w:hAnsi="Noto Serif" w:cs="Noto Serif"/>
+          <w:sz w:val="21"/>
+          <w:szCs w:val="21"/>
+        </w:rPr>
+        <w:t xml:space="preserve"> Low Wooden Fish, </w:t>
+      </w:r>
+      <w:r>
+        <w:rPr>
+          <w:rFonts w:ascii="Noto Serif" w:eastAsia="Noto Serif SC" w:hAnsi="Noto Serif" w:cs="Noto Serif" w:hint="eastAsia"/>
+          <w:sz w:val="21"/>
+          <w:szCs w:val="21"/>
+        </w:rPr>
+        <w:t>小木铃</w:t>
+      </w:r>
+      <w:r>
+        <w:rPr>
+          <w:rFonts w:ascii="Noto Serif" w:eastAsia="Noto Serif SC" w:hAnsi="Noto Serif" w:cs="Noto Serif"/>
+          <w:sz w:val="21"/>
+          <w:szCs w:val="21"/>
+        </w:rPr>
+        <w:t xml:space="preserve"> </w:t>
       </w:r>
       <w:proofErr w:type="spellStart"/>
       <w:r>
         <w:rPr>
           <w:rFonts w:ascii="Noto Serif" w:eastAsia="Noto Serif SC" w:hAnsi="Noto Serif" w:cs="Noto Serif"/>
-          <w:sz w:val="24"/>
-          <w:szCs w:val="24"/>
-          <w:lang w:val="en-US"/>
-        </w:rPr>
-        <w:t>Suona</w:t>
+          <w:sz w:val="21"/>
+          <w:szCs w:val="21"/>
+        </w:rPr>
+        <w:t>Woodchimes</w:t>
       </w:r>
       <w:proofErr w:type="spellEnd"/>
-      <w:r>
-        <w:rPr>
-          <w:rFonts w:ascii="Noto Serif" w:eastAsia="Noto Serif SC" w:hAnsi="Noto Serif" w:cs="Noto Serif"/>
-          <w:sz w:val="24"/>
-          <w:szCs w:val="24"/>
-          <w:lang w:val="en-US"/>
-        </w:rPr>
-        <w:t>)</w:t>
-      </w:r>
-    </w:p>
-    <w:p>
-      <w:pPr>
-        <w:jc w:val="right"/>
-        <w:rPr>
-          <w:rFonts w:ascii="Noto Serif" w:eastAsia="Noto Serif SC" w:hAnsi="Noto Serif" w:cs="Noto Serif"/>
-          <w:sz w:val="24"/>
-          <w:szCs w:val="24"/>
-          <w:lang w:val="en-US"/>
-        </w:rPr>
-      </w:pPr>
-    </w:p>
-    <w:p>
-      <w:pPr>
-        <w:jc w:val="right"/>
-        <w:rPr>
-          <w:rFonts w:ascii="Noto Serif" w:eastAsia="Noto Serif SC" w:hAnsi="Noto Serif" w:cs="Noto Serif"/>
-          <w:sz w:val="24"/>
-          <w:szCs w:val="24"/>
+    </w:p>
+    <w:p>
+      <w:pPr>
+        <w:jc w:val="right"/>
+        <w:rPr>
+          <w:rFonts w:ascii="Noto Serif" w:eastAsia="Noto Serif SC" w:hAnsi="Noto Serif" w:cs="Noto Serif"/>
+          <w:sz w:val="21"/>
+          <w:szCs w:val="21"/>
+          <w:lang w:val="en-US"/>
+        </w:rPr>
+      </w:pPr>
+      <w:r>
+        <w:rPr>
+          <w:rFonts w:ascii="Noto Serif" w:eastAsia="Noto Serif SC" w:hAnsi="Noto Serif" w:cs="Noto Serif" w:hint="eastAsia"/>
+          <w:sz w:val="21"/>
+          <w:szCs w:val="21"/>
+          <w:lang w:val="en-US"/>
+        </w:rPr>
+        <w:t>打击乐</w:t>
+      </w:r>
+      <w:r>
+        <w:rPr>
+          <w:rFonts w:ascii="Noto Serif" w:eastAsia="Noto Serif SC" w:hAnsi="Noto Serif" w:cs="Noto Serif"/>
+          <w:sz w:val="21"/>
+          <w:szCs w:val="21"/>
+          <w:lang w:val="en-US"/>
+        </w:rPr>
+        <w:t xml:space="preserve"> VI (Percussion VI): </w:t>
+      </w:r>
+      <w:r>
+        <w:rPr>
+          <w:rFonts w:ascii="Noto Serif" w:eastAsia="Noto Serif SC" w:hAnsi="Noto Serif" w:cs="Noto Serif" w:hint="eastAsia"/>
+          <w:sz w:val="21"/>
+          <w:szCs w:val="21"/>
+        </w:rPr>
+        <w:t>低音军鼓</w:t>
+      </w:r>
+      <w:r>
+        <w:rPr>
+          <w:rFonts w:ascii="Noto Serif" w:eastAsia="Noto Serif SC" w:hAnsi="Noto Serif" w:cs="Noto Serif"/>
+          <w:sz w:val="21"/>
+          <w:szCs w:val="21"/>
+        </w:rPr>
+        <w:t xml:space="preserve"> Diyin </w:t>
+      </w:r>
+      <w:proofErr w:type="spellStart"/>
+      <w:r>
+        <w:rPr>
+          <w:rFonts w:ascii="Noto Serif" w:eastAsia="Noto Serif SC" w:hAnsi="Noto Serif" w:cs="Noto Serif"/>
+          <w:sz w:val="21"/>
+          <w:szCs w:val="21"/>
+        </w:rPr>
+        <w:t>Jungu</w:t>
+      </w:r>
+      <w:proofErr w:type="spellEnd"/>
+      <w:r>
+        <w:rPr>
+          <w:rFonts w:ascii="Noto Serif" w:eastAsia="Noto Serif SC" w:hAnsi="Noto Serif" w:cs="Noto Serif"/>
+          <w:sz w:val="21"/>
+          <w:szCs w:val="21"/>
+        </w:rPr>
+        <w:t xml:space="preserve">, </w:t>
+      </w:r>
+      <w:r>
+        <w:rPr>
+          <w:rFonts w:ascii="Noto Serif" w:eastAsia="Noto Serif SC" w:hAnsi="Noto Serif" w:cs="Noto Serif" w:hint="eastAsia"/>
+          <w:sz w:val="21"/>
+          <w:szCs w:val="21"/>
+        </w:rPr>
+        <w:t>狮钹</w:t>
+      </w:r>
+      <w:r>
+        <w:rPr>
+          <w:rFonts w:ascii="Noto Serif" w:eastAsia="Noto Serif SC" w:hAnsi="Noto Serif" w:cs="Noto Serif"/>
+          <w:sz w:val="21"/>
+          <w:szCs w:val="21"/>
+        </w:rPr>
+        <w:t xml:space="preserve"> </w:t>
+      </w:r>
+      <w:proofErr w:type="spellStart"/>
+      <w:r>
+        <w:rPr>
+          <w:rFonts w:ascii="Noto Serif" w:eastAsia="Noto Serif SC" w:hAnsi="Noto Serif" w:cs="Noto Serif"/>
+          <w:sz w:val="21"/>
+          <w:szCs w:val="21"/>
+        </w:rPr>
+        <w:t>Shibo</w:t>
+      </w:r>
+      <w:proofErr w:type="spellEnd"/>
+      <w:r>
+        <w:rPr>
+          <w:rFonts w:ascii="Noto Serif" w:eastAsia="Noto Serif SC" w:hAnsi="Noto Serif" w:cs="Noto Serif"/>
+          <w:sz w:val="21"/>
+          <w:szCs w:val="21"/>
+        </w:rPr>
+        <w:t xml:space="preserve">, </w:t>
+      </w:r>
+      <w:r>
+        <w:rPr>
+          <w:rFonts w:ascii="Noto Serif" w:eastAsia="Noto Serif SC" w:hAnsi="Noto Serif" w:cs="Noto Serif" w:hint="eastAsia"/>
+          <w:sz w:val="21"/>
+          <w:szCs w:val="21"/>
+        </w:rPr>
+        <w:t>高音木鱼</w:t>
+      </w:r>
+      <w:r>
+        <w:rPr>
+          <w:rFonts w:ascii="Noto Serif" w:eastAsia="Noto Serif SC" w:hAnsi="Noto Serif" w:cs="Noto Serif"/>
+          <w:sz w:val="21"/>
+          <w:szCs w:val="21"/>
+        </w:rPr>
+        <w:t xml:space="preserve"> High Wooden Fish, </w:t>
+      </w:r>
+      <w:r>
+        <w:rPr>
+          <w:rFonts w:ascii="Noto Serif" w:eastAsia="Noto Serif SC" w:hAnsi="Noto Serif" w:cs="Noto Serif" w:hint="eastAsia"/>
+          <w:sz w:val="21"/>
+          <w:szCs w:val="21"/>
+        </w:rPr>
+        <w:t>狮钹</w:t>
+      </w:r>
+      <w:r>
+        <w:rPr>
+          <w:rFonts w:ascii="Noto Serif" w:eastAsia="Noto Serif SC" w:hAnsi="Noto Serif" w:cs="Noto Serif"/>
+          <w:sz w:val="21"/>
+          <w:szCs w:val="21"/>
+        </w:rPr>
+        <w:t xml:space="preserve"> </w:t>
+      </w:r>
+      <w:proofErr w:type="spellStart"/>
+      <w:r>
+        <w:rPr>
+          <w:rFonts w:ascii="Noto Serif" w:eastAsia="Noto Serif SC" w:hAnsi="Noto Serif" w:cs="Noto Serif"/>
+          <w:sz w:val="21"/>
+          <w:szCs w:val="21"/>
+        </w:rPr>
+        <w:t>Shibo</w:t>
+      </w:r>
+      <w:proofErr w:type="spellEnd"/>
+      <w:r>
+        <w:rPr>
+          <w:rFonts w:ascii="Noto Serif" w:eastAsia="Noto Serif SC" w:hAnsi="Noto Serif" w:cs="Noto Serif"/>
+          <w:sz w:val="21"/>
+          <w:szCs w:val="21"/>
+        </w:rPr>
+        <w:t xml:space="preserve">, </w:t>
+      </w:r>
+      <w:r>
+        <w:rPr>
+          <w:rFonts w:ascii="Noto Serif" w:eastAsia="Noto Serif SC" w:hAnsi="Noto Serif" w:cs="Noto Serif" w:hint="eastAsia"/>
+          <w:sz w:val="21"/>
+          <w:szCs w:val="21"/>
+        </w:rPr>
+        <w:t>军钹</w:t>
+      </w:r>
+      <w:r>
+        <w:rPr>
+          <w:rFonts w:ascii="Noto Serif" w:eastAsia="Noto Serif SC" w:hAnsi="Noto Serif" w:cs="Noto Serif"/>
+          <w:sz w:val="21"/>
+          <w:szCs w:val="21"/>
+        </w:rPr>
+        <w:t xml:space="preserve"> </w:t>
+      </w:r>
+      <w:proofErr w:type="spellStart"/>
+      <w:r>
+        <w:rPr>
+          <w:rFonts w:ascii="Noto Serif" w:eastAsia="Noto Serif SC" w:hAnsi="Noto Serif" w:cs="Noto Serif"/>
+          <w:sz w:val="21"/>
+          <w:szCs w:val="21"/>
+        </w:rPr>
+        <w:t>Junbo</w:t>
+      </w:r>
+      <w:proofErr w:type="spellEnd"/>
+    </w:p>
+    <w:p>
+      <w:pPr>
+        <w:jc w:val="right"/>
+        <w:rPr>
+          <w:rFonts w:ascii="Noto Serif" w:eastAsia="Noto Serif SC" w:hAnsi="Noto Serif" w:cs="Noto Serif"/>
+          <w:sz w:val="21"/>
+          <w:szCs w:val="21"/>
+          <w:lang w:val="en-US"/>
+        </w:rPr>
+      </w:pPr>
+      <w:r>
+        <w:rPr>
+          <w:rFonts w:ascii="Noto Serif" w:eastAsia="Noto Serif SC" w:hAnsi="Noto Serif" w:cs="Noto Serif" w:hint="eastAsia"/>
+          <w:sz w:val="21"/>
+          <w:szCs w:val="21"/>
+          <w:lang w:val="en-US"/>
+        </w:rPr>
+        <w:t>打击乐</w:t>
+      </w:r>
+      <w:r>
+        <w:rPr>
+          <w:rFonts w:ascii="Noto Serif" w:eastAsia="Noto Serif SC" w:hAnsi="Noto Serif" w:cs="Noto Serif"/>
+          <w:sz w:val="21"/>
+          <w:szCs w:val="21"/>
+          <w:lang w:val="en-US"/>
+        </w:rPr>
+        <w:t xml:space="preserve"> VII (Percussion VII): </w:t>
+      </w:r>
+      <w:r>
+        <w:rPr>
+          <w:rFonts w:ascii="Noto Serif" w:eastAsia="Noto Serif SC" w:hAnsi="Noto Serif" w:cs="Noto Serif" w:hint="eastAsia"/>
+          <w:sz w:val="21"/>
+          <w:szCs w:val="21"/>
+        </w:rPr>
+        <w:t>拍板</w:t>
+      </w:r>
+      <w:r>
+        <w:rPr>
+          <w:rFonts w:ascii="Noto Serif" w:eastAsia="Noto Serif SC" w:hAnsi="Noto Serif" w:cs="Noto Serif"/>
+          <w:sz w:val="21"/>
+          <w:szCs w:val="21"/>
           <w:lang w:val="en-GB"/>
         </w:rPr>
-      </w:pPr>
-      <w:r>
-        <w:rPr>
-          <w:rFonts w:ascii="Noto Serif" w:eastAsia="Noto Serif SC" w:hAnsi="Noto Serif" w:cs="Noto Serif"/>
-          <w:sz w:val="24"/>
-          <w:szCs w:val="24"/>
-          <w:lang w:val="en-GB"/>
-        </w:rPr>
-        <w:t>中音加鍵管</w:t>
-      </w:r>
-      <w:r>
-        <w:rPr>
-          <w:rFonts w:ascii="Noto Serif" w:eastAsia="Noto Serif SC" w:hAnsi="Noto Serif" w:cs="Noto Serif"/>
-          <w:sz w:val="24"/>
-          <w:szCs w:val="24"/>
-          <w:lang w:val="en-GB"/>
-        </w:rPr>
-        <w:t xml:space="preserve"> (</w:t>
+        <w:t xml:space="preserve"> </w:t>
+      </w:r>
+      <w:r>
+        <w:rPr>
+          <w:rFonts w:ascii="Noto Serif" w:eastAsia="Noto Serif SC" w:hAnsi="Noto Serif" w:cs="Noto Serif"/>
+          <w:sz w:val="21"/>
+          <w:szCs w:val="21"/>
+        </w:rPr>
+        <w:t xml:space="preserve">Paiban, </w:t>
+      </w:r>
+      <w:r>
+        <w:rPr>
+          <w:rFonts w:ascii="Noto Serif" w:eastAsia="Noto Serif SC" w:hAnsi="Noto Serif" w:cs="Noto Serif" w:hint="eastAsia"/>
+          <w:sz w:val="21"/>
+          <w:szCs w:val="21"/>
+        </w:rPr>
+        <w:t>狮吼鼓</w:t>
+      </w:r>
+      <w:r>
+        <w:rPr>
+          <w:rFonts w:ascii="Noto Serif" w:eastAsia="Noto Serif SC" w:hAnsi="Noto Serif" w:cs="Noto Serif"/>
+          <w:sz w:val="21"/>
+          <w:szCs w:val="21"/>
+        </w:rPr>
+        <w:t xml:space="preserve"> Lion roar, </w:t>
+      </w:r>
+      <w:r>
+        <w:rPr>
+          <w:rFonts w:ascii="Noto Serif" w:eastAsia="Noto Serif SC" w:hAnsi="Noto Serif" w:cs="Noto Serif" w:hint="eastAsia"/>
+          <w:sz w:val="21"/>
+          <w:szCs w:val="21"/>
+        </w:rPr>
+        <w:t>低音大锣</w:t>
+      </w:r>
+      <w:r>
+        <w:rPr>
+          <w:rFonts w:ascii="Noto Serif" w:eastAsia="Noto Serif SC" w:hAnsi="Noto Serif" w:cs="Noto Serif"/>
+          <w:sz w:val="21"/>
+          <w:szCs w:val="21"/>
+        </w:rPr>
+        <w:t xml:space="preserve"> Diyin </w:t>
       </w:r>
       <w:proofErr w:type="spellStart"/>
       <w:r>
         <w:rPr>
           <w:rFonts w:ascii="Noto Serif" w:eastAsia="Noto Serif SC" w:hAnsi="Noto Serif" w:cs="Noto Serif"/>
-          <w:sz w:val="24"/>
-          <w:szCs w:val="24"/>
-          <w:lang w:val="en-GB"/>
-        </w:rPr>
-        <w:t>Zhongyin</w:t>
+          <w:sz w:val="21"/>
+          <w:szCs w:val="21"/>
+        </w:rPr>
+        <w:t>Daluo</w:t>
       </w:r>
       <w:proofErr w:type="spellEnd"/>
       <w:r>
         <w:rPr>
           <w:rFonts w:ascii="Noto Serif" w:eastAsia="Noto Serif SC" w:hAnsi="Noto Serif" w:cs="Noto Serif"/>
-          <w:sz w:val="24"/>
-          <w:szCs w:val="24"/>
-          <w:lang w:val="en-GB"/>
+          <w:sz w:val="21"/>
+          <w:szCs w:val="21"/>
+        </w:rPr>
+        <w:t xml:space="preserve">, </w:t>
+      </w:r>
+      <w:r>
+        <w:rPr>
+          <w:rFonts w:ascii="Noto Serif" w:eastAsia="Noto Serif SC" w:hAnsi="Noto Serif" w:cs="Noto Serif" w:hint="eastAsia"/>
+          <w:sz w:val="21"/>
+          <w:szCs w:val="21"/>
+        </w:rPr>
+        <w:t>高边锣</w:t>
+      </w:r>
+      <w:r>
+        <w:rPr>
+          <w:rFonts w:ascii="Noto Serif" w:eastAsia="Noto Serif SC" w:hAnsi="Noto Serif" w:cs="Noto Serif"/>
+          <w:sz w:val="21"/>
+          <w:szCs w:val="21"/>
+        </w:rPr>
+        <w:t xml:space="preserve"> Gao </w:t>
+      </w:r>
+      <w:proofErr w:type="spellStart"/>
+      <w:r>
+        <w:rPr>
+          <w:rFonts w:ascii="Noto Serif" w:eastAsia="Noto Serif SC" w:hAnsi="Noto Serif" w:cs="Noto Serif"/>
+          <w:sz w:val="21"/>
+          <w:szCs w:val="21"/>
+        </w:rPr>
+        <w:t>Bianluo</w:t>
+      </w:r>
+      <w:proofErr w:type="spellEnd"/>
+      <w:r>
+        <w:rPr>
+          <w:rFonts w:ascii="Noto Serif" w:eastAsia="Noto Serif SC" w:hAnsi="Noto Serif" w:cs="Noto Serif"/>
+          <w:sz w:val="21"/>
+          <w:szCs w:val="21"/>
+        </w:rPr>
+        <w:t xml:space="preserve">, </w:t>
+      </w:r>
+      <w:r>
+        <w:rPr>
+          <w:rFonts w:ascii="Noto Serif" w:eastAsia="Noto Serif SC" w:hAnsi="Noto Serif" w:cs="Noto Serif" w:hint="eastAsia"/>
+          <w:sz w:val="21"/>
+          <w:szCs w:val="21"/>
+        </w:rPr>
+        <w:t>低音罄</w:t>
+      </w:r>
+      <w:r>
+        <w:rPr>
+          <w:rFonts w:ascii="Noto Serif" w:eastAsia="Noto Serif SC" w:hAnsi="Noto Serif" w:cs="Noto Serif"/>
+          <w:sz w:val="21"/>
+          <w:szCs w:val="21"/>
+        </w:rPr>
+        <w:t xml:space="preserve"> Diyin Qing</w:t>
+      </w:r>
+      <w:r>
+        <w:rPr>
+          <w:rFonts w:ascii="Noto Serif" w:eastAsia="Noto Serif SC" w:hAnsi="Noto Serif" w:cs="Noto Serif"/>
+          <w:sz w:val="21"/>
+          <w:szCs w:val="21"/>
         </w:rPr>
         <w:t xml:space="preserve"> </w:t>
       </w:r>
-      <w:proofErr w:type="spellStart"/>
-      <w:r>
-        <w:rPr>
-          <w:rFonts w:ascii="Noto Serif" w:eastAsia="Noto Serif SC" w:hAnsi="Noto Serif" w:cs="Noto Serif"/>
-          <w:sz w:val="24"/>
-          <w:szCs w:val="24"/>
-          <w:lang w:val="en-GB"/>
-        </w:rPr>
-        <w:t>Jiajian</w:t>
-      </w:r>
-      <w:proofErr w:type="spellEnd"/>
-      <w:r>
-        <w:rPr>
-          <w:rFonts w:ascii="Noto Serif" w:eastAsia="Noto Serif SC" w:hAnsi="Noto Serif" w:cs="Noto Serif"/>
-          <w:sz w:val="24"/>
-          <w:szCs w:val="24"/>
-          <w:lang w:val="en-GB"/>
-        </w:rPr>
-        <w:t xml:space="preserve"> Guan)</w:t>
-      </w:r>
-    </w:p>
-    <w:p>
-      <w:pPr>
-        <w:jc w:val="right"/>
-        <w:rPr>
-          <w:rFonts w:ascii="Noto Serif" w:eastAsia="Noto Serif SC" w:hAnsi="Noto Serif" w:cs="Noto Serif"/>
-          <w:sz w:val="24"/>
-          <w:szCs w:val="24"/>
-          <w:lang w:val="en-GB"/>
-        </w:rPr>
-      </w:pPr>
-      <w:r>
-        <w:rPr>
-          <w:rFonts w:ascii="Noto Serif" w:eastAsia="Noto Serif SC" w:hAnsi="Noto Serif" w:cs="Noto Serif"/>
-          <w:sz w:val="24"/>
-          <w:szCs w:val="24"/>
-          <w:lang w:val="en-GB"/>
-        </w:rPr>
-        <w:t>低音加鍵管</w:t>
-      </w:r>
-      <w:r>
-        <w:rPr>
-          <w:rFonts w:ascii="Noto Serif" w:eastAsia="Noto Serif SC" w:hAnsi="Noto Serif" w:cs="Noto Serif"/>
-          <w:sz w:val="24"/>
-          <w:szCs w:val="24"/>
-          <w:lang w:val="en-GB"/>
-        </w:rPr>
-        <w:t xml:space="preserve"> (Diyin </w:t>
-      </w:r>
-      <w:proofErr w:type="spellStart"/>
-      <w:r>
-        <w:rPr>
-          <w:rFonts w:ascii="Noto Serif" w:eastAsia="Noto Serif SC" w:hAnsi="Noto Serif" w:cs="Noto Serif"/>
-          <w:sz w:val="24"/>
-          <w:szCs w:val="24"/>
-          <w:lang w:val="en-GB"/>
-        </w:rPr>
-        <w:t>Jiajian</w:t>
-      </w:r>
-      <w:proofErr w:type="spellEnd"/>
-      <w:r>
-        <w:rPr>
-          <w:rFonts w:ascii="Noto Serif" w:eastAsia="Noto Serif SC" w:hAnsi="Noto Serif" w:cs="Noto Serif"/>
-          <w:sz w:val="24"/>
-          <w:szCs w:val="24"/>
-          <w:lang w:val="en-GB"/>
-        </w:rPr>
-        <w:t xml:space="preserve"> Guan)</w:t>
-      </w:r>
-    </w:p>
-    <w:p>
-      <w:pPr>
-        <w:jc w:val="right"/>
-        <w:rPr>
-          <w:rFonts w:ascii="Noto Serif" w:eastAsia="Noto Serif SC" w:hAnsi="Noto Serif" w:cs="Noto Serif"/>
-          <w:sz w:val="24"/>
-          <w:szCs w:val="24"/>
-          <w:lang w:val="en-US"/>
-        </w:rPr>
-      </w:pPr>
-      <w:r>
-        <w:rPr>
-          <w:rFonts w:ascii="Noto Serif" w:eastAsia="Noto Serif SC" w:hAnsi="Noto Serif" w:cs="Noto Serif"/>
-          <w:sz w:val="24"/>
-          <w:szCs w:val="24"/>
-          <w:lang w:val="en-GB"/>
-        </w:rPr>
-        <w:t>倍低音加鍵管</w:t>
-      </w:r>
-      <w:r>
-        <w:rPr>
-          <w:rFonts w:ascii="Noto Serif" w:eastAsia="Noto Serif SC" w:hAnsi="Noto Serif" w:cs="Noto Serif"/>
-          <w:sz w:val="24"/>
-          <w:szCs w:val="24"/>
-          <w:lang w:val="en-GB"/>
-        </w:rPr>
-        <w:t xml:space="preserve"> (Bei Diyin </w:t>
-      </w:r>
-      <w:proofErr w:type="spellStart"/>
-      <w:r>
-        <w:rPr>
-          <w:rFonts w:ascii="Noto Serif" w:eastAsia="Noto Serif SC" w:hAnsi="Noto Serif" w:cs="Noto Serif"/>
-          <w:sz w:val="24"/>
-          <w:szCs w:val="24"/>
-          <w:lang w:val="en-GB"/>
-        </w:rPr>
-        <w:t>Jiajian</w:t>
-      </w:r>
-      <w:proofErr w:type="spellEnd"/>
-      <w:r>
-        <w:rPr>
-          <w:rFonts w:ascii="Noto Serif" w:eastAsia="Noto Serif SC" w:hAnsi="Noto Serif" w:cs="Noto Serif"/>
-          <w:sz w:val="24"/>
-          <w:szCs w:val="24"/>
-          <w:lang w:val="en-GB"/>
-        </w:rPr>
-        <w:t xml:space="preserve"> Guan)</w:t>
-      </w:r>
-    </w:p>
-    <w:p>
-      <w:pPr>
-        <w:jc w:val="right"/>
-        <w:rPr>
-          <w:rFonts w:ascii="Noto Serif" w:eastAsia="Noto Serif SC" w:hAnsi="Noto Serif" w:cs="Noto Serif"/>
-          <w:sz w:val="24"/>
-          <w:szCs w:val="24"/>
-          <w:lang w:val="en-US"/>
-        </w:rPr>
-      </w:pPr>
-    </w:p>
-    <w:p>
-      <w:pPr>
-        <w:jc w:val="right"/>
-        <w:rPr>
-          <w:rFonts w:ascii="Noto Serif" w:eastAsia="Noto Serif SC" w:hAnsi="Noto Serif" w:cs="Noto Serif"/>
-          <w:sz w:val="24"/>
-          <w:szCs w:val="24"/>
-          <w:lang w:val="en-US"/>
-        </w:rPr>
-      </w:pPr>
-      <w:r>
-        <w:rPr>
-          <w:rFonts w:ascii="Noto Serif" w:eastAsia="Noto Serif SC" w:hAnsi="Noto Serif" w:cs="Noto Serif"/>
-          <w:sz w:val="24"/>
-          <w:szCs w:val="24"/>
-          <w:lang w:val="en-US"/>
-        </w:rPr>
-        <w:t>揚琴</w:t>
-      </w:r>
-      <w:r>
-        <w:rPr>
-          <w:rFonts w:ascii="Noto Serif" w:eastAsia="Noto Serif SC" w:hAnsi="Noto Serif" w:cs="Noto Serif"/>
-          <w:sz w:val="24"/>
-          <w:szCs w:val="24"/>
-          <w:lang w:val="en-US"/>
-        </w:rPr>
-        <w:t xml:space="preserve"> </w:t>
-      </w:r>
-      <w:r>
-        <w:rPr>
-          <w:rFonts w:ascii="Noto Serif" w:eastAsia="Noto Serif SC" w:hAnsi="Noto Serif" w:cs="Noto Serif"/>
-          <w:sz w:val="24"/>
-          <w:szCs w:val="24"/>
-          <w:lang w:val="en-US"/>
-        </w:rPr>
-        <w:t xml:space="preserve">I, II </w:t>
-      </w:r>
-      <w:r>
-        <w:rPr>
-          <w:rFonts w:ascii="Noto Serif" w:eastAsia="Noto Serif SC" w:hAnsi="Noto Serif" w:cs="Noto Serif"/>
-          <w:sz w:val="24"/>
-          <w:szCs w:val="24"/>
-          <w:lang w:val="en-US"/>
-        </w:rPr>
-        <w:t>(Yangqin</w:t>
-      </w:r>
-      <w:r>
-        <w:rPr>
-          <w:rFonts w:ascii="Noto Serif" w:eastAsia="Noto Serif SC" w:hAnsi="Noto Serif" w:cs="Noto Serif"/>
-          <w:sz w:val="24"/>
-          <w:szCs w:val="24"/>
-          <w:lang w:val="en-US"/>
-        </w:rPr>
-        <w:t xml:space="preserve"> I, II</w:t>
-      </w:r>
-      <w:r>
-        <w:rPr>
-          <w:rFonts w:ascii="Noto Serif" w:eastAsia="Noto Serif SC" w:hAnsi="Noto Serif" w:cs="Noto Serif"/>
-          <w:sz w:val="24"/>
-          <w:szCs w:val="24"/>
-          <w:lang w:val="en-US"/>
-        </w:rPr>
-        <w:t>)</w:t>
-      </w:r>
-    </w:p>
-    <w:p>
-      <w:pPr>
-        <w:jc w:val="right"/>
-        <w:rPr>
-          <w:rFonts w:ascii="Noto Serif" w:eastAsia="Noto Serif SC" w:hAnsi="Noto Serif" w:cs="Noto Serif"/>
-          <w:sz w:val="24"/>
-          <w:szCs w:val="24"/>
-          <w:lang w:val="en-US"/>
-        </w:rPr>
-      </w:pPr>
-      <w:r>
-        <w:rPr>
-          <w:rFonts w:ascii="Noto Serif" w:eastAsia="Noto Serif SC" w:hAnsi="Noto Serif" w:cs="Noto Serif"/>
-          <w:sz w:val="24"/>
-          <w:szCs w:val="24"/>
-          <w:lang w:val="en-US"/>
-        </w:rPr>
-        <w:t>琵琶</w:t>
-      </w:r>
-      <w:r>
-        <w:rPr>
-          <w:rFonts w:ascii="Noto Serif" w:eastAsia="Noto Serif SC" w:hAnsi="Noto Serif" w:cs="Noto Serif"/>
-          <w:sz w:val="24"/>
-          <w:szCs w:val="24"/>
-          <w:lang w:val="en-US"/>
-        </w:rPr>
-        <w:t xml:space="preserve"> I-IV</w:t>
-      </w:r>
-      <w:r>
-        <w:rPr>
-          <w:rFonts w:ascii="Noto Serif" w:eastAsia="Noto Serif SC" w:hAnsi="Noto Serif" w:cs="Noto Serif"/>
-          <w:sz w:val="24"/>
-          <w:szCs w:val="24"/>
-          <w:lang w:val="en-US"/>
-        </w:rPr>
-        <w:t xml:space="preserve"> (Pipa</w:t>
-      </w:r>
-      <w:r>
-        <w:rPr>
-          <w:rFonts w:ascii="Noto Serif" w:eastAsia="Noto Serif SC" w:hAnsi="Noto Serif" w:cs="Noto Serif"/>
-          <w:sz w:val="24"/>
-          <w:szCs w:val="24"/>
-          <w:lang w:val="en-US"/>
-        </w:rPr>
-        <w:t xml:space="preserve"> I-IV</w:t>
-      </w:r>
-      <w:r>
-        <w:rPr>
-          <w:rFonts w:ascii="Noto Serif" w:eastAsia="Noto Serif SC" w:hAnsi="Noto Serif" w:cs="Noto Serif"/>
-          <w:sz w:val="24"/>
-          <w:szCs w:val="24"/>
-          <w:lang w:val="en-US"/>
-        </w:rPr>
-        <w:t>)</w:t>
-      </w:r>
-    </w:p>
-    <w:p>
-      <w:pPr>
-        <w:jc w:val="right"/>
-        <w:rPr>
-          <w:rFonts w:ascii="Noto Serif" w:eastAsia="Noto Serif SC" w:hAnsi="Noto Serif" w:cs="Noto Serif"/>
-          <w:sz w:val="24"/>
-          <w:szCs w:val="24"/>
-          <w:lang w:val="en-US"/>
-        </w:rPr>
-      </w:pPr>
-      <w:r>
-        <w:rPr>
-          <w:rFonts w:ascii="Noto Serif" w:eastAsia="Noto Serif SC" w:hAnsi="Noto Serif" w:cs="Noto Serif"/>
-          <w:sz w:val="24"/>
-          <w:szCs w:val="24"/>
-          <w:lang w:val="en-GB"/>
-        </w:rPr>
-        <w:t>高音阮</w:t>
-      </w:r>
-      <w:r>
-        <w:rPr>
-          <w:rFonts w:ascii="Noto Serif" w:eastAsia="Noto Serif SC" w:hAnsi="Noto Serif" w:cs="Noto Serif"/>
-          <w:sz w:val="24"/>
-          <w:szCs w:val="24"/>
-          <w:lang w:val="en-GB"/>
-        </w:rPr>
-        <w:t xml:space="preserve"> I, II (</w:t>
-      </w:r>
-      <w:proofErr w:type="spellStart"/>
-      <w:r>
-        <w:rPr>
-          <w:rFonts w:ascii="Noto Serif" w:eastAsia="Noto Serif SC" w:hAnsi="Noto Serif" w:cs="Noto Serif"/>
-          <w:sz w:val="24"/>
-          <w:szCs w:val="24"/>
-          <w:lang w:val="en-GB"/>
-        </w:rPr>
-        <w:t>Gaoyin</w:t>
-      </w:r>
-      <w:proofErr w:type="spellEnd"/>
-      <w:r>
-        <w:rPr>
-          <w:rFonts w:ascii="Noto Serif" w:eastAsia="Noto Serif SC" w:hAnsi="Noto Serif" w:cs="Noto Serif"/>
-          <w:sz w:val="24"/>
-          <w:szCs w:val="24"/>
-          <w:lang w:val="en-GB"/>
-        </w:rPr>
-        <w:t xml:space="preserve"> Ruan I, II)</w:t>
-      </w:r>
-    </w:p>
-    <w:p>
-      <w:pPr>
-        <w:jc w:val="right"/>
-        <w:rPr>
-          <w:rFonts w:ascii="Noto Serif" w:eastAsia="Noto Serif SC" w:hAnsi="Noto Serif" w:cs="Noto Serif"/>
-          <w:sz w:val="24"/>
-          <w:szCs w:val="24"/>
-          <w:lang w:val="en-US"/>
-        </w:rPr>
-      </w:pPr>
-      <w:r>
-        <w:rPr>
-          <w:rFonts w:ascii="Noto Serif" w:eastAsia="Noto Serif SC" w:hAnsi="Noto Serif" w:cs="Noto Serif"/>
-          <w:sz w:val="24"/>
-          <w:szCs w:val="24"/>
-          <w:lang w:val="en-US"/>
-        </w:rPr>
-        <w:t>中阮</w:t>
-      </w:r>
-      <w:r>
-        <w:rPr>
-          <w:rFonts w:ascii="Noto Serif" w:eastAsia="Noto Serif SC" w:hAnsi="Noto Serif" w:cs="Noto Serif"/>
-          <w:sz w:val="24"/>
-          <w:szCs w:val="24"/>
-          <w:lang w:val="en-US"/>
-        </w:rPr>
-        <w:t xml:space="preserve"> I-VI</w:t>
-      </w:r>
-      <w:r>
-        <w:rPr>
-          <w:rFonts w:ascii="Noto Serif" w:eastAsia="Noto Serif SC" w:hAnsi="Noto Serif" w:cs="Noto Serif"/>
-          <w:sz w:val="24"/>
-          <w:szCs w:val="24"/>
-          <w:lang w:val="en-US"/>
-        </w:rPr>
-        <w:t xml:space="preserve"> (Zhongruan</w:t>
-      </w:r>
-      <w:r>
-        <w:rPr>
-          <w:rFonts w:ascii="Noto Serif" w:eastAsia="Noto Serif SC" w:hAnsi="Noto Serif" w:cs="Noto Serif"/>
-          <w:sz w:val="24"/>
-          <w:szCs w:val="24"/>
-          <w:lang w:val="en-US"/>
-        </w:rPr>
-        <w:t xml:space="preserve"> I-VI</w:t>
-      </w:r>
-      <w:r>
-        <w:rPr>
-          <w:rFonts w:ascii="Noto Serif" w:eastAsia="Noto Serif SC" w:hAnsi="Noto Serif" w:cs="Noto Serif"/>
-          <w:sz w:val="24"/>
-          <w:szCs w:val="24"/>
-          <w:lang w:val="en-US"/>
-        </w:rPr>
-        <w:t>)</w:t>
-      </w:r>
-    </w:p>
-    <w:p>
-      <w:pPr>
-        <w:jc w:val="right"/>
-        <w:rPr>
-          <w:rFonts w:ascii="Noto Serif" w:eastAsia="Noto Serif SC" w:hAnsi="Noto Serif" w:cs="Noto Serif"/>
-          <w:sz w:val="24"/>
-          <w:szCs w:val="24"/>
-          <w:lang w:val="en-US"/>
-        </w:rPr>
-      </w:pPr>
-      <w:r>
-        <w:rPr>
-          <w:rFonts w:ascii="Noto Serif" w:eastAsia="Noto Serif SC" w:hAnsi="Noto Serif" w:cs="Noto Serif"/>
-          <w:sz w:val="24"/>
-          <w:szCs w:val="24"/>
-          <w:lang w:val="en-US"/>
-        </w:rPr>
-        <w:t>大阮</w:t>
-      </w:r>
-      <w:r>
-        <w:rPr>
-          <w:rFonts w:ascii="Noto Serif" w:eastAsia="Noto Serif SC" w:hAnsi="Noto Serif" w:cs="Noto Serif"/>
-          <w:sz w:val="24"/>
-          <w:szCs w:val="24"/>
-          <w:lang w:val="en-US"/>
-        </w:rPr>
-        <w:t xml:space="preserve"> </w:t>
-      </w:r>
-      <w:r>
-        <w:rPr>
-          <w:rFonts w:ascii="Noto Serif" w:eastAsia="Noto Serif SC" w:hAnsi="Noto Serif" w:cs="Noto Serif"/>
-          <w:sz w:val="24"/>
-          <w:szCs w:val="24"/>
-          <w:lang w:val="en-US"/>
-        </w:rPr>
-        <w:t xml:space="preserve">I, II </w:t>
-      </w:r>
-      <w:r>
-        <w:rPr>
-          <w:rFonts w:ascii="Noto Serif" w:eastAsia="Noto Serif SC" w:hAnsi="Noto Serif" w:cs="Noto Serif"/>
-          <w:sz w:val="24"/>
-          <w:szCs w:val="24"/>
-          <w:lang w:val="en-US"/>
-        </w:rPr>
-        <w:t>(Daruan</w:t>
-      </w:r>
-      <w:r>
-        <w:rPr>
-          <w:rFonts w:ascii="Noto Serif" w:eastAsia="Noto Serif SC" w:hAnsi="Noto Serif" w:cs="Noto Serif"/>
-          <w:sz w:val="24"/>
-          <w:szCs w:val="24"/>
-          <w:lang w:val="en-US"/>
-        </w:rPr>
-        <w:t xml:space="preserve"> I, II</w:t>
-      </w:r>
-      <w:r>
-        <w:rPr>
-          <w:rFonts w:ascii="Noto Serif" w:eastAsia="Noto Serif SC" w:hAnsi="Noto Serif" w:cs="Noto Serif"/>
-          <w:sz w:val="24"/>
-          <w:szCs w:val="24"/>
-          <w:lang w:val="en-US"/>
-        </w:rPr>
-        <w:t>)</w:t>
-      </w:r>
-    </w:p>
-    <w:p>
-      <w:pPr>
-        <w:jc w:val="right"/>
-        <w:rPr>
-          <w:rFonts w:ascii="Noto Serif" w:eastAsia="Noto Serif SC" w:hAnsi="Noto Serif" w:cs="Noto Serif"/>
-          <w:sz w:val="24"/>
-          <w:szCs w:val="24"/>
-          <w:lang w:val="en-US"/>
-        </w:rPr>
-      </w:pPr>
-      <w:r>
-        <w:rPr>
-          <w:rFonts w:ascii="Noto Serif" w:eastAsia="Noto Serif SC" w:hAnsi="Noto Serif" w:cs="Noto Serif"/>
-          <w:sz w:val="24"/>
-          <w:szCs w:val="24"/>
-          <w:lang w:val="en-US"/>
-        </w:rPr>
-        <w:t>古箏</w:t>
-      </w:r>
-      <w:r>
-        <w:rPr>
-          <w:rFonts w:ascii="Noto Serif" w:eastAsia="Noto Serif SC" w:hAnsi="Noto Serif" w:cs="Noto Serif"/>
-          <w:sz w:val="24"/>
-          <w:szCs w:val="24"/>
-          <w:lang w:val="en-US"/>
-        </w:rPr>
-        <w:t xml:space="preserve"> (Guzheng)</w:t>
-      </w:r>
-    </w:p>
-    <w:p>
-      <w:pPr>
-        <w:jc w:val="right"/>
-        <w:rPr>
-          <w:rFonts w:ascii="Noto Serif" w:eastAsia="Noto Serif SC" w:hAnsi="Noto Serif" w:cs="Noto Serif"/>
-          <w:sz w:val="24"/>
-          <w:szCs w:val="24"/>
-          <w:lang w:val="en-US"/>
-        </w:rPr>
-      </w:pPr>
-    </w:p>
-    <w:p>
-      <w:pPr>
-        <w:jc w:val="right"/>
-        <w:rPr>
-          <w:rFonts w:ascii="Noto Serif" w:eastAsia="Noto Serif SC" w:hAnsi="Noto Serif" w:cs="Noto Serif"/>
-          <w:sz w:val="24"/>
-          <w:szCs w:val="24"/>
-          <w:lang w:val="en-US"/>
-        </w:rPr>
-      </w:pPr>
-      <w:r>
-        <w:rPr>
-          <w:rFonts w:ascii="Noto Serif" w:eastAsia="Noto Serif SC" w:hAnsi="Noto Serif" w:cs="Noto Serif"/>
-          <w:sz w:val="24"/>
-          <w:szCs w:val="24"/>
-          <w:lang w:val="en-US"/>
-        </w:rPr>
-        <w:t>定音鼓</w:t>
-      </w:r>
-      <w:r>
-        <w:rPr>
-          <w:rFonts w:ascii="Noto Serif" w:eastAsia="Noto Serif SC" w:hAnsi="Noto Serif" w:cs="Noto Serif"/>
-          <w:sz w:val="24"/>
-          <w:szCs w:val="24"/>
-          <w:lang w:val="en-US"/>
-        </w:rPr>
-        <w:t xml:space="preserve"> (Timpani)</w:t>
-      </w:r>
-    </w:p>
-    <w:p>
-      <w:pPr>
-        <w:jc w:val="right"/>
-        <w:rPr>
-          <w:rFonts w:ascii="Noto Serif" w:eastAsia="Noto Serif SC" w:hAnsi="Noto Serif" w:cs="Noto Serif"/>
-          <w:sz w:val="21"/>
-          <w:szCs w:val="21"/>
-          <w:lang w:val="en-US"/>
-        </w:rPr>
-      </w:pPr>
-      <w:r>
-        <w:rPr>
-          <w:rFonts w:ascii="Noto Serif" w:eastAsia="Noto Serif SC" w:hAnsi="Noto Serif" w:cs="Noto Serif"/>
-          <w:sz w:val="21"/>
-          <w:szCs w:val="21"/>
-          <w:lang w:val="en-US"/>
-        </w:rPr>
-        <w:t>打擊樂</w:t>
-      </w:r>
-      <w:r>
-        <w:rPr>
-          <w:rFonts w:ascii="Noto Serif" w:eastAsia="Noto Serif SC" w:hAnsi="Noto Serif" w:cs="Noto Serif"/>
-          <w:sz w:val="21"/>
-          <w:szCs w:val="21"/>
-          <w:lang w:val="en-US"/>
-        </w:rPr>
-        <w:t xml:space="preserve"> I (Percussion I): </w:t>
-      </w:r>
-      <w:r>
-        <w:rPr>
-          <w:rFonts w:ascii="Noto Serif" w:eastAsia="Noto Serif SC" w:hAnsi="Noto Serif" w:cs="Noto Serif"/>
-          <w:sz w:val="21"/>
-          <w:szCs w:val="21"/>
-        </w:rPr>
-        <w:t>管鐘</w:t>
-      </w:r>
-      <w:r>
-        <w:rPr>
-          <w:rFonts w:ascii="Noto Serif" w:eastAsia="Noto Serif SC" w:hAnsi="Noto Serif" w:cs="Noto Serif"/>
-          <w:sz w:val="21"/>
-          <w:szCs w:val="21"/>
-        </w:rPr>
-        <w:t xml:space="preserve"> Tubular bells, </w:t>
-      </w:r>
-      <w:r>
-        <w:rPr>
-          <w:rFonts w:ascii="Noto Serif" w:eastAsia="Noto Serif SC" w:hAnsi="Noto Serif" w:cs="Noto Serif"/>
-          <w:sz w:val="21"/>
-          <w:szCs w:val="21"/>
-        </w:rPr>
-        <w:t>風鑼</w:t>
-      </w:r>
-      <w:r>
-        <w:rPr>
-          <w:rFonts w:ascii="Noto Serif" w:eastAsia="Noto Serif SC" w:hAnsi="Noto Serif" w:cs="Noto Serif"/>
-          <w:sz w:val="21"/>
-          <w:szCs w:val="21"/>
-        </w:rPr>
-        <w:t xml:space="preserve"> </w:t>
-      </w:r>
-      <w:proofErr w:type="spellStart"/>
-      <w:r>
-        <w:rPr>
-          <w:rFonts w:ascii="Noto Serif" w:eastAsia="Noto Serif SC" w:hAnsi="Noto Serif" w:cs="Noto Serif"/>
-          <w:sz w:val="21"/>
-          <w:szCs w:val="21"/>
-        </w:rPr>
-        <w:t>Fengluo</w:t>
-      </w:r>
-      <w:proofErr w:type="spellEnd"/>
-      <w:r>
-        <w:rPr>
-          <w:rFonts w:ascii="Noto Serif" w:eastAsia="Noto Serif SC" w:hAnsi="Noto Serif" w:cs="Noto Serif"/>
-          <w:sz w:val="21"/>
-          <w:szCs w:val="21"/>
-        </w:rPr>
-        <w:t xml:space="preserve">, </w:t>
-      </w:r>
-      <w:r>
-        <w:rPr>
-          <w:rFonts w:ascii="Noto Serif" w:eastAsia="Noto Serif SC" w:hAnsi="Noto Serif" w:cs="Noto Serif"/>
-          <w:sz w:val="21"/>
-          <w:szCs w:val="21"/>
-        </w:rPr>
-        <w:t>木琴</w:t>
-      </w:r>
-      <w:r>
-        <w:rPr>
-          <w:rFonts w:ascii="Noto Serif" w:eastAsia="Noto Serif SC" w:hAnsi="Noto Serif" w:cs="Noto Serif"/>
-          <w:sz w:val="21"/>
-          <w:szCs w:val="21"/>
-        </w:rPr>
-        <w:t xml:space="preserve"> Xylophone, </w:t>
-      </w:r>
-      <w:r>
-        <w:rPr>
-          <w:rFonts w:ascii="Noto Serif" w:eastAsia="Noto Serif SC" w:hAnsi="Noto Serif" w:cs="Noto Serif"/>
-          <w:sz w:val="21"/>
-          <w:szCs w:val="21"/>
-        </w:rPr>
-        <w:t>顫音琴</w:t>
-      </w:r>
-      <w:r>
-        <w:rPr>
-          <w:rFonts w:ascii="Noto Serif" w:eastAsia="Noto Serif SC" w:hAnsi="Noto Serif" w:cs="Noto Serif"/>
-          <w:sz w:val="21"/>
-          <w:szCs w:val="21"/>
-        </w:rPr>
-        <w:t xml:space="preserve"> Vibraphone</w:t>
-      </w:r>
-    </w:p>
-    <w:p>
-      <w:pPr>
-        <w:jc w:val="right"/>
-        <w:rPr>
-          <w:rFonts w:ascii="Noto Serif" w:eastAsia="Noto Serif SC" w:hAnsi="Noto Serif" w:cs="Noto Serif"/>
-          <w:sz w:val="21"/>
-          <w:szCs w:val="21"/>
-          <w:lang w:val="en-US"/>
-        </w:rPr>
-      </w:pPr>
-      <w:r>
-        <w:rPr>
-          <w:rFonts w:ascii="Noto Serif" w:eastAsia="Noto Serif SC" w:hAnsi="Noto Serif" w:cs="Noto Serif"/>
-          <w:sz w:val="21"/>
-          <w:szCs w:val="21"/>
-          <w:lang w:val="en-US"/>
-        </w:rPr>
-        <w:t>打擊樂</w:t>
-      </w:r>
-      <w:r>
-        <w:rPr>
-          <w:rFonts w:ascii="Noto Serif" w:eastAsia="Noto Serif SC" w:hAnsi="Noto Serif" w:cs="Noto Serif"/>
-          <w:sz w:val="21"/>
-          <w:szCs w:val="21"/>
-          <w:lang w:val="en-US"/>
-        </w:rPr>
-        <w:t xml:space="preserve"> II (Percussion II): </w:t>
-      </w:r>
-      <w:r>
-        <w:rPr>
-          <w:rFonts w:ascii="Noto Serif" w:eastAsia="Noto Serif SC" w:hAnsi="Noto Serif" w:cs="Noto Serif"/>
-          <w:sz w:val="21"/>
-          <w:szCs w:val="21"/>
-        </w:rPr>
-        <w:t>雲鑼</w:t>
-      </w:r>
-      <w:r>
-        <w:rPr>
-          <w:rFonts w:ascii="Noto Serif" w:eastAsia="Noto Serif SC" w:hAnsi="Noto Serif" w:cs="Noto Serif"/>
-          <w:sz w:val="21"/>
-          <w:szCs w:val="21"/>
-        </w:rPr>
-        <w:t xml:space="preserve"> Yunluo, </w:t>
-      </w:r>
-      <w:r>
-        <w:rPr>
-          <w:rFonts w:ascii="Noto Serif" w:eastAsia="Noto Serif SC" w:hAnsi="Noto Serif" w:cs="Noto Serif"/>
-          <w:sz w:val="21"/>
-          <w:szCs w:val="21"/>
-        </w:rPr>
-        <w:t>顫音琴</w:t>
-      </w:r>
-      <w:r>
-        <w:rPr>
-          <w:rFonts w:ascii="Noto Serif" w:eastAsia="Noto Serif SC" w:hAnsi="Noto Serif" w:cs="Noto Serif"/>
-          <w:sz w:val="21"/>
-          <w:szCs w:val="21"/>
-        </w:rPr>
-        <w:t xml:space="preserve"> Vibraphone</w:t>
-      </w:r>
-    </w:p>
-    <w:p>
-      <w:pPr>
-        <w:jc w:val="right"/>
-        <w:rPr>
-          <w:rFonts w:ascii="Noto Serif" w:eastAsia="Noto Serif SC" w:hAnsi="Noto Serif" w:cs="Noto Serif"/>
-          <w:sz w:val="21"/>
-          <w:szCs w:val="21"/>
-        </w:rPr>
-      </w:pPr>
-      <w:r>
-        <w:rPr>
-          <w:rFonts w:ascii="Noto Serif" w:eastAsia="Noto Serif SC" w:hAnsi="Noto Serif" w:cs="Noto Serif"/>
-          <w:sz w:val="21"/>
-          <w:szCs w:val="21"/>
-          <w:lang w:val="en-US"/>
-        </w:rPr>
-        <w:t>打擊樂</w:t>
-      </w:r>
-      <w:r>
-        <w:rPr>
-          <w:rFonts w:ascii="Noto Serif" w:eastAsia="Noto Serif SC" w:hAnsi="Noto Serif" w:cs="Noto Serif"/>
-          <w:sz w:val="21"/>
-          <w:szCs w:val="21"/>
-          <w:lang w:val="en-US"/>
-        </w:rPr>
-        <w:t xml:space="preserve"> III (Percussion III):</w:t>
-      </w:r>
-      <w:r>
-        <w:rPr>
-          <w:rFonts w:ascii="Noto Serif" w:eastAsia="Noto Serif SC" w:hAnsi="Noto Serif" w:cs="Noto Serif"/>
-          <w:sz w:val="21"/>
-          <w:szCs w:val="21"/>
-          <w:lang w:val="en-US"/>
-        </w:rPr>
-        <w:t xml:space="preserve"> </w:t>
-      </w:r>
-      <w:r>
-        <w:rPr>
-          <w:rFonts w:ascii="Noto Serif" w:eastAsia="Noto Serif SC" w:hAnsi="Noto Serif" w:cs="Noto Serif"/>
-          <w:sz w:val="21"/>
-          <w:szCs w:val="21"/>
-        </w:rPr>
-        <w:t>大堂鼓</w:t>
-      </w:r>
-      <w:r>
-        <w:rPr>
-          <w:rFonts w:ascii="Noto Serif" w:eastAsia="Noto Serif SC" w:hAnsi="Noto Serif" w:cs="Noto Serif"/>
-          <w:sz w:val="21"/>
-          <w:szCs w:val="21"/>
-        </w:rPr>
-        <w:t xml:space="preserve"> Da </w:t>
-      </w:r>
-      <w:proofErr w:type="spellStart"/>
-      <w:r>
-        <w:rPr>
-          <w:rFonts w:ascii="Noto Serif" w:eastAsia="Noto Serif SC" w:hAnsi="Noto Serif" w:cs="Noto Serif"/>
-          <w:sz w:val="21"/>
-          <w:szCs w:val="21"/>
-        </w:rPr>
-        <w:t>Tanggu</w:t>
-      </w:r>
-      <w:proofErr w:type="spellEnd"/>
-      <w:r>
-        <w:rPr>
-          <w:rFonts w:ascii="Noto Serif" w:eastAsia="Noto Serif SC" w:hAnsi="Noto Serif" w:cs="Noto Serif"/>
-          <w:sz w:val="21"/>
-          <w:szCs w:val="21"/>
-        </w:rPr>
-        <w:t xml:space="preserve">, </w:t>
-      </w:r>
-      <w:r>
-        <w:rPr>
-          <w:rFonts w:ascii="Noto Serif" w:eastAsia="Noto Serif SC" w:hAnsi="Noto Serif" w:cs="Noto Serif"/>
-          <w:sz w:val="21"/>
-          <w:szCs w:val="21"/>
-        </w:rPr>
-        <w:t>大小</w:t>
-      </w:r>
-      <w:r>
-        <w:rPr>
-          <w:rFonts w:ascii="Noto Serif" w:eastAsia="Noto Serif SC" w:hAnsi="Noto Serif" w:cs="Noto Serif"/>
-          <w:sz w:val="21"/>
-          <w:szCs w:val="21"/>
-        </w:rPr>
-        <w:t xml:space="preserve"> Flexatone, </w:t>
-      </w:r>
-      <w:r>
-        <w:rPr>
-          <w:rFonts w:ascii="Noto Serif" w:eastAsia="Noto Serif SC" w:hAnsi="Noto Serif" w:cs="Noto Serif"/>
-          <w:sz w:val="21"/>
-          <w:szCs w:val="21"/>
-        </w:rPr>
-        <w:t>小風鈴</w:t>
-      </w:r>
-      <w:r>
-        <w:rPr>
-          <w:rFonts w:ascii="Noto Serif" w:eastAsia="Noto Serif SC" w:hAnsi="Noto Serif" w:cs="Noto Serif"/>
-          <w:sz w:val="21"/>
-          <w:szCs w:val="21"/>
-        </w:rPr>
-        <w:t xml:space="preserve"> Small Windchimes</w:t>
-      </w:r>
-    </w:p>
-    <w:p>
-      <w:pPr>
-        <w:jc w:val="right"/>
-        <w:rPr>
-          <w:rFonts w:ascii="Noto Serif" w:eastAsia="Noto Serif SC" w:hAnsi="Noto Serif" w:cs="Noto Serif"/>
-          <w:sz w:val="21"/>
-          <w:szCs w:val="21"/>
-          <w:lang w:val="en-US"/>
-        </w:rPr>
-      </w:pPr>
-      <w:r>
-        <w:rPr>
-          <w:rFonts w:ascii="Noto Serif" w:eastAsia="Noto Serif SC" w:hAnsi="Noto Serif" w:cs="Noto Serif"/>
-          <w:sz w:val="21"/>
-          <w:szCs w:val="21"/>
-          <w:lang w:val="en-US"/>
-        </w:rPr>
-        <w:t>打擊樂</w:t>
-      </w:r>
-      <w:r>
-        <w:rPr>
-          <w:rFonts w:ascii="Noto Serif" w:eastAsia="Noto Serif SC" w:hAnsi="Noto Serif" w:cs="Noto Serif"/>
-          <w:sz w:val="21"/>
-          <w:szCs w:val="21"/>
-          <w:lang w:val="en-US"/>
-        </w:rPr>
-        <w:t xml:space="preserve"> IV (Percussion IV): </w:t>
-      </w:r>
-      <w:r>
-        <w:rPr>
-          <w:rFonts w:ascii="Noto Serif" w:eastAsia="Noto Serif SC" w:hAnsi="Noto Serif" w:cs="Noto Serif"/>
-          <w:sz w:val="21"/>
-          <w:szCs w:val="21"/>
-        </w:rPr>
-        <w:t>吊鈸</w:t>
-      </w:r>
-      <w:r>
-        <w:rPr>
-          <w:rFonts w:ascii="Noto Serif" w:eastAsia="Noto Serif SC" w:hAnsi="Noto Serif" w:cs="Noto Serif"/>
-          <w:sz w:val="21"/>
-          <w:szCs w:val="21"/>
-        </w:rPr>
-        <w:t xml:space="preserve"> Suspended Cymbals, </w:t>
-      </w:r>
-      <w:r>
-        <w:rPr>
-          <w:rFonts w:ascii="Noto Serif" w:eastAsia="Noto Serif SC" w:hAnsi="Noto Serif" w:cs="Noto Serif"/>
-          <w:sz w:val="21"/>
-          <w:szCs w:val="21"/>
-        </w:rPr>
-        <w:t>大小拍顫器</w:t>
-      </w:r>
-      <w:r>
-        <w:rPr>
-          <w:rFonts w:ascii="Noto Serif" w:eastAsia="Noto Serif SC" w:hAnsi="Noto Serif" w:cs="Noto Serif"/>
-          <w:sz w:val="21"/>
-          <w:szCs w:val="21"/>
-        </w:rPr>
-        <w:t xml:space="preserve"> (Large &amp; Small Vibraslap), </w:t>
-      </w:r>
-      <w:r>
-        <w:rPr>
-          <w:rFonts w:ascii="Noto Serif" w:eastAsia="Noto Serif SC" w:hAnsi="Noto Serif" w:cs="Noto Serif"/>
-          <w:sz w:val="21"/>
-          <w:szCs w:val="21"/>
-        </w:rPr>
-        <w:t>大堂鼓</w:t>
-      </w:r>
-      <w:r>
-        <w:rPr>
-          <w:rFonts w:ascii="Noto Serif" w:eastAsia="Noto Serif SC" w:hAnsi="Noto Serif" w:cs="Noto Serif"/>
-          <w:sz w:val="21"/>
-          <w:szCs w:val="21"/>
-        </w:rPr>
-        <w:t xml:space="preserve"> Da </w:t>
-      </w:r>
-      <w:proofErr w:type="spellStart"/>
-      <w:r>
-        <w:rPr>
-          <w:rFonts w:ascii="Noto Serif" w:eastAsia="Noto Serif SC" w:hAnsi="Noto Serif" w:cs="Noto Serif"/>
-          <w:sz w:val="21"/>
-          <w:szCs w:val="21"/>
-        </w:rPr>
-        <w:t>Tanggu</w:t>
-      </w:r>
-      <w:proofErr w:type="spellEnd"/>
-      <w:r>
-        <w:rPr>
-          <w:rFonts w:ascii="Noto Serif" w:eastAsia="Noto Serif SC" w:hAnsi="Noto Serif" w:cs="Noto Serif"/>
-          <w:sz w:val="21"/>
-          <w:szCs w:val="21"/>
-        </w:rPr>
-        <w:t xml:space="preserve">, </w:t>
-      </w:r>
-      <w:r>
-        <w:rPr>
-          <w:rFonts w:ascii="Noto Serif" w:eastAsia="Noto Serif SC" w:hAnsi="Noto Serif" w:cs="Noto Serif"/>
-          <w:sz w:val="21"/>
-          <w:szCs w:val="21"/>
-        </w:rPr>
-        <w:t>小堂鼓</w:t>
-      </w:r>
-      <w:r>
-        <w:rPr>
-          <w:rFonts w:ascii="Noto Serif" w:eastAsia="Noto Serif SC" w:hAnsi="Noto Serif" w:cs="Noto Serif"/>
-          <w:sz w:val="21"/>
-          <w:szCs w:val="21"/>
-        </w:rPr>
-        <w:t xml:space="preserve"> Xiao </w:t>
-      </w:r>
-      <w:proofErr w:type="spellStart"/>
-      <w:r>
-        <w:rPr>
-          <w:rFonts w:ascii="Noto Serif" w:eastAsia="Noto Serif SC" w:hAnsi="Noto Serif" w:cs="Noto Serif"/>
-          <w:sz w:val="21"/>
-          <w:szCs w:val="21"/>
-        </w:rPr>
-        <w:t>Tanggu</w:t>
-      </w:r>
-      <w:proofErr w:type="spellEnd"/>
-    </w:p>
-    <w:p>
-      <w:pPr>
-        <w:jc w:val="right"/>
-        <w:rPr>
-          <w:rFonts w:ascii="Noto Serif" w:eastAsia="Noto Serif SC" w:hAnsi="Noto Serif" w:cs="Noto Serif"/>
-          <w:sz w:val="21"/>
-          <w:szCs w:val="21"/>
-          <w:lang w:val="en-GB"/>
-        </w:rPr>
-      </w:pPr>
-      <w:r>
-        <w:rPr>
-          <w:rFonts w:ascii="Noto Serif" w:eastAsia="Noto Serif SC" w:hAnsi="Noto Serif" w:cs="Noto Serif"/>
-          <w:sz w:val="21"/>
-          <w:szCs w:val="21"/>
-          <w:lang w:val="en-US"/>
-        </w:rPr>
-        <w:t>打擊樂</w:t>
-      </w:r>
-      <w:r>
-        <w:rPr>
-          <w:rFonts w:ascii="Noto Serif" w:eastAsia="Noto Serif SC" w:hAnsi="Noto Serif" w:cs="Noto Serif"/>
-          <w:sz w:val="21"/>
-          <w:szCs w:val="21"/>
-          <w:lang w:val="en-US"/>
-        </w:rPr>
-        <w:t xml:space="preserve"> V (Percussion V):</w:t>
-      </w:r>
-      <w:r>
-        <w:rPr>
-          <w:rFonts w:ascii="Noto Serif" w:eastAsia="Noto Serif SC" w:hAnsi="Noto Serif" w:cs="Noto Serif"/>
-          <w:sz w:val="21"/>
-          <w:szCs w:val="21"/>
-          <w:lang w:val="en-US"/>
-        </w:rPr>
-        <w:t xml:space="preserve"> </w:t>
-      </w:r>
-      <w:r>
-        <w:rPr>
-          <w:rFonts w:ascii="Noto Serif" w:eastAsia="Noto Serif SC" w:hAnsi="Noto Serif" w:cs="Noto Serif"/>
-          <w:sz w:val="21"/>
-          <w:szCs w:val="21"/>
-        </w:rPr>
-        <w:t>板鼓</w:t>
-      </w:r>
-      <w:r>
-        <w:rPr>
-          <w:rFonts w:ascii="Noto Serif" w:eastAsia="Noto Serif SC" w:hAnsi="Noto Serif" w:cs="Noto Serif"/>
-          <w:sz w:val="21"/>
-          <w:szCs w:val="21"/>
-        </w:rPr>
-        <w:t xml:space="preserve"> Bangu, </w:t>
-      </w:r>
-      <w:r>
-        <w:rPr>
-          <w:rFonts w:ascii="Noto Serif" w:eastAsia="Noto Serif SC" w:hAnsi="Noto Serif" w:cs="Noto Serif"/>
-          <w:sz w:val="21"/>
-          <w:szCs w:val="21"/>
-        </w:rPr>
-        <w:t>彈簧鼓</w:t>
-      </w:r>
-      <w:r>
-        <w:rPr>
-          <w:rFonts w:ascii="Noto Serif" w:eastAsia="Noto Serif SC" w:hAnsi="Noto Serif" w:cs="Noto Serif"/>
-          <w:sz w:val="21"/>
-          <w:szCs w:val="21"/>
-          <w:lang w:val="en-GB"/>
-        </w:rPr>
-        <w:t xml:space="preserve"> </w:t>
-      </w:r>
-      <w:r>
-        <w:rPr>
-          <w:rFonts w:ascii="Noto Serif" w:eastAsia="Noto Serif SC" w:hAnsi="Noto Serif" w:cs="Noto Serif"/>
-          <w:sz w:val="21"/>
-          <w:szCs w:val="21"/>
-        </w:rPr>
-        <w:t>Thunder tube</w:t>
-      </w:r>
-      <w:r>
-        <w:rPr>
-          <w:rFonts w:ascii="Noto Serif" w:eastAsia="Noto Serif SC" w:hAnsi="Noto Serif" w:cs="Noto Serif"/>
-          <w:sz w:val="21"/>
-          <w:szCs w:val="21"/>
-        </w:rPr>
-        <w:t xml:space="preserve">, </w:t>
-      </w:r>
-      <w:r>
-        <w:rPr>
-          <w:rFonts w:ascii="Noto Serif" w:eastAsia="Noto Serif SC" w:hAnsi="Noto Serif" w:cs="Noto Serif"/>
-          <w:sz w:val="21"/>
-          <w:szCs w:val="21"/>
-        </w:rPr>
-        <w:t>拍板</w:t>
-      </w:r>
-      <w:r>
-        <w:rPr>
-          <w:rFonts w:ascii="Noto Serif" w:eastAsia="Noto Serif SC" w:hAnsi="Noto Serif" w:cs="Noto Serif"/>
-          <w:sz w:val="21"/>
-          <w:szCs w:val="21"/>
-        </w:rPr>
-        <w:t xml:space="preserve"> Paiban, </w:t>
-      </w:r>
-      <w:r>
-        <w:rPr>
-          <w:rFonts w:ascii="Noto Serif" w:eastAsia="Noto Serif SC" w:hAnsi="Noto Serif" w:cs="Noto Serif"/>
-          <w:sz w:val="21"/>
-          <w:szCs w:val="21"/>
-        </w:rPr>
-        <w:t>獅鈸</w:t>
-      </w:r>
-      <w:r>
-        <w:rPr>
-          <w:rFonts w:ascii="Noto Serif" w:eastAsia="Noto Serif SC" w:hAnsi="Noto Serif" w:cs="Noto Serif"/>
-          <w:sz w:val="21"/>
-          <w:szCs w:val="21"/>
-        </w:rPr>
-        <w:t xml:space="preserve"> </w:t>
-      </w:r>
-      <w:proofErr w:type="spellStart"/>
-      <w:r>
-        <w:rPr>
-          <w:rFonts w:ascii="Noto Serif" w:eastAsia="Noto Serif SC" w:hAnsi="Noto Serif" w:cs="Noto Serif"/>
-          <w:sz w:val="21"/>
-          <w:szCs w:val="21"/>
-        </w:rPr>
-        <w:t>Shibo</w:t>
-      </w:r>
-      <w:proofErr w:type="spellEnd"/>
-      <w:r>
-        <w:rPr>
-          <w:rFonts w:ascii="Noto Serif" w:eastAsia="Noto Serif SC" w:hAnsi="Noto Serif" w:cs="Noto Serif"/>
-          <w:sz w:val="21"/>
-          <w:szCs w:val="21"/>
-        </w:rPr>
-        <w:t xml:space="preserve">, </w:t>
-      </w:r>
-      <w:r>
-        <w:rPr>
-          <w:rFonts w:ascii="Noto Serif" w:eastAsia="Noto Serif SC" w:hAnsi="Noto Serif" w:cs="Noto Serif"/>
-          <w:sz w:val="21"/>
-          <w:szCs w:val="21"/>
-        </w:rPr>
-        <w:t>低音木魚</w:t>
-      </w:r>
-      <w:r>
-        <w:rPr>
-          <w:rFonts w:ascii="Noto Serif" w:eastAsia="Noto Serif SC" w:hAnsi="Noto Serif" w:cs="Noto Serif"/>
-          <w:sz w:val="21"/>
-          <w:szCs w:val="21"/>
-        </w:rPr>
-        <w:t xml:space="preserve"> Low Wooden Fish, </w:t>
-      </w:r>
-      <w:r>
-        <w:rPr>
-          <w:rFonts w:ascii="Noto Serif" w:eastAsia="Noto Serif SC" w:hAnsi="Noto Serif" w:cs="Noto Serif"/>
-          <w:sz w:val="21"/>
-          <w:szCs w:val="21"/>
-        </w:rPr>
-        <w:t>小木鈴</w:t>
-      </w:r>
-      <w:r>
-        <w:rPr>
-          <w:rFonts w:ascii="Noto Serif" w:eastAsia="Noto Serif SC" w:hAnsi="Noto Serif" w:cs="Noto Serif"/>
-          <w:sz w:val="21"/>
-          <w:szCs w:val="21"/>
-        </w:rPr>
-        <w:t xml:space="preserve"> </w:t>
-      </w:r>
-      <w:proofErr w:type="spellStart"/>
-      <w:r>
-        <w:rPr>
-          <w:rFonts w:ascii="Noto Serif" w:eastAsia="Noto Serif SC" w:hAnsi="Noto Serif" w:cs="Noto Serif"/>
-          <w:sz w:val="21"/>
-          <w:szCs w:val="21"/>
-        </w:rPr>
-        <w:t>Woodchimes</w:t>
-      </w:r>
-      <w:proofErr w:type="spellEnd"/>
-    </w:p>
-    <w:p>
-      <w:pPr>
-        <w:jc w:val="right"/>
-        <w:rPr>
-          <w:rFonts w:ascii="Noto Serif" w:eastAsia="Noto Serif SC" w:hAnsi="Noto Serif" w:cs="Noto Serif"/>
-          <w:sz w:val="21"/>
-          <w:szCs w:val="21"/>
-          <w:lang w:val="en-US"/>
-        </w:rPr>
-      </w:pPr>
-      <w:r>
-        <w:rPr>
-          <w:rFonts w:ascii="Noto Serif" w:eastAsia="Noto Serif SC" w:hAnsi="Noto Serif" w:cs="Noto Serif"/>
-          <w:sz w:val="21"/>
-          <w:szCs w:val="21"/>
-          <w:lang w:val="en-US"/>
-        </w:rPr>
-        <w:t>打擊樂</w:t>
-      </w:r>
-      <w:r>
-        <w:rPr>
-          <w:rFonts w:ascii="Noto Serif" w:eastAsia="Noto Serif SC" w:hAnsi="Noto Serif" w:cs="Noto Serif"/>
-          <w:sz w:val="21"/>
-          <w:szCs w:val="21"/>
-          <w:lang w:val="en-US"/>
-        </w:rPr>
-        <w:t xml:space="preserve"> VI (Percussion VI):</w:t>
-      </w:r>
-      <w:r>
-        <w:rPr>
-          <w:rFonts w:ascii="Noto Serif" w:eastAsia="Noto Serif SC" w:hAnsi="Noto Serif" w:cs="Noto Serif"/>
-          <w:sz w:val="21"/>
-          <w:szCs w:val="21"/>
-          <w:lang w:val="en-US"/>
-        </w:rPr>
-        <w:t xml:space="preserve"> </w:t>
-      </w:r>
-      <w:r>
-        <w:rPr>
-          <w:rFonts w:ascii="Noto Serif" w:eastAsia="Noto Serif SC" w:hAnsi="Noto Serif" w:cs="Noto Serif"/>
-          <w:sz w:val="21"/>
-          <w:szCs w:val="21"/>
-        </w:rPr>
-        <w:t>低音軍鼓</w:t>
-      </w:r>
-      <w:r>
-        <w:rPr>
-          <w:rFonts w:ascii="Noto Serif" w:eastAsia="Noto Serif SC" w:hAnsi="Noto Serif" w:cs="Noto Serif"/>
-          <w:sz w:val="21"/>
-          <w:szCs w:val="21"/>
-        </w:rPr>
-        <w:t xml:space="preserve"> Diyin </w:t>
-      </w:r>
-      <w:proofErr w:type="spellStart"/>
-      <w:r>
-        <w:rPr>
-          <w:rFonts w:ascii="Noto Serif" w:eastAsia="Noto Serif SC" w:hAnsi="Noto Serif" w:cs="Noto Serif"/>
-          <w:sz w:val="21"/>
-          <w:szCs w:val="21"/>
-        </w:rPr>
-        <w:t>Jungu</w:t>
-      </w:r>
-      <w:proofErr w:type="spellEnd"/>
-      <w:r>
-        <w:rPr>
-          <w:rFonts w:ascii="Noto Serif" w:eastAsia="Noto Serif SC" w:hAnsi="Noto Serif" w:cs="Noto Serif"/>
-          <w:sz w:val="21"/>
-          <w:szCs w:val="21"/>
-        </w:rPr>
-        <w:t xml:space="preserve">, </w:t>
-      </w:r>
-      <w:r>
-        <w:rPr>
-          <w:rFonts w:ascii="Noto Serif" w:eastAsia="Noto Serif SC" w:hAnsi="Noto Serif" w:cs="Noto Serif"/>
-          <w:sz w:val="21"/>
-          <w:szCs w:val="21"/>
-        </w:rPr>
-        <w:t>獅鈸</w:t>
-      </w:r>
-      <w:r>
-        <w:rPr>
-          <w:rFonts w:ascii="Noto Serif" w:eastAsia="Noto Serif SC" w:hAnsi="Noto Serif" w:cs="Noto Serif"/>
-          <w:sz w:val="21"/>
-          <w:szCs w:val="21"/>
-        </w:rPr>
-        <w:t xml:space="preserve"> </w:t>
-      </w:r>
-      <w:proofErr w:type="spellStart"/>
-      <w:r>
-        <w:rPr>
-          <w:rFonts w:ascii="Noto Serif" w:eastAsia="Noto Serif SC" w:hAnsi="Noto Serif" w:cs="Noto Serif"/>
-          <w:sz w:val="21"/>
-          <w:szCs w:val="21"/>
-        </w:rPr>
-        <w:t>Shibo</w:t>
-      </w:r>
-      <w:proofErr w:type="spellEnd"/>
-      <w:r>
-        <w:rPr>
-          <w:rFonts w:ascii="Noto Serif" w:eastAsia="Noto Serif SC" w:hAnsi="Noto Serif" w:cs="Noto Serif"/>
-          <w:sz w:val="21"/>
-          <w:szCs w:val="21"/>
-        </w:rPr>
-        <w:t xml:space="preserve">, </w:t>
-      </w:r>
-      <w:r>
-        <w:rPr>
-          <w:rFonts w:ascii="Noto Serif" w:eastAsia="Noto Serif SC" w:hAnsi="Noto Serif" w:cs="Noto Serif"/>
-          <w:sz w:val="21"/>
-          <w:szCs w:val="21"/>
-        </w:rPr>
-        <w:t>高音木魚</w:t>
-      </w:r>
-      <w:r>
-        <w:rPr>
-          <w:rFonts w:ascii="Noto Serif" w:eastAsia="Noto Serif SC" w:hAnsi="Noto Serif" w:cs="Noto Serif"/>
-          <w:sz w:val="21"/>
-          <w:szCs w:val="21"/>
-        </w:rPr>
-        <w:t xml:space="preserve"> High Wooden Fish, </w:t>
-      </w:r>
-      <w:r>
-        <w:rPr>
-          <w:rFonts w:ascii="Noto Serif" w:eastAsia="Noto Serif SC" w:hAnsi="Noto Serif" w:cs="Noto Serif"/>
-          <w:sz w:val="21"/>
-          <w:szCs w:val="21"/>
-        </w:rPr>
-        <w:t>獅鈸</w:t>
-      </w:r>
-      <w:r>
-        <w:rPr>
-          <w:rFonts w:ascii="Noto Serif" w:eastAsia="Noto Serif SC" w:hAnsi="Noto Serif" w:cs="Noto Serif"/>
-          <w:sz w:val="21"/>
-          <w:szCs w:val="21"/>
-        </w:rPr>
-        <w:t xml:space="preserve"> </w:t>
-      </w:r>
-      <w:proofErr w:type="spellStart"/>
-      <w:r>
-        <w:rPr>
-          <w:rFonts w:ascii="Noto Serif" w:eastAsia="Noto Serif SC" w:hAnsi="Noto Serif" w:cs="Noto Serif"/>
-          <w:sz w:val="21"/>
-          <w:szCs w:val="21"/>
-        </w:rPr>
-        <w:t>Shibo</w:t>
-      </w:r>
-      <w:proofErr w:type="spellEnd"/>
-      <w:r>
-        <w:rPr>
-          <w:rFonts w:ascii="Noto Serif" w:eastAsia="Noto Serif SC" w:hAnsi="Noto Serif" w:cs="Noto Serif"/>
-          <w:sz w:val="21"/>
-          <w:szCs w:val="21"/>
-        </w:rPr>
-        <w:t xml:space="preserve">, </w:t>
-      </w:r>
-      <w:r>
-        <w:rPr>
-          <w:rFonts w:ascii="Noto Serif" w:eastAsia="Noto Serif SC" w:hAnsi="Noto Serif" w:cs="Noto Serif"/>
-          <w:sz w:val="21"/>
-          <w:szCs w:val="21"/>
-        </w:rPr>
-        <w:t>軍鈸</w:t>
-      </w:r>
-      <w:r>
-        <w:rPr>
-          <w:rFonts w:ascii="Noto Serif" w:eastAsia="Noto Serif SC" w:hAnsi="Noto Serif" w:cs="Noto Serif"/>
-          <w:sz w:val="21"/>
-          <w:szCs w:val="21"/>
-        </w:rPr>
-        <w:t xml:space="preserve"> </w:t>
-      </w:r>
-      <w:proofErr w:type="spellStart"/>
-      <w:r>
-        <w:rPr>
-          <w:rFonts w:ascii="Noto Serif" w:eastAsia="Noto Serif SC" w:hAnsi="Noto Serif" w:cs="Noto Serif"/>
-          <w:sz w:val="21"/>
-          <w:szCs w:val="21"/>
-        </w:rPr>
-        <w:t>Junbo</w:t>
-      </w:r>
-      <w:proofErr w:type="spellEnd"/>
-    </w:p>
-    <w:p>
-      <w:pPr>
-        <w:jc w:val="right"/>
-        <w:rPr>
-          <w:rFonts w:ascii="Noto Serif" w:eastAsia="Noto Serif SC" w:hAnsi="Noto Serif" w:cs="Noto Serif"/>
-          <w:sz w:val="21"/>
-          <w:szCs w:val="21"/>
-          <w:lang w:val="en-US"/>
-        </w:rPr>
-      </w:pPr>
-      <w:r>
-        <w:rPr>
-          <w:rFonts w:ascii="Noto Serif" w:eastAsia="Noto Serif SC" w:hAnsi="Noto Serif" w:cs="Noto Serif"/>
-          <w:sz w:val="21"/>
-          <w:szCs w:val="21"/>
-          <w:lang w:val="en-US"/>
-        </w:rPr>
-        <w:t>打擊樂</w:t>
-      </w:r>
-      <w:r>
-        <w:rPr>
-          <w:rFonts w:ascii="Noto Serif" w:eastAsia="Noto Serif SC" w:hAnsi="Noto Serif" w:cs="Noto Serif"/>
-          <w:sz w:val="21"/>
-          <w:szCs w:val="21"/>
-          <w:lang w:val="en-US"/>
-        </w:rPr>
-        <w:t xml:space="preserve"> VII (Percussion V</w:t>
-      </w:r>
-      <w:r>
-        <w:rPr>
-          <w:rFonts w:ascii="Noto Serif" w:eastAsia="Noto Serif SC" w:hAnsi="Noto Serif" w:cs="Noto Serif"/>
-          <w:sz w:val="21"/>
-          <w:szCs w:val="21"/>
-          <w:lang w:val="en-US"/>
-        </w:rPr>
-        <w:t>II</w:t>
-      </w:r>
-      <w:r>
-        <w:rPr>
-          <w:rFonts w:ascii="Noto Serif" w:eastAsia="Noto Serif SC" w:hAnsi="Noto Serif" w:cs="Noto Serif"/>
-          <w:sz w:val="21"/>
-          <w:szCs w:val="21"/>
-          <w:lang w:val="en-US"/>
-        </w:rPr>
-        <w:t>)</w:t>
-      </w:r>
-      <w:r>
-        <w:rPr>
-          <w:rFonts w:ascii="Noto Serif" w:eastAsia="Noto Serif SC" w:hAnsi="Noto Serif" w:cs="Noto Serif"/>
-          <w:sz w:val="21"/>
-          <w:szCs w:val="21"/>
-          <w:lang w:val="en-US"/>
-        </w:rPr>
-        <w:t xml:space="preserve">: </w:t>
-      </w:r>
-      <w:r>
-        <w:rPr>
-          <w:rFonts w:ascii="Noto Serif" w:eastAsia="Noto Serif SC" w:hAnsi="Noto Serif" w:cs="Noto Serif"/>
-          <w:sz w:val="21"/>
-          <w:szCs w:val="21"/>
-        </w:rPr>
-        <w:t>拍板</w:t>
-      </w:r>
-      <w:r>
-        <w:rPr>
-          <w:rFonts w:ascii="Noto Serif" w:eastAsia="Noto Serif SC" w:hAnsi="Noto Serif" w:cs="Noto Serif"/>
-          <w:sz w:val="21"/>
-          <w:szCs w:val="21"/>
-          <w:lang w:val="en-GB"/>
-        </w:rPr>
-        <w:t xml:space="preserve"> </w:t>
-      </w:r>
-      <w:r>
-        <w:rPr>
-          <w:rFonts w:ascii="Noto Serif" w:eastAsia="Noto Serif SC" w:hAnsi="Noto Serif" w:cs="Noto Serif"/>
-          <w:sz w:val="21"/>
-          <w:szCs w:val="21"/>
-        </w:rPr>
-        <w:t xml:space="preserve">Paiban, </w:t>
-      </w:r>
-      <w:r>
-        <w:rPr>
-          <w:rFonts w:ascii="Noto Serif" w:eastAsia="Noto Serif SC" w:hAnsi="Noto Serif" w:cs="Noto Serif"/>
-          <w:sz w:val="21"/>
-          <w:szCs w:val="21"/>
-        </w:rPr>
-        <w:t>獅吼鼓</w:t>
-      </w:r>
-      <w:r>
-        <w:rPr>
-          <w:rFonts w:ascii="Noto Serif" w:eastAsia="Noto Serif SC" w:hAnsi="Noto Serif" w:cs="Noto Serif"/>
-          <w:sz w:val="21"/>
-          <w:szCs w:val="21"/>
-        </w:rPr>
-        <w:t xml:space="preserve"> Lion roar, </w:t>
-      </w:r>
-      <w:r>
-        <w:rPr>
-          <w:rFonts w:ascii="Noto Serif" w:eastAsia="Noto Serif SC" w:hAnsi="Noto Serif" w:cs="Noto Serif"/>
-          <w:sz w:val="21"/>
-          <w:szCs w:val="21"/>
-        </w:rPr>
-        <w:t>低音大鑼</w:t>
-      </w:r>
-      <w:r>
-        <w:rPr>
-          <w:rFonts w:ascii="Noto Serif" w:eastAsia="Noto Serif SC" w:hAnsi="Noto Serif" w:cs="Noto Serif"/>
-          <w:sz w:val="21"/>
-          <w:szCs w:val="21"/>
-        </w:rPr>
-        <w:t xml:space="preserve"> Diyin </w:t>
-      </w:r>
-      <w:proofErr w:type="spellStart"/>
-      <w:r>
-        <w:rPr>
-          <w:rFonts w:ascii="Noto Serif" w:eastAsia="Noto Serif SC" w:hAnsi="Noto Serif" w:cs="Noto Serif"/>
-          <w:sz w:val="21"/>
-          <w:szCs w:val="21"/>
-        </w:rPr>
-        <w:t>Daluo</w:t>
-      </w:r>
-      <w:proofErr w:type="spellEnd"/>
-      <w:r>
-        <w:rPr>
-          <w:rFonts w:ascii="Noto Serif" w:eastAsia="Noto Serif SC" w:hAnsi="Noto Serif" w:cs="Noto Serif"/>
-          <w:sz w:val="21"/>
-          <w:szCs w:val="21"/>
-        </w:rPr>
-        <w:t xml:space="preserve">, </w:t>
-      </w:r>
-      <w:r>
-        <w:rPr>
-          <w:rFonts w:ascii="Noto Serif" w:eastAsia="Noto Serif SC" w:hAnsi="Noto Serif" w:cs="Noto Serif"/>
-          <w:sz w:val="21"/>
-          <w:szCs w:val="21"/>
-        </w:rPr>
-        <w:t>高邊鑼</w:t>
-      </w:r>
-      <w:r>
-        <w:rPr>
-          <w:rFonts w:ascii="Noto Serif" w:eastAsia="Noto Serif SC" w:hAnsi="Noto Serif" w:cs="Noto Serif"/>
-          <w:sz w:val="21"/>
-          <w:szCs w:val="21"/>
-        </w:rPr>
-        <w:t xml:space="preserve"> Gao </w:t>
-      </w:r>
-      <w:proofErr w:type="spellStart"/>
-      <w:r>
-        <w:rPr>
-          <w:rFonts w:ascii="Noto Serif" w:eastAsia="Noto Serif SC" w:hAnsi="Noto Serif" w:cs="Noto Serif"/>
-          <w:sz w:val="21"/>
-          <w:szCs w:val="21"/>
-        </w:rPr>
-        <w:t>Bianluo</w:t>
-      </w:r>
-      <w:proofErr w:type="spellEnd"/>
-      <w:r>
-        <w:rPr>
-          <w:rFonts w:ascii="Noto Serif" w:eastAsia="Noto Serif SC" w:hAnsi="Noto Serif" w:cs="Noto Serif"/>
-          <w:sz w:val="21"/>
-          <w:szCs w:val="21"/>
-        </w:rPr>
-        <w:t xml:space="preserve">, </w:t>
-      </w:r>
-      <w:r>
-        <w:rPr>
-          <w:rFonts w:ascii="Noto Serif" w:eastAsia="Noto Serif SC" w:hAnsi="Noto Serif" w:cs="Noto Serif"/>
-          <w:sz w:val="21"/>
-          <w:szCs w:val="21"/>
-        </w:rPr>
-        <w:t>低音罄</w:t>
-      </w:r>
-      <w:r>
-        <w:rPr>
-          <w:rFonts w:ascii="Noto Serif" w:eastAsia="Noto Serif SC" w:hAnsi="Noto Serif" w:cs="Noto Serif"/>
-          <w:sz w:val="21"/>
-          <w:szCs w:val="21"/>
-        </w:rPr>
-        <w:t xml:space="preserve"> Diyin Qing</w:t>
-      </w:r>
-      <w:r>
-        <w:rPr>
-          <w:rFonts w:ascii="Noto Serif" w:eastAsia="Noto Serif SC" w:hAnsi="Noto Serif" w:cs="Noto Serif"/>
-          <w:sz w:val="21"/>
-          <w:szCs w:val="21"/>
-        </w:rPr>
-        <w:t xml:space="preserve"> </w:t>
-      </w:r>
-    </w:p>
-    <w:p>
-      <w:pPr>
-        <w:jc w:val="right"/>
-        <w:rPr>
-          <w:rFonts w:ascii="Noto Serif" w:eastAsia="Noto Serif SC" w:hAnsi="Noto Serif" w:cs="Noto Serif"/>
-          <w:sz w:val="24"/>
-          <w:szCs w:val="24"/>
-          <w:lang w:val="en-US"/>
-        </w:rPr>
-      </w:pPr>
-    </w:p>
-    <w:p>
-      <w:pPr>
-        <w:jc w:val="right"/>
-        <w:rPr>
-          <w:rFonts w:ascii="Noto Serif" w:eastAsia="Noto Serif SC" w:hAnsi="Noto Serif" w:cs="Noto Serif"/>
-          <w:sz w:val="24"/>
-          <w:szCs w:val="24"/>
-          <w:lang w:val="en-US"/>
-        </w:rPr>
-      </w:pPr>
-      <w:r>
-        <w:rPr>
-          <w:rFonts w:ascii="Noto Serif" w:eastAsia="Noto Serif SC" w:hAnsi="Noto Serif" w:cs="Noto Serif"/>
-          <w:sz w:val="24"/>
-          <w:szCs w:val="24"/>
-          <w:lang w:val="en-US"/>
-        </w:rPr>
-        <w:t>豎琴</w:t>
+    </w:p>
+    <w:p>
+      <w:pPr>
+        <w:jc w:val="right"/>
+        <w:rPr>
+          <w:rFonts w:ascii="Noto Serif" w:eastAsia="Noto Serif SC" w:hAnsi="Noto Serif" w:cs="Noto Serif"/>
+          <w:sz w:val="24"/>
+          <w:szCs w:val="24"/>
+          <w:lang w:val="en-US"/>
+        </w:rPr>
+      </w:pPr>
+    </w:p>
+    <w:p>
+      <w:pPr>
+        <w:jc w:val="right"/>
+        <w:rPr>
+          <w:rFonts w:ascii="Noto Serif" w:eastAsia="Noto Serif SC" w:hAnsi="Noto Serif" w:cs="Noto Serif"/>
+          <w:sz w:val="24"/>
+          <w:szCs w:val="24"/>
+          <w:lang w:val="en-US"/>
+        </w:rPr>
+      </w:pPr>
+      <w:r>
+        <w:rPr>
+          <w:rFonts w:ascii="Noto Serif" w:eastAsia="Noto Serif SC" w:hAnsi="Noto Serif" w:cs="Noto Serif" w:hint="eastAsia"/>
+          <w:sz w:val="24"/>
+          <w:szCs w:val="24"/>
+          <w:lang w:val="en-US"/>
+        </w:rPr>
+        <w:t>竖琴</w:t>
       </w:r>
       <w:r>
         <w:rPr>
@@ -5036,12 +4733,12 @@
       </w:pPr>
       <w:r>
         <w:rPr>
-          <w:rFonts w:ascii="Noto Serif" w:eastAsia="Noto Serif SC" w:hAnsi="Noto Serif" w:cs="Noto Serif"/>
-          <w:sz w:val="24"/>
-          <w:szCs w:val="24"/>
-          <w:lang w:val="en-US"/>
-        </w:rPr>
-        <w:t>笛子獨奏</w:t>
+          <w:rFonts w:ascii="Noto Serif" w:eastAsia="Noto Serif SC" w:hAnsi="Noto Serif" w:cs="Noto Serif" w:hint="eastAsia"/>
+          <w:sz w:val="24"/>
+          <w:szCs w:val="24"/>
+          <w:lang w:val="en-US"/>
+        </w:rPr>
+        <w:t>笛子独奏</w:t>
       </w:r>
       <w:r>
         <w:rPr>
@@ -5076,7 +4773,7 @@
       </w:pPr>
       <w:r>
         <w:rPr>
-          <w:rFonts w:ascii="Noto Serif" w:eastAsia="Noto Serif SC" w:hAnsi="Noto Serif" w:cs="Noto Serif"/>
+          <w:rFonts w:ascii="Noto Serif" w:eastAsia="Noto Serif SC" w:hAnsi="Noto Serif" w:cs="Noto Serif" w:hint="eastAsia"/>
           <w:sz w:val="24"/>
           <w:szCs w:val="24"/>
           <w:lang w:val="en-US"/>
@@ -5105,7 +4802,7 @@
       </w:pPr>
       <w:r>
         <w:rPr>
-          <w:rFonts w:ascii="Noto Serif" w:eastAsia="Noto Serif SC" w:hAnsi="Noto Serif" w:cs="Noto Serif"/>
+          <w:rFonts w:ascii="Noto Serif" w:eastAsia="Noto Serif SC" w:hAnsi="Noto Serif" w:cs="Noto Serif" w:hint="eastAsia"/>
           <w:sz w:val="24"/>
           <w:szCs w:val="24"/>
           <w:lang w:val="en-US"/>
@@ -5134,7 +4831,7 @@
       </w:pPr>
       <w:r>
         <w:rPr>
-          <w:rFonts w:ascii="Noto Serif" w:eastAsia="Noto Serif SC" w:hAnsi="Noto Serif" w:cs="Noto Serif"/>
+          <w:rFonts w:ascii="Noto Serif" w:eastAsia="Noto Serif SC" w:hAnsi="Noto Serif" w:cs="Noto Serif" w:hint="eastAsia"/>
           <w:sz w:val="24"/>
           <w:szCs w:val="24"/>
           <w:lang w:val="en-US"/>
@@ -5163,7 +4860,7 @@
       </w:pPr>
       <w:r>
         <w:rPr>
-          <w:rFonts w:ascii="Noto Serif" w:eastAsia="Noto Serif SC" w:hAnsi="Noto Serif" w:cs="Noto Serif"/>
+          <w:rFonts w:ascii="Noto Serif" w:eastAsia="Noto Serif SC" w:hAnsi="Noto Serif" w:cs="Noto Serif" w:hint="eastAsia"/>
           <w:sz w:val="24"/>
           <w:szCs w:val="24"/>
           <w:lang w:val="en-US"/>
@@ -5192,7 +4889,7 @@
       </w:pPr>
       <w:r>
         <w:rPr>
-          <w:rFonts w:ascii="Noto Serif" w:eastAsia="Noto Serif SC" w:hAnsi="Noto Serif" w:cs="Noto Serif"/>
+          <w:rFonts w:ascii="Noto Serif" w:eastAsia="Noto Serif SC" w:hAnsi="Noto Serif" w:cs="Noto Serif" w:hint="eastAsia"/>
           <w:sz w:val="24"/>
           <w:szCs w:val="24"/>
           <w:lang w:val="en-US"/>

</xml_diff>